<commit_message>
updated readme file and other minor changes
</commit_message>
<xml_diff>
--- a/Clerk System/ClercSystem/ClercSystem/README.docx
+++ b/Clerk System/ClercSystem/ClercSystem/README.docx
@@ -1,6 +1,6 @@
 
 <file path=word/document.xml><?xml version="1.0" encoding="utf-8"?>
-<w:document xmlns:wpc="http://schemas.microsoft.com/office/word/2010/wordprocessingCanvas" xmlns:cx="http://schemas.microsoft.com/office/drawing/2014/chartex" xmlns:cx1="http://schemas.microsoft.com/office/drawing/2015/9/8/chartex" xmlns:cx2="http://schemas.microsoft.com/office/drawing/2015/10/21/chartex" xmlns:cx3="http://schemas.microsoft.com/office/drawing/2016/5/9/chartex" xmlns:cx4="http://schemas.microsoft.com/office/drawing/2016/5/10/chartex" xmlns:cx5="http://schemas.microsoft.com/office/drawing/2016/5/11/chartex" xmlns:cx6="http://schemas.microsoft.com/office/drawing/2016/5/12/chartex" xmlns:cx7="http://schemas.microsoft.com/office/drawing/2016/5/13/chartex" xmlns:cx8="http://schemas.microsoft.com/office/drawing/2016/5/14/chartex" xmlns:mc="http://schemas.openxmlformats.org/markup-compatibility/2006" xmlns:aink="http://schemas.microsoft.com/office/drawing/2016/ink" xmlns:am3d="http://schemas.microsoft.com/office/drawing/2017/model3d" xmlns:o="urn:schemas-microsoft-com:office:office" xmlns:oel="http://schemas.microsoft.com/office/2019/extlst" xmlns:r="http://schemas.openxmlformats.org/officeDocument/2006/relationships" xmlns:m="http://schemas.openxmlformats.org/officeDocument/2006/math" xmlns:v="urn:schemas-microsoft-com:vml" xmlns:wp14="http://schemas.microsoft.com/office/word/2010/wordprocessingDrawing" xmlns:wp="http://schemas.openxmlformats.org/drawingml/2006/wordprocessingDrawing" xmlns:w10="urn:schemas-microsoft-com:office:word" xmlns:w="http://schemas.openxmlformats.org/wordprocessingml/2006/main" xmlns:w14="http://schemas.microsoft.com/office/word/2010/wordml" xmlns:w15="http://schemas.microsoft.com/office/word/2012/wordml" xmlns:w16cex="http://schemas.microsoft.com/office/word/2018/wordml/cex" xmlns:w16cid="http://schemas.microsoft.com/office/word/2016/wordml/cid" xmlns:w16="http://schemas.microsoft.com/office/word/2018/wordml" xmlns:w16du="http://schemas.microsoft.com/office/word/2023/wordml/word16du" xmlns:w16sdtdh="http://schemas.microsoft.com/office/word/2020/wordml/sdtdatahash" xmlns:w16sdtfl="http://schemas.microsoft.com/office/word/2024/wordml/sdtformatlock" xmlns:w16se="http://schemas.microsoft.com/office/word/2015/wordml/symex" xmlns:wpg="http://schemas.microsoft.com/office/word/2010/wordprocessingGroup" xmlns:wpi="http://schemas.microsoft.com/office/word/2010/wordprocessingInk" xmlns:wne="http://schemas.microsoft.com/office/word/2006/wordml" xmlns:wps="http://schemas.microsoft.com/office/word/2010/wordprocessingShape" mc:Ignorable="w14 w15 w16se w16cid w16 w16cex w16sdtdh w16sdtfl w16du wp14">
+<w:document xmlns:wpc="http://schemas.microsoft.com/office/word/2010/wordprocessingCanvas" xmlns:cx="http://schemas.microsoft.com/office/drawing/2014/chartex" xmlns:cx1="http://schemas.microsoft.com/office/drawing/2015/9/8/chartex" xmlns:cx2="http://schemas.microsoft.com/office/drawing/2015/10/21/chartex" xmlns:cx3="http://schemas.microsoft.com/office/drawing/2016/5/9/chartex" xmlns:cx4="http://schemas.microsoft.com/office/drawing/2016/5/10/chartex" xmlns:cx5="http://schemas.microsoft.com/office/drawing/2016/5/11/chartex" xmlns:cx6="http://schemas.microsoft.com/office/drawing/2016/5/12/chartex" xmlns:cx7="http://schemas.microsoft.com/office/drawing/2016/5/13/chartex" xmlns:cx8="http://schemas.microsoft.com/office/drawing/2016/5/14/chartex" xmlns:mc="http://schemas.openxmlformats.org/markup-compatibility/2006" xmlns:aink="http://schemas.microsoft.com/office/drawing/2016/ink" xmlns:am3d="http://schemas.microsoft.com/office/drawing/2017/model3d" xmlns:o="urn:schemas-microsoft-com:office:office" xmlns:oel="http://schemas.microsoft.com/office/2019/extlst" xmlns:r="http://schemas.openxmlformats.org/officeDocument/2006/relationships" xmlns:m="http://schemas.openxmlformats.org/officeDocument/2006/math" xmlns:v="urn:schemas-microsoft-com:vml" xmlns:wp14="http://schemas.microsoft.com/office/word/2010/wordprocessingDrawing" xmlns:wp="http://schemas.openxmlformats.org/drawingml/2006/wordprocessingDrawing" xmlns:w10="urn:schemas-microsoft-com:office:word" xmlns:w="http://schemas.openxmlformats.org/wordprocessingml/2006/main" xmlns:w14="http://schemas.microsoft.com/office/word/2010/wordml" xmlns:w15="http://schemas.microsoft.com/office/word/2012/wordml" xmlns:w16cex="http://schemas.microsoft.com/office/word/2018/wordml/cex" xmlns:w16cid="http://schemas.microsoft.com/office/word/2016/wordml/cid" xmlns:w16="http://schemas.microsoft.com/office/word/2018/wordml" xmlns:w16sdtdh="http://schemas.microsoft.com/office/word/2020/wordml/sdtdatahash" xmlns:w16se="http://schemas.microsoft.com/office/word/2015/wordml/symex" xmlns:wpg="http://schemas.microsoft.com/office/word/2010/wordprocessingGroup" xmlns:wpi="http://schemas.microsoft.com/office/word/2010/wordprocessingInk" xmlns:wne="http://schemas.microsoft.com/office/word/2006/wordml" xmlns:wps="http://schemas.microsoft.com/office/word/2010/wordprocessingShape" mc:Ignorable="w14 w15 w16se w16cid w16 w16cex w16sdtdh wp14">
   <w:body>
     <w:p>
       <w:pPr>
@@ -1107,13 +1107,8 @@
       </w:r>
       <w:proofErr w:type="spellEnd"/>
       <w:r>
-        <w:t>/</w:t>
-      </w:r>
-      <w:proofErr w:type="spellStart"/>
-      <w:r>
-        <w:t>Admin</w:t>
-      </w:r>
-      <w:proofErr w:type="spellEnd"/>
+        <w:t>/Admin</w:t>
+      </w:r>
       <w:r>
         <w:rPr>
           <w:lang w:val="en-US"/>
@@ -1386,14 +1381,2467 @@
     </w:p>
     <w:p>
       <w:pPr>
-        <w:pStyle w:val="ListParagraph"/>
-        <w:ind w:left="1080"/>
-        <w:rPr>
-          <w:b/>
-          <w:bCs/>
-          <w:lang w:val="en-US"/>
-        </w:rPr>
-      </w:pPr>
+        <w:rPr>
+          <w:lang w:val="en-US"/>
+        </w:rPr>
+      </w:pPr>
+    </w:p>
+    <w:p>
+      <w:pPr>
+        <w:rPr>
+          <w:lang w:val="en-US"/>
+        </w:rPr>
+      </w:pPr>
+      <w:r>
+        <w:rPr>
+          <w:lang w:val="en-US"/>
+        </w:rPr>
+        <w:t xml:space="preserve">When starting the project Departments, Categories, roles, and the basic admin user tables should be populated automatically via the </w:t>
+      </w:r>
+      <w:proofErr w:type="spellStart"/>
+      <w:r>
+        <w:rPr>
+          <w:b/>
+          <w:bCs/>
+          <w:lang w:val="en-US"/>
+        </w:rPr>
+        <w:t>ClercSystem.Data</w:t>
+      </w:r>
+      <w:r>
+        <w:rPr>
+          <w:b/>
+          <w:bCs/>
+          <w:lang w:val="en-US"/>
+        </w:rPr>
+        <w:t>.Seeder</w:t>
+      </w:r>
+      <w:proofErr w:type="spellEnd"/>
+      <w:r>
+        <w:rPr>
+          <w:lang w:val="en-US"/>
+        </w:rPr>
+        <w:t xml:space="preserve"> folder classes, if dab already connected. We are working in development environment. </w:t>
+      </w:r>
+      <w:r>
+        <w:rPr>
+          <w:lang w:val="en-US"/>
+        </w:rPr>
+        <w:br/>
+      </w:r>
+      <w:r>
+        <w:rPr>
+          <w:lang w:val="en-US"/>
+        </w:rPr>
+        <w:br/>
+        <w:t xml:space="preserve">First Credentials for login: </w:t>
+      </w:r>
+      <w:r>
+        <w:rPr>
+          <w:lang w:val="en-US"/>
+        </w:rPr>
+        <w:br/>
+      </w:r>
+      <w:hyperlink r:id="rId6" w:history="1">
+        <w:r>
+          <w:rPr>
+            <w:rStyle w:val="Hyperlink"/>
+            <w:lang w:val="en-US"/>
+          </w:rPr>
+          <w:t>admin@emaple.com</w:t>
+        </w:r>
+      </w:hyperlink>
+      <w:r>
+        <w:rPr>
+          <w:lang w:val="en-US"/>
+        </w:rPr>
+        <w:tab/>
+      </w:r>
+      <w:r>
+        <w:rPr>
+          <w:lang w:val="en-US"/>
+        </w:rPr>
+        <w:br/>
+        <w:t>Admin@123</w:t>
+      </w:r>
+    </w:p>
+    <w:p>
+      <w:pPr>
+        <w:rPr>
+          <w:lang w:val="en-US"/>
+        </w:rPr>
+      </w:pPr>
+      <w:r>
+        <w:rPr>
+          <w:lang w:val="en-US"/>
+        </w:rPr>
+        <w:br/>
+      </w:r>
+      <w:r>
+        <w:rPr>
+          <w:lang w:val="en-US"/>
+        </w:rPr>
+        <w:drawing>
+          <wp:inline distT="0" distB="0" distL="0" distR="0" wp14:anchorId="6FF8E0AD" wp14:editId="33A8B66A">
+            <wp:extent cx="5760720" cy="1044575"/>
+            <wp:effectExtent l="0" t="0" r="0" b="3175"/>
+            <wp:docPr id="1" name="Picture 1"/>
+            <wp:cNvGraphicFramePr>
+              <a:graphicFrameLocks xmlns:a="http://schemas.openxmlformats.org/drawingml/2006/main" noChangeAspect="1"/>
+            </wp:cNvGraphicFramePr>
+            <a:graphic xmlns:a="http://schemas.openxmlformats.org/drawingml/2006/main">
+              <a:graphicData uri="http://schemas.openxmlformats.org/drawingml/2006/picture">
+                <pic:pic xmlns:pic="http://schemas.openxmlformats.org/drawingml/2006/picture">
+                  <pic:nvPicPr>
+                    <pic:cNvPr id="1" name=""/>
+                    <pic:cNvPicPr/>
+                  </pic:nvPicPr>
+                  <pic:blipFill>
+                    <a:blip r:embed="rId7"/>
+                    <a:stretch>
+                      <a:fillRect/>
+                    </a:stretch>
+                  </pic:blipFill>
+                  <pic:spPr>
+                    <a:xfrm>
+                      <a:off x="0" y="0"/>
+                      <a:ext cx="5760720" cy="1044575"/>
+                    </a:xfrm>
+                    <a:prstGeom prst="rect">
+                      <a:avLst/>
+                    </a:prstGeom>
+                  </pic:spPr>
+                </pic:pic>
+              </a:graphicData>
+            </a:graphic>
+          </wp:inline>
+        </w:drawing>
+      </w:r>
+      <w:r>
+        <w:rPr>
+          <w:lang w:val="en-US"/>
+        </w:rPr>
+        <w:t xml:space="preserve"> </w:t>
+      </w:r>
+    </w:p>
+    <w:p>
+      <w:pPr>
+        <w:rPr>
+          <w:lang w:val="en-US"/>
+        </w:rPr>
+      </w:pPr>
+      <w:r>
+        <w:rPr>
+          <w:lang w:val="en-US"/>
+        </w:rPr>
+        <w:t xml:space="preserve">I am using </w:t>
+      </w:r>
+      <w:r>
+        <w:rPr>
+          <w:lang w:val="en-US"/>
+        </w:rPr>
+        <w:t xml:space="preserve">built in template(bootstrap). Built in Admin user is not a “GOD ADMIN”, and cannot change anything preset in his settings but can apply settings for other users – </w:t>
+      </w:r>
+      <w:proofErr w:type="spellStart"/>
+      <w:r>
+        <w:rPr>
+          <w:lang w:val="en-US"/>
+        </w:rPr>
+        <w:t>IsManager</w:t>
+      </w:r>
+      <w:proofErr w:type="spellEnd"/>
+      <w:r>
+        <w:rPr>
+          <w:lang w:val="en-US"/>
+        </w:rPr>
+        <w:t xml:space="preserve">, </w:t>
+      </w:r>
+      <w:proofErr w:type="spellStart"/>
+      <w:r>
+        <w:rPr>
+          <w:lang w:val="en-US"/>
+        </w:rPr>
+        <w:t>Department_ID</w:t>
+      </w:r>
+      <w:proofErr w:type="spellEnd"/>
+      <w:r>
+        <w:rPr>
+          <w:lang w:val="en-US"/>
+        </w:rPr>
+        <w:t xml:space="preserve"> </w:t>
+      </w:r>
+      <w:proofErr w:type="spellStart"/>
+      <w:r>
+        <w:rPr>
+          <w:lang w:val="en-US"/>
+        </w:rPr>
+        <w:t>etc</w:t>
+      </w:r>
+      <w:proofErr w:type="spellEnd"/>
+      <w:r>
+        <w:rPr>
+          <w:lang w:val="en-US"/>
+        </w:rPr>
+        <w:t xml:space="preserve">… You can press on the buttons but different denial pop up messages will appear showing the exact problem. </w:t>
+      </w:r>
+      <w:proofErr w:type="spellStart"/>
+      <w:r>
+        <w:rPr>
+          <w:lang w:val="en-US"/>
+        </w:rPr>
+        <w:t>Eample</w:t>
+      </w:r>
+      <w:proofErr w:type="spellEnd"/>
+      <w:r>
+        <w:rPr>
+          <w:lang w:val="en-US"/>
+        </w:rPr>
+        <w:t xml:space="preserve">: </w:t>
+      </w:r>
+      <w:r>
+        <w:rPr>
+          <w:lang w:val="en-US"/>
+        </w:rPr>
+        <w:br/>
+      </w:r>
+      <w:r>
+        <w:rPr>
+          <w:lang w:val="en-US"/>
+        </w:rPr>
+        <w:br/>
+      </w:r>
+      <w:r>
+        <w:rPr>
+          <w:lang w:val="en-US"/>
+        </w:rPr>
+        <w:drawing>
+          <wp:inline distT="0" distB="0" distL="0" distR="0" wp14:anchorId="36A0CC5C" wp14:editId="74520D81">
+            <wp:extent cx="5760720" cy="1546225"/>
+            <wp:effectExtent l="0" t="0" r="0" b="0"/>
+            <wp:docPr id="2" name="Picture 2"/>
+            <wp:cNvGraphicFramePr>
+              <a:graphicFrameLocks xmlns:a="http://schemas.openxmlformats.org/drawingml/2006/main" noChangeAspect="1"/>
+            </wp:cNvGraphicFramePr>
+            <a:graphic xmlns:a="http://schemas.openxmlformats.org/drawingml/2006/main">
+              <a:graphicData uri="http://schemas.openxmlformats.org/drawingml/2006/picture">
+                <pic:pic xmlns:pic="http://schemas.openxmlformats.org/drawingml/2006/picture">
+                  <pic:nvPicPr>
+                    <pic:cNvPr id="1" name=""/>
+                    <pic:cNvPicPr/>
+                  </pic:nvPicPr>
+                  <pic:blipFill>
+                    <a:blip r:embed="rId8"/>
+                    <a:stretch>
+                      <a:fillRect/>
+                    </a:stretch>
+                  </pic:blipFill>
+                  <pic:spPr>
+                    <a:xfrm>
+                      <a:off x="0" y="0"/>
+                      <a:ext cx="5760720" cy="1546225"/>
+                    </a:xfrm>
+                    <a:prstGeom prst="rect">
+                      <a:avLst/>
+                    </a:prstGeom>
+                  </pic:spPr>
+                </pic:pic>
+              </a:graphicData>
+            </a:graphic>
+          </wp:inline>
+        </w:drawing>
+      </w:r>
+      <w:r>
+        <w:rPr>
+          <w:lang w:val="en-US"/>
+        </w:rPr>
+        <w:br/>
+      </w:r>
+      <w:r>
+        <w:rPr>
+          <w:b/>
+          <w:bCs/>
+          <w:lang w:val="en-US"/>
+        </w:rPr>
+        <w:t xml:space="preserve"> </w:t>
+      </w:r>
+      <w:r>
+        <w:rPr>
+          <w:b/>
+          <w:bCs/>
+          <w:lang w:val="en-US"/>
+        </w:rPr>
+        <w:t>New Users are being added via the registration page.</w:t>
+      </w:r>
+      <w:r>
+        <w:rPr>
+          <w:lang w:val="en-US"/>
+        </w:rPr>
+        <w:t xml:space="preserve"> </w:t>
+      </w:r>
+      <w:r>
+        <w:rPr>
+          <w:lang w:val="en-US"/>
+        </w:rPr>
+        <w:br/>
+      </w:r>
+      <w:r>
+        <w:rPr>
+          <w:lang w:val="en-US"/>
+        </w:rPr>
+        <w:drawing>
+          <wp:inline distT="0" distB="0" distL="0" distR="0" wp14:anchorId="3A06DC29" wp14:editId="13C7A10E">
+            <wp:extent cx="5760720" cy="1264285"/>
+            <wp:effectExtent l="0" t="0" r="0" b="0"/>
+            <wp:docPr id="4" name="Picture 4"/>
+            <wp:cNvGraphicFramePr>
+              <a:graphicFrameLocks xmlns:a="http://schemas.openxmlformats.org/drawingml/2006/main" noChangeAspect="1"/>
+            </wp:cNvGraphicFramePr>
+            <a:graphic xmlns:a="http://schemas.openxmlformats.org/drawingml/2006/main">
+              <a:graphicData uri="http://schemas.openxmlformats.org/drawingml/2006/picture">
+                <pic:pic xmlns:pic="http://schemas.openxmlformats.org/drawingml/2006/picture">
+                  <pic:nvPicPr>
+                    <pic:cNvPr id="1" name=""/>
+                    <pic:cNvPicPr/>
+                  </pic:nvPicPr>
+                  <pic:blipFill>
+                    <a:blip r:embed="rId9"/>
+                    <a:stretch>
+                      <a:fillRect/>
+                    </a:stretch>
+                  </pic:blipFill>
+                  <pic:spPr>
+                    <a:xfrm>
+                      <a:off x="0" y="0"/>
+                      <a:ext cx="5760720" cy="1264285"/>
+                    </a:xfrm>
+                    <a:prstGeom prst="rect">
+                      <a:avLst/>
+                    </a:prstGeom>
+                  </pic:spPr>
+                </pic:pic>
+              </a:graphicData>
+            </a:graphic>
+          </wp:inline>
+        </w:drawing>
+      </w:r>
+      <w:r>
+        <w:rPr>
+          <w:lang w:val="en-US"/>
+        </w:rPr>
+        <w:br/>
+      </w:r>
+      <w:r>
+        <w:rPr>
+          <w:lang w:val="en-US"/>
+        </w:rPr>
+        <w:lastRenderedPageBreak/>
+        <w:t xml:space="preserve">Once registered the user gets a basic observer status where he can have only view access to everything in the system. Additional fields during registration are for better clarification of the who the user is. </w:t>
+      </w:r>
+      <w:r>
+        <w:rPr>
+          <w:lang w:val="en-US"/>
+        </w:rPr>
+        <w:br/>
+      </w:r>
+      <w:r>
+        <w:rPr>
+          <w:lang w:val="en-US"/>
+        </w:rPr>
+        <w:br/>
+      </w:r>
+      <w:r>
+        <w:rPr>
+          <w:lang w:val="en-US"/>
+        </w:rPr>
+        <w:drawing>
+          <wp:inline distT="0" distB="0" distL="0" distR="0" wp14:anchorId="6EA8556F" wp14:editId="5D1F5788">
+            <wp:extent cx="5760720" cy="1520825"/>
+            <wp:effectExtent l="0" t="0" r="0" b="3175"/>
+            <wp:docPr id="5" name="Picture 5"/>
+            <wp:cNvGraphicFramePr>
+              <a:graphicFrameLocks xmlns:a="http://schemas.openxmlformats.org/drawingml/2006/main" noChangeAspect="1"/>
+            </wp:cNvGraphicFramePr>
+            <a:graphic xmlns:a="http://schemas.openxmlformats.org/drawingml/2006/main">
+              <a:graphicData uri="http://schemas.openxmlformats.org/drawingml/2006/picture">
+                <pic:pic xmlns:pic="http://schemas.openxmlformats.org/drawingml/2006/picture">
+                  <pic:nvPicPr>
+                    <pic:cNvPr id="1" name=""/>
+                    <pic:cNvPicPr/>
+                  </pic:nvPicPr>
+                  <pic:blipFill>
+                    <a:blip r:embed="rId10"/>
+                    <a:stretch>
+                      <a:fillRect/>
+                    </a:stretch>
+                  </pic:blipFill>
+                  <pic:spPr>
+                    <a:xfrm>
+                      <a:off x="0" y="0"/>
+                      <a:ext cx="5760720" cy="1520825"/>
+                    </a:xfrm>
+                    <a:prstGeom prst="rect">
+                      <a:avLst/>
+                    </a:prstGeom>
+                  </pic:spPr>
+                </pic:pic>
+              </a:graphicData>
+            </a:graphic>
+          </wp:inline>
+        </w:drawing>
+      </w:r>
+      <w:r>
+        <w:rPr>
+          <w:noProof/>
+        </w:rPr>
+        <w:t xml:space="preserve"> </w:t>
+      </w:r>
+      <w:r>
+        <w:rPr>
+          <w:lang w:val="en-US"/>
+        </w:rPr>
+        <w:drawing>
+          <wp:inline distT="0" distB="0" distL="0" distR="0" wp14:anchorId="6250011D" wp14:editId="2965660B">
+            <wp:extent cx="5760720" cy="1317625"/>
+            <wp:effectExtent l="0" t="0" r="0" b="0"/>
+            <wp:docPr id="6" name="Picture 6"/>
+            <wp:cNvGraphicFramePr>
+              <a:graphicFrameLocks xmlns:a="http://schemas.openxmlformats.org/drawingml/2006/main" noChangeAspect="1"/>
+            </wp:cNvGraphicFramePr>
+            <a:graphic xmlns:a="http://schemas.openxmlformats.org/drawingml/2006/main">
+              <a:graphicData uri="http://schemas.openxmlformats.org/drawingml/2006/picture">
+                <pic:pic xmlns:pic="http://schemas.openxmlformats.org/drawingml/2006/picture">
+                  <pic:nvPicPr>
+                    <pic:cNvPr id="1" name=""/>
+                    <pic:cNvPicPr/>
+                  </pic:nvPicPr>
+                  <pic:blipFill>
+                    <a:blip r:embed="rId11"/>
+                    <a:stretch>
+                      <a:fillRect/>
+                    </a:stretch>
+                  </pic:blipFill>
+                  <pic:spPr>
+                    <a:xfrm>
+                      <a:off x="0" y="0"/>
+                      <a:ext cx="5760720" cy="1317625"/>
+                    </a:xfrm>
+                    <a:prstGeom prst="rect">
+                      <a:avLst/>
+                    </a:prstGeom>
+                  </pic:spPr>
+                </pic:pic>
+              </a:graphicData>
+            </a:graphic>
+          </wp:inline>
+        </w:drawing>
+      </w:r>
+      <w:r>
+        <w:rPr>
+          <w:noProof/>
+          <w:lang w:val="en-US"/>
+        </w:rPr>
+        <w:br/>
+        <w:t>The observer user does not have access to admin panel</w:t>
+      </w:r>
+      <w:r>
+        <w:rPr>
+          <w:noProof/>
+          <w:lang w:val="en-US"/>
+        </w:rPr>
+        <w:t xml:space="preserve">, cant change amend or log documents. </w:t>
+      </w:r>
+      <w:r>
+        <w:rPr>
+          <w:noProof/>
+          <w:lang w:val="en-US"/>
+        </w:rPr>
+        <w:br/>
+      </w:r>
+      <w:r>
+        <w:rPr>
+          <w:lang w:val="en-US"/>
+        </w:rPr>
+        <w:drawing>
+          <wp:inline distT="0" distB="0" distL="0" distR="0" wp14:anchorId="6E4E32BD" wp14:editId="1A63328D">
+            <wp:extent cx="5677593" cy="1059815"/>
+            <wp:effectExtent l="0" t="0" r="0" b="6985"/>
+            <wp:docPr id="7" name="Picture 7"/>
+            <wp:cNvGraphicFramePr>
+              <a:graphicFrameLocks xmlns:a="http://schemas.openxmlformats.org/drawingml/2006/main" noChangeAspect="1"/>
+            </wp:cNvGraphicFramePr>
+            <a:graphic xmlns:a="http://schemas.openxmlformats.org/drawingml/2006/main">
+              <a:graphicData uri="http://schemas.openxmlformats.org/drawingml/2006/picture">
+                <pic:pic xmlns:pic="http://schemas.openxmlformats.org/drawingml/2006/picture">
+                  <pic:nvPicPr>
+                    <pic:cNvPr id="1" name=""/>
+                    <pic:cNvPicPr/>
+                  </pic:nvPicPr>
+                  <pic:blipFill>
+                    <a:blip r:embed="rId12"/>
+                    <a:stretch>
+                      <a:fillRect/>
+                    </a:stretch>
+                  </pic:blipFill>
+                  <pic:spPr>
+                    <a:xfrm>
+                      <a:off x="0" y="0"/>
+                      <a:ext cx="5681694" cy="1060581"/>
+                    </a:xfrm>
+                    <a:prstGeom prst="rect">
+                      <a:avLst/>
+                    </a:prstGeom>
+                  </pic:spPr>
+                </pic:pic>
+              </a:graphicData>
+            </a:graphic>
+          </wp:inline>
+        </w:drawing>
+      </w:r>
+      <w:r>
+        <w:rPr>
+          <w:lang w:val="en-US"/>
+        </w:rPr>
+        <w:br/>
+      </w:r>
+      <w:r>
+        <w:rPr>
+          <w:lang w:val="en-US"/>
+        </w:rPr>
+        <w:t xml:space="preserve">This is the User Management Panel accessible only for the managers. We have just added the new user that is currently simply an observer. </w:t>
+      </w:r>
+      <w:r>
+        <w:rPr>
+          <w:lang w:val="en-US"/>
+        </w:rPr>
+        <w:br/>
+      </w:r>
+      <w:r>
+        <w:rPr>
+          <w:lang w:val="en-US"/>
+        </w:rPr>
+        <w:drawing>
+          <wp:inline distT="0" distB="0" distL="0" distR="0" wp14:anchorId="027E7031" wp14:editId="74933A5D">
+            <wp:extent cx="5760720" cy="1556385"/>
+            <wp:effectExtent l="0" t="0" r="0" b="5715"/>
+            <wp:docPr id="8" name="Picture 8"/>
+            <wp:cNvGraphicFramePr>
+              <a:graphicFrameLocks xmlns:a="http://schemas.openxmlformats.org/drawingml/2006/main" noChangeAspect="1"/>
+            </wp:cNvGraphicFramePr>
+            <a:graphic xmlns:a="http://schemas.openxmlformats.org/drawingml/2006/main">
+              <a:graphicData uri="http://schemas.openxmlformats.org/drawingml/2006/picture">
+                <pic:pic xmlns:pic="http://schemas.openxmlformats.org/drawingml/2006/picture">
+                  <pic:nvPicPr>
+                    <pic:cNvPr id="1" name=""/>
+                    <pic:cNvPicPr/>
+                  </pic:nvPicPr>
+                  <pic:blipFill>
+                    <a:blip r:embed="rId13"/>
+                    <a:stretch>
+                      <a:fillRect/>
+                    </a:stretch>
+                  </pic:blipFill>
+                  <pic:spPr>
+                    <a:xfrm>
+                      <a:off x="0" y="0"/>
+                      <a:ext cx="5760720" cy="1556385"/>
+                    </a:xfrm>
+                    <a:prstGeom prst="rect">
+                      <a:avLst/>
+                    </a:prstGeom>
+                  </pic:spPr>
+                </pic:pic>
+              </a:graphicData>
+            </a:graphic>
+          </wp:inline>
+        </w:drawing>
+      </w:r>
+    </w:p>
+    <w:p>
+      <w:pPr>
+        <w:rPr>
+          <w:lang w:val="en-US"/>
+        </w:rPr>
+      </w:pPr>
+      <w:proofErr w:type="spellStart"/>
+      <w:r>
+        <w:rPr>
+          <w:lang w:val="en-US"/>
+        </w:rPr>
+        <w:lastRenderedPageBreak/>
+        <w:t>Lets</w:t>
+      </w:r>
+      <w:proofErr w:type="spellEnd"/>
+      <w:r>
+        <w:rPr>
+          <w:lang w:val="en-US"/>
+        </w:rPr>
+        <w:t xml:space="preserve"> add </w:t>
+      </w:r>
+      <w:r>
+        <w:rPr>
+          <w:lang w:val="en-US"/>
+        </w:rPr>
+        <w:t xml:space="preserve">some documents using </w:t>
+      </w:r>
+      <w:r>
+        <w:rPr>
+          <w:lang w:val="en-US"/>
+        </w:rPr>
+        <w:t xml:space="preserve">the admin </w:t>
+      </w:r>
+      <w:proofErr w:type="spellStart"/>
+      <w:r>
+        <w:rPr>
+          <w:lang w:val="en-US"/>
+        </w:rPr>
+        <w:t>Manege</w:t>
+      </w:r>
+      <w:proofErr w:type="spellEnd"/>
+      <w:r>
+        <w:rPr>
+          <w:lang w:val="en-US"/>
+        </w:rPr>
+        <w:t xml:space="preserve"> Document Interface. </w:t>
+      </w:r>
+      <w:r>
+        <w:rPr>
+          <w:lang w:val="en-US"/>
+        </w:rPr>
+        <w:br/>
+      </w:r>
+      <w:r>
+        <w:rPr>
+          <w:lang w:val="en-US"/>
+        </w:rPr>
+        <w:drawing>
+          <wp:inline distT="0" distB="0" distL="0" distR="0" wp14:anchorId="17D21DCC" wp14:editId="19CAFA07">
+            <wp:extent cx="5760720" cy="1765300"/>
+            <wp:effectExtent l="0" t="0" r="0" b="6350"/>
+            <wp:docPr id="11" name="Picture 11"/>
+            <wp:cNvGraphicFramePr>
+              <a:graphicFrameLocks xmlns:a="http://schemas.openxmlformats.org/drawingml/2006/main" noChangeAspect="1"/>
+            </wp:cNvGraphicFramePr>
+            <a:graphic xmlns:a="http://schemas.openxmlformats.org/drawingml/2006/main">
+              <a:graphicData uri="http://schemas.openxmlformats.org/drawingml/2006/picture">
+                <pic:pic xmlns:pic="http://schemas.openxmlformats.org/drawingml/2006/picture">
+                  <pic:nvPicPr>
+                    <pic:cNvPr id="1" name=""/>
+                    <pic:cNvPicPr/>
+                  </pic:nvPicPr>
+                  <pic:blipFill>
+                    <a:blip r:embed="rId14"/>
+                    <a:stretch>
+                      <a:fillRect/>
+                    </a:stretch>
+                  </pic:blipFill>
+                  <pic:spPr>
+                    <a:xfrm>
+                      <a:off x="0" y="0"/>
+                      <a:ext cx="5760720" cy="1765300"/>
+                    </a:xfrm>
+                    <a:prstGeom prst="rect">
+                      <a:avLst/>
+                    </a:prstGeom>
+                  </pic:spPr>
+                </pic:pic>
+              </a:graphicData>
+            </a:graphic>
+          </wp:inline>
+        </w:drawing>
+      </w:r>
+      <w:r>
+        <w:rPr>
+          <w:lang w:val="en-US"/>
+        </w:rPr>
+        <w:br/>
+      </w:r>
+    </w:p>
+    <w:p>
+      <w:pPr>
+        <w:rPr>
+          <w:lang w:val="en-US"/>
+        </w:rPr>
+      </w:pPr>
+      <w:r>
+        <w:rPr>
+          <w:lang w:val="en-US"/>
+        </w:rPr>
+        <w:t>Click on add document and follow the form. You should get something like that at the end</w:t>
+      </w:r>
+      <w:r>
+        <w:rPr>
+          <w:lang w:val="en-US"/>
+        </w:rPr>
+        <w:t xml:space="preserve"> when document is added.</w:t>
+      </w:r>
+      <w:r>
+        <w:rPr>
+          <w:lang w:val="en-US"/>
+        </w:rPr>
+        <w:t xml:space="preserve"> </w:t>
+      </w:r>
+    </w:p>
+    <w:p>
+      <w:pPr>
+        <w:rPr>
+          <w:lang w:val="en-US"/>
+        </w:rPr>
+      </w:pPr>
+      <w:r>
+        <w:rPr>
+          <w:lang w:val="en-US"/>
+        </w:rPr>
+        <w:drawing>
+          <wp:inline distT="0" distB="0" distL="0" distR="0" wp14:anchorId="27FDC999" wp14:editId="3F25A507">
+            <wp:extent cx="5760720" cy="874395"/>
+            <wp:effectExtent l="0" t="0" r="0" b="1905"/>
+            <wp:docPr id="12" name="Picture 12"/>
+            <wp:cNvGraphicFramePr>
+              <a:graphicFrameLocks xmlns:a="http://schemas.openxmlformats.org/drawingml/2006/main" noChangeAspect="1"/>
+            </wp:cNvGraphicFramePr>
+            <a:graphic xmlns:a="http://schemas.openxmlformats.org/drawingml/2006/main">
+              <a:graphicData uri="http://schemas.openxmlformats.org/drawingml/2006/picture">
+                <pic:pic xmlns:pic="http://schemas.openxmlformats.org/drawingml/2006/picture">
+                  <pic:nvPicPr>
+                    <pic:cNvPr id="1" name=""/>
+                    <pic:cNvPicPr/>
+                  </pic:nvPicPr>
+                  <pic:blipFill>
+                    <a:blip r:embed="rId15"/>
+                    <a:stretch>
+                      <a:fillRect/>
+                    </a:stretch>
+                  </pic:blipFill>
+                  <pic:spPr>
+                    <a:xfrm>
+                      <a:off x="0" y="0"/>
+                      <a:ext cx="5760720" cy="874395"/>
+                    </a:xfrm>
+                    <a:prstGeom prst="rect">
+                      <a:avLst/>
+                    </a:prstGeom>
+                  </pic:spPr>
+                </pic:pic>
+              </a:graphicData>
+            </a:graphic>
+          </wp:inline>
+        </w:drawing>
+      </w:r>
+      <w:r>
+        <w:rPr>
+          <w:lang w:val="en-US"/>
+        </w:rPr>
+        <w:br/>
+      </w:r>
+      <w:r>
+        <w:rPr>
+          <w:lang w:val="en-US"/>
+        </w:rPr>
+        <w:t>Users</w:t>
+      </w:r>
+      <w:r>
+        <w:rPr>
+          <w:b/>
+          <w:bCs/>
+          <w:lang w:val="en-US"/>
+        </w:rPr>
+        <w:t xml:space="preserve"> </w:t>
+      </w:r>
+      <w:r>
+        <w:rPr>
+          <w:b/>
+          <w:bCs/>
+          <w:lang w:val="en-US"/>
+        </w:rPr>
+        <w:t>Admin</w:t>
+      </w:r>
+      <w:r>
+        <w:rPr>
+          <w:lang w:val="en-US"/>
+        </w:rPr>
+        <w:t xml:space="preserve"> and </w:t>
+      </w:r>
+      <w:r>
+        <w:rPr>
+          <w:b/>
+          <w:bCs/>
+          <w:lang w:val="en-US"/>
+        </w:rPr>
+        <w:t>User</w:t>
+      </w:r>
+      <w:r>
+        <w:rPr>
+          <w:lang w:val="en-US"/>
+        </w:rPr>
+        <w:t xml:space="preserve"> roles can edit, delete or check more details about the documents they have created. </w:t>
+      </w:r>
+      <w:r>
+        <w:rPr>
+          <w:lang w:val="en-US"/>
+        </w:rPr>
+        <w:t>Example edit:</w:t>
+      </w:r>
+      <w:r>
+        <w:rPr>
+          <w:lang w:val="en-US"/>
+        </w:rPr>
+        <w:br/>
+      </w:r>
+      <w:r>
+        <w:rPr>
+          <w:lang w:val="en-US"/>
+        </w:rPr>
+        <w:br/>
+      </w:r>
+      <w:r>
+        <w:rPr>
+          <w:lang w:val="en-US"/>
+        </w:rPr>
+        <w:drawing>
+          <wp:inline distT="0" distB="0" distL="0" distR="0" wp14:anchorId="2411755F" wp14:editId="4E9685CA">
+            <wp:extent cx="5760720" cy="1769424"/>
+            <wp:effectExtent l="0" t="0" r="0" b="2540"/>
+            <wp:docPr id="16" name="Picture 16"/>
+            <wp:cNvGraphicFramePr>
+              <a:graphicFrameLocks xmlns:a="http://schemas.openxmlformats.org/drawingml/2006/main" noChangeAspect="1"/>
+            </wp:cNvGraphicFramePr>
+            <a:graphic xmlns:a="http://schemas.openxmlformats.org/drawingml/2006/main">
+              <a:graphicData uri="http://schemas.openxmlformats.org/drawingml/2006/picture">
+                <pic:pic xmlns:pic="http://schemas.openxmlformats.org/drawingml/2006/picture">
+                  <pic:nvPicPr>
+                    <pic:cNvPr id="1" name=""/>
+                    <pic:cNvPicPr/>
+                  </pic:nvPicPr>
+                  <pic:blipFill>
+                    <a:blip r:embed="rId16"/>
+                    <a:stretch>
+                      <a:fillRect/>
+                    </a:stretch>
+                  </pic:blipFill>
+                  <pic:spPr>
+                    <a:xfrm>
+                      <a:off x="0" y="0"/>
+                      <a:ext cx="5786705" cy="1777405"/>
+                    </a:xfrm>
+                    <a:prstGeom prst="rect">
+                      <a:avLst/>
+                    </a:prstGeom>
+                  </pic:spPr>
+                </pic:pic>
+              </a:graphicData>
+            </a:graphic>
+          </wp:inline>
+        </w:drawing>
+      </w:r>
+    </w:p>
+    <w:p>
+      <w:pPr>
+        <w:rPr>
+          <w:lang w:val="en-US"/>
+        </w:rPr>
+      </w:pPr>
+      <w:r>
+        <w:rPr>
+          <w:lang w:val="en-US"/>
+        </w:rPr>
+        <w:drawing>
+          <wp:inline distT="0" distB="0" distL="0" distR="0" wp14:anchorId="0FBDC883" wp14:editId="55359360">
+            <wp:extent cx="5760720" cy="1852550"/>
+            <wp:effectExtent l="0" t="0" r="0" b="0"/>
+            <wp:docPr id="17" name="Picture 17"/>
+            <wp:cNvGraphicFramePr>
+              <a:graphicFrameLocks xmlns:a="http://schemas.openxmlformats.org/drawingml/2006/main" noChangeAspect="1"/>
+            </wp:cNvGraphicFramePr>
+            <a:graphic xmlns:a="http://schemas.openxmlformats.org/drawingml/2006/main">
+              <a:graphicData uri="http://schemas.openxmlformats.org/drawingml/2006/picture">
+                <pic:pic xmlns:pic="http://schemas.openxmlformats.org/drawingml/2006/picture">
+                  <pic:nvPicPr>
+                    <pic:cNvPr id="1" name=""/>
+                    <pic:cNvPicPr/>
+                  </pic:nvPicPr>
+                  <pic:blipFill>
+                    <a:blip r:embed="rId17"/>
+                    <a:stretch>
+                      <a:fillRect/>
+                    </a:stretch>
+                  </pic:blipFill>
+                  <pic:spPr>
+                    <a:xfrm>
+                      <a:off x="0" y="0"/>
+                      <a:ext cx="5769991" cy="1855531"/>
+                    </a:xfrm>
+                    <a:prstGeom prst="rect">
+                      <a:avLst/>
+                    </a:prstGeom>
+                  </pic:spPr>
+                </pic:pic>
+              </a:graphicData>
+            </a:graphic>
+          </wp:inline>
+        </w:drawing>
+      </w:r>
+    </w:p>
+    <w:p>
+      <w:pPr>
+        <w:rPr>
+          <w:lang w:val="en-US"/>
+        </w:rPr>
+      </w:pPr>
+      <w:r>
+        <w:rPr>
+          <w:lang w:val="en-US"/>
+        </w:rPr>
+        <w:t xml:space="preserve">Notice that even the two Edit document views may look alike they are not. The second photo has a permissions dropdown that I will explain later. </w:t>
+      </w:r>
+      <w:r>
+        <w:rPr>
+          <w:lang w:val="en-US"/>
+        </w:rPr>
+        <w:t xml:space="preserve">Via that view every user can edit the </w:t>
+      </w:r>
+      <w:r>
+        <w:rPr>
+          <w:lang w:val="en-US"/>
+        </w:rPr>
+        <w:lastRenderedPageBreak/>
+        <w:t xml:space="preserve">document that they own. If they try to edit someone </w:t>
+      </w:r>
+      <w:proofErr w:type="spellStart"/>
+      <w:r>
+        <w:rPr>
+          <w:lang w:val="en-US"/>
+        </w:rPr>
+        <w:t>elses</w:t>
+      </w:r>
+      <w:proofErr w:type="spellEnd"/>
+      <w:r>
+        <w:rPr>
+          <w:lang w:val="en-US"/>
+        </w:rPr>
+        <w:t xml:space="preserve"> document it will not work except if you have an</w:t>
+      </w:r>
+      <w:r>
+        <w:rPr>
+          <w:b/>
+          <w:bCs/>
+          <w:lang w:val="en-US"/>
+        </w:rPr>
+        <w:t xml:space="preserve"> Admin</w:t>
+      </w:r>
+      <w:r>
+        <w:rPr>
+          <w:b/>
+          <w:bCs/>
+          <w:lang w:val="en-US"/>
+        </w:rPr>
+        <w:t xml:space="preserve"> </w:t>
+      </w:r>
+      <w:r>
+        <w:rPr>
+          <w:lang w:val="en-US"/>
+        </w:rPr>
+        <w:t>role.</w:t>
+      </w:r>
+      <w:r>
+        <w:rPr>
+          <w:lang w:val="en-US"/>
+        </w:rPr>
+        <w:t xml:space="preserve"> Still The admin user cannot delete other peoples documents, but only his own. </w:t>
+      </w:r>
+      <w:r>
+        <w:rPr>
+          <w:lang w:val="en-US"/>
+        </w:rPr>
+        <w:t>You see the pop up message on the picture below.</w:t>
+      </w:r>
+      <w:r>
+        <w:rPr>
+          <w:lang w:val="en-US"/>
+        </w:rPr>
+        <w:br/>
+      </w:r>
+      <w:r>
+        <w:rPr>
+          <w:lang w:val="en-US"/>
+        </w:rPr>
+        <w:br/>
+      </w:r>
+      <w:r>
+        <w:rPr>
+          <w:lang w:val="en-US"/>
+        </w:rPr>
+        <w:drawing>
+          <wp:inline distT="0" distB="0" distL="0" distR="0" wp14:anchorId="522E57D8" wp14:editId="35A42FC2">
+            <wp:extent cx="5760720" cy="1711960"/>
+            <wp:effectExtent l="0" t="0" r="0" b="2540"/>
+            <wp:docPr id="18" name="Picture 18"/>
+            <wp:cNvGraphicFramePr>
+              <a:graphicFrameLocks xmlns:a="http://schemas.openxmlformats.org/drawingml/2006/main" noChangeAspect="1"/>
+            </wp:cNvGraphicFramePr>
+            <a:graphic xmlns:a="http://schemas.openxmlformats.org/drawingml/2006/main">
+              <a:graphicData uri="http://schemas.openxmlformats.org/drawingml/2006/picture">
+                <pic:pic xmlns:pic="http://schemas.openxmlformats.org/drawingml/2006/picture">
+                  <pic:nvPicPr>
+                    <pic:cNvPr id="1" name=""/>
+                    <pic:cNvPicPr/>
+                  </pic:nvPicPr>
+                  <pic:blipFill>
+                    <a:blip r:embed="rId18"/>
+                    <a:stretch>
+                      <a:fillRect/>
+                    </a:stretch>
+                  </pic:blipFill>
+                  <pic:spPr>
+                    <a:xfrm>
+                      <a:off x="0" y="0"/>
+                      <a:ext cx="5760720" cy="1711960"/>
+                    </a:xfrm>
+                    <a:prstGeom prst="rect">
+                      <a:avLst/>
+                    </a:prstGeom>
+                  </pic:spPr>
+                </pic:pic>
+              </a:graphicData>
+            </a:graphic>
+          </wp:inline>
+        </w:drawing>
+      </w:r>
+      <w:r>
+        <w:rPr>
+          <w:lang w:val="en-US"/>
+        </w:rPr>
+        <w:t xml:space="preserve"> </w:t>
+      </w:r>
+    </w:p>
+    <w:p>
+      <w:pPr>
+        <w:rPr>
+          <w:noProof/>
+          <w:lang w:val="en-US"/>
+        </w:rPr>
+      </w:pPr>
+      <w:r>
+        <w:rPr>
+          <w:lang w:val="en-US"/>
+        </w:rPr>
+        <w:t xml:space="preserve">Now lets see what happens when an ordinary user tries to delete his document. You see a document deleted successfully message and the document disappears from screen. </w:t>
+      </w:r>
+      <w:r>
+        <w:rPr>
+          <w:lang w:val="en-US"/>
+        </w:rPr>
+        <w:br/>
+      </w:r>
+      <w:r>
+        <w:rPr>
+          <w:lang w:val="en-US"/>
+        </w:rPr>
+        <w:br/>
+      </w:r>
+      <w:r>
+        <w:rPr>
+          <w:lang w:val="en-US"/>
+        </w:rPr>
+        <w:drawing>
+          <wp:inline distT="0" distB="0" distL="0" distR="0" wp14:anchorId="36CD6C75" wp14:editId="0155E08A">
+            <wp:extent cx="5760720" cy="1682115"/>
+            <wp:effectExtent l="0" t="0" r="0" b="0"/>
+            <wp:docPr id="19" name="Picture 19"/>
+            <wp:cNvGraphicFramePr>
+              <a:graphicFrameLocks xmlns:a="http://schemas.openxmlformats.org/drawingml/2006/main" noChangeAspect="1"/>
+            </wp:cNvGraphicFramePr>
+            <a:graphic xmlns:a="http://schemas.openxmlformats.org/drawingml/2006/main">
+              <a:graphicData uri="http://schemas.openxmlformats.org/drawingml/2006/picture">
+                <pic:pic xmlns:pic="http://schemas.openxmlformats.org/drawingml/2006/picture">
+                  <pic:nvPicPr>
+                    <pic:cNvPr id="1" name=""/>
+                    <pic:cNvPicPr/>
+                  </pic:nvPicPr>
+                  <pic:blipFill>
+                    <a:blip r:embed="rId19"/>
+                    <a:stretch>
+                      <a:fillRect/>
+                    </a:stretch>
+                  </pic:blipFill>
+                  <pic:spPr>
+                    <a:xfrm>
+                      <a:off x="0" y="0"/>
+                      <a:ext cx="5760720" cy="1682115"/>
+                    </a:xfrm>
+                    <a:prstGeom prst="rect">
+                      <a:avLst/>
+                    </a:prstGeom>
+                  </pic:spPr>
+                </pic:pic>
+              </a:graphicData>
+            </a:graphic>
+          </wp:inline>
+        </w:drawing>
+      </w:r>
+      <w:r>
+        <w:rPr>
+          <w:lang w:val="en-US"/>
+        </w:rPr>
+        <w:br/>
+      </w:r>
+      <w:r>
+        <w:rPr>
+          <w:lang w:val="en-US"/>
+        </w:rPr>
+        <w:t xml:space="preserve">Lets change users and log in with our </w:t>
+      </w:r>
+      <w:r>
+        <w:rPr>
+          <w:b/>
+          <w:bCs/>
+          <w:lang w:val="en-US"/>
+        </w:rPr>
+        <w:t>Admin</w:t>
+      </w:r>
+      <w:r>
+        <w:rPr>
+          <w:lang w:val="en-US"/>
+        </w:rPr>
+        <w:t xml:space="preserve"> user. Go to </w:t>
+      </w:r>
+      <w:r>
+        <w:rPr>
+          <w:lang w:val="en-US"/>
+        </w:rPr>
+        <w:t xml:space="preserve">Manage Documents </w:t>
+      </w:r>
+      <w:r>
+        <w:rPr>
+          <w:lang w:val="en-US"/>
+        </w:rPr>
+        <w:t xml:space="preserve"> dropdown menu. </w:t>
+      </w:r>
+      <w:r>
+        <w:rPr>
+          <w:lang w:val="en-US"/>
+        </w:rPr>
+        <w:t xml:space="preserve">Recent photo shows that the document the was deleted was not actually permanently deleted, but instead was only </w:t>
+      </w:r>
+      <w:proofErr w:type="spellStart"/>
+      <w:r>
+        <w:rPr>
+          <w:b/>
+          <w:bCs/>
+          <w:lang w:val="en-US"/>
+        </w:rPr>
+        <w:t>SoftDeleted</w:t>
+      </w:r>
+      <w:proofErr w:type="spellEnd"/>
+      <w:r>
+        <w:rPr>
+          <w:lang w:val="en-US"/>
+        </w:rPr>
+        <w:t xml:space="preserve"> or hidden and a user with an Admin Role can see that. You can see that it says undelete at the bottom, which means that it can be restored. Lets restore it. </w:t>
+      </w:r>
+      <w:r>
+        <w:rPr>
+          <w:lang w:val="en-US"/>
+        </w:rPr>
+        <w:br/>
+      </w:r>
+      <w:r>
+        <w:rPr>
+          <w:lang w:val="en-US"/>
+        </w:rPr>
+        <w:drawing>
+          <wp:inline distT="0" distB="0" distL="0" distR="0" wp14:anchorId="050EA9C1" wp14:editId="7061D617">
+            <wp:extent cx="5760720" cy="973776"/>
+            <wp:effectExtent l="0" t="0" r="0" b="0"/>
+            <wp:docPr id="20" name="Picture 20"/>
+            <wp:cNvGraphicFramePr>
+              <a:graphicFrameLocks xmlns:a="http://schemas.openxmlformats.org/drawingml/2006/main" noChangeAspect="1"/>
+            </wp:cNvGraphicFramePr>
+            <a:graphic xmlns:a="http://schemas.openxmlformats.org/drawingml/2006/main">
+              <a:graphicData uri="http://schemas.openxmlformats.org/drawingml/2006/picture">
+                <pic:pic xmlns:pic="http://schemas.openxmlformats.org/drawingml/2006/picture">
+                  <pic:nvPicPr>
+                    <pic:cNvPr id="1" name=""/>
+                    <pic:cNvPicPr/>
+                  </pic:nvPicPr>
+                  <pic:blipFill>
+                    <a:blip r:embed="rId20"/>
+                    <a:stretch>
+                      <a:fillRect/>
+                    </a:stretch>
+                  </pic:blipFill>
+                  <pic:spPr>
+                    <a:xfrm>
+                      <a:off x="0" y="0"/>
+                      <a:ext cx="5775390" cy="976256"/>
+                    </a:xfrm>
+                    <a:prstGeom prst="rect">
+                      <a:avLst/>
+                    </a:prstGeom>
+                  </pic:spPr>
+                </pic:pic>
+              </a:graphicData>
+            </a:graphic>
+          </wp:inline>
+        </w:drawing>
+      </w:r>
+      <w:r>
+        <w:rPr>
+          <w:noProof/>
+        </w:rPr>
+        <w:t xml:space="preserve"> </w:t>
+      </w:r>
+    </w:p>
+    <w:p>
+      <w:pPr>
+        <w:rPr>
+          <w:noProof/>
+          <w:lang w:val="en-US"/>
+        </w:rPr>
+      </w:pPr>
+      <w:r>
+        <w:rPr>
+          <w:noProof/>
+          <w:lang w:val="en-US"/>
+        </w:rPr>
+        <w:t xml:space="preserve">Second phot shows the restored document. </w:t>
+      </w:r>
+    </w:p>
+    <w:p>
+      <w:pPr>
+        <w:rPr>
+          <w:lang w:val="en-US"/>
+        </w:rPr>
+      </w:pPr>
+      <w:r>
+        <w:rPr>
+          <w:lang w:val="en-US"/>
+        </w:rPr>
+        <w:drawing>
+          <wp:inline distT="0" distB="0" distL="0" distR="0" wp14:anchorId="3CC39D10" wp14:editId="62854A75">
+            <wp:extent cx="5757505" cy="1122218"/>
+            <wp:effectExtent l="0" t="0" r="0" b="1905"/>
+            <wp:docPr id="21" name="Picture 21"/>
+            <wp:cNvGraphicFramePr>
+              <a:graphicFrameLocks xmlns:a="http://schemas.openxmlformats.org/drawingml/2006/main" noChangeAspect="1"/>
+            </wp:cNvGraphicFramePr>
+            <a:graphic xmlns:a="http://schemas.openxmlformats.org/drawingml/2006/main">
+              <a:graphicData uri="http://schemas.openxmlformats.org/drawingml/2006/picture">
+                <pic:pic xmlns:pic="http://schemas.openxmlformats.org/drawingml/2006/picture">
+                  <pic:nvPicPr>
+                    <pic:cNvPr id="1" name=""/>
+                    <pic:cNvPicPr/>
+                  </pic:nvPicPr>
+                  <pic:blipFill>
+                    <a:blip r:embed="rId21"/>
+                    <a:stretch>
+                      <a:fillRect/>
+                    </a:stretch>
+                  </pic:blipFill>
+                  <pic:spPr>
+                    <a:xfrm>
+                      <a:off x="0" y="0"/>
+                      <a:ext cx="5851212" cy="1140483"/>
+                    </a:xfrm>
+                    <a:prstGeom prst="rect">
+                      <a:avLst/>
+                    </a:prstGeom>
+                  </pic:spPr>
+                </pic:pic>
+              </a:graphicData>
+            </a:graphic>
+          </wp:inline>
+        </w:drawing>
+      </w:r>
+    </w:p>
+    <w:p>
+      <w:pPr>
+        <w:rPr>
+          <w:lang w:val="en-US"/>
+        </w:rPr>
+      </w:pPr>
+      <w:r>
+        <w:rPr>
+          <w:lang w:val="en-US"/>
+        </w:rPr>
+        <w:lastRenderedPageBreak/>
+        <w:t>If we log with the ordinary user that deleted the document in the first place. We can see that the document has been restore</w:t>
+      </w:r>
+      <w:r>
+        <w:rPr>
+          <w:lang w:val="en-US"/>
+        </w:rPr>
+        <w:t>d</w:t>
+      </w:r>
+      <w:r>
+        <w:rPr>
+          <w:lang w:val="en-US"/>
+        </w:rPr>
+        <w:t xml:space="preserve">. </w:t>
+      </w:r>
+      <w:r>
+        <w:rPr>
+          <w:lang w:val="en-US"/>
+        </w:rPr>
+        <w:t xml:space="preserve">And the user can again edit and delete it or can he? User with an </w:t>
+      </w:r>
+      <w:r>
+        <w:rPr>
+          <w:b/>
+          <w:bCs/>
+          <w:lang w:val="en-US"/>
+        </w:rPr>
+        <w:t>Admin role</w:t>
+      </w:r>
+      <w:r>
+        <w:rPr>
+          <w:lang w:val="en-US"/>
+        </w:rPr>
+        <w:t xml:space="preserve"> has 2 more options in order to prevent future wrong deletions or edits.</w:t>
+      </w:r>
+      <w:r>
+        <w:rPr>
+          <w:lang w:val="en-US"/>
+        </w:rPr>
+        <w:br/>
+      </w:r>
+      <w:r>
+        <w:rPr>
+          <w:lang w:val="en-US"/>
+        </w:rPr>
+        <w:br/>
+        <w:t xml:space="preserve"> If we login with the </w:t>
+      </w:r>
+      <w:r>
+        <w:rPr>
+          <w:b/>
+          <w:bCs/>
+          <w:lang w:val="en-US"/>
+        </w:rPr>
+        <w:t>Admin role</w:t>
+      </w:r>
+      <w:r>
+        <w:rPr>
+          <w:lang w:val="en-US"/>
+        </w:rPr>
+        <w:t xml:space="preserve"> user again go to manage documents and press to edit the ordinary user document we can see at the bottom permission. </w:t>
+      </w:r>
+      <w:r>
+        <w:rPr>
+          <w:lang w:val="en-US"/>
+        </w:rPr>
+        <w:br/>
+      </w:r>
+      <w:r>
+        <w:rPr>
+          <w:lang w:val="en-US"/>
+        </w:rPr>
+        <w:drawing>
+          <wp:inline distT="0" distB="0" distL="0" distR="0" wp14:anchorId="2FFD8134" wp14:editId="388CB3AA">
+            <wp:extent cx="5760720" cy="1082040"/>
+            <wp:effectExtent l="0" t="0" r="0" b="3810"/>
+            <wp:docPr id="22" name="Picture 22"/>
+            <wp:cNvGraphicFramePr>
+              <a:graphicFrameLocks xmlns:a="http://schemas.openxmlformats.org/drawingml/2006/main" noChangeAspect="1"/>
+            </wp:cNvGraphicFramePr>
+            <a:graphic xmlns:a="http://schemas.openxmlformats.org/drawingml/2006/main">
+              <a:graphicData uri="http://schemas.openxmlformats.org/drawingml/2006/picture">
+                <pic:pic xmlns:pic="http://schemas.openxmlformats.org/drawingml/2006/picture">
+                  <pic:nvPicPr>
+                    <pic:cNvPr id="1" name=""/>
+                    <pic:cNvPicPr/>
+                  </pic:nvPicPr>
+                  <pic:blipFill>
+                    <a:blip r:embed="rId22"/>
+                    <a:stretch>
+                      <a:fillRect/>
+                    </a:stretch>
+                  </pic:blipFill>
+                  <pic:spPr>
+                    <a:xfrm>
+                      <a:off x="0" y="0"/>
+                      <a:ext cx="5760720" cy="1082040"/>
+                    </a:xfrm>
+                    <a:prstGeom prst="rect">
+                      <a:avLst/>
+                    </a:prstGeom>
+                  </pic:spPr>
+                </pic:pic>
+              </a:graphicData>
+            </a:graphic>
+          </wp:inline>
+        </w:drawing>
+      </w:r>
+    </w:p>
+    <w:p>
+      <w:pPr>
+        <w:rPr>
+          <w:lang w:val="en-US"/>
+        </w:rPr>
+      </w:pPr>
+      <w:r>
+        <w:rPr>
+          <w:lang w:val="en-US"/>
+        </w:rPr>
+        <w:t xml:space="preserve">If we choose </w:t>
+      </w:r>
+      <w:r>
+        <w:rPr>
+          <w:b/>
+          <w:bCs/>
+          <w:lang w:val="en-US"/>
+        </w:rPr>
+        <w:t xml:space="preserve">Read </w:t>
+      </w:r>
+      <w:r>
+        <w:rPr>
+          <w:lang w:val="en-US"/>
+        </w:rPr>
+        <w:t>permission that means that the ordinary user will no longer be able to edit or delete its own document. If we choose</w:t>
+      </w:r>
+      <w:r>
+        <w:rPr>
+          <w:b/>
+          <w:bCs/>
+          <w:lang w:val="en-US"/>
+        </w:rPr>
+        <w:t xml:space="preserve"> Write</w:t>
+      </w:r>
+      <w:r>
+        <w:rPr>
+          <w:lang w:val="en-US"/>
+        </w:rPr>
+        <w:t xml:space="preserve"> this will allow only access to edit document without being able to delete it anymore. </w:t>
+      </w:r>
+      <w:r>
+        <w:rPr>
+          <w:lang w:val="en-US"/>
+        </w:rPr>
+        <w:br/>
+      </w:r>
+      <w:r>
+        <w:rPr>
+          <w:lang w:val="en-US"/>
+        </w:rPr>
+        <w:br/>
+      </w:r>
+      <w:r>
+        <w:rPr>
+          <w:lang w:val="en-US"/>
+        </w:rPr>
+        <w:drawing>
+          <wp:inline distT="0" distB="0" distL="0" distR="0" wp14:anchorId="613EF403" wp14:editId="1F4F3149">
+            <wp:extent cx="5760720" cy="2047240"/>
+            <wp:effectExtent l="0" t="0" r="0" b="0"/>
+            <wp:docPr id="23" name="Picture 23"/>
+            <wp:cNvGraphicFramePr>
+              <a:graphicFrameLocks xmlns:a="http://schemas.openxmlformats.org/drawingml/2006/main" noChangeAspect="1"/>
+            </wp:cNvGraphicFramePr>
+            <a:graphic xmlns:a="http://schemas.openxmlformats.org/drawingml/2006/main">
+              <a:graphicData uri="http://schemas.openxmlformats.org/drawingml/2006/picture">
+                <pic:pic xmlns:pic="http://schemas.openxmlformats.org/drawingml/2006/picture">
+                  <pic:nvPicPr>
+                    <pic:cNvPr id="1" name=""/>
+                    <pic:cNvPicPr/>
+                  </pic:nvPicPr>
+                  <pic:blipFill>
+                    <a:blip r:embed="rId23"/>
+                    <a:stretch>
+                      <a:fillRect/>
+                    </a:stretch>
+                  </pic:blipFill>
+                  <pic:spPr>
+                    <a:xfrm>
+                      <a:off x="0" y="0"/>
+                      <a:ext cx="5760720" cy="2047240"/>
+                    </a:xfrm>
+                    <a:prstGeom prst="rect">
+                      <a:avLst/>
+                    </a:prstGeom>
+                  </pic:spPr>
+                </pic:pic>
+              </a:graphicData>
+            </a:graphic>
+          </wp:inline>
+        </w:drawing>
+      </w:r>
+    </w:p>
+    <w:p>
+      <w:pPr>
+        <w:rPr>
+          <w:lang w:val="en-US"/>
+        </w:rPr>
+      </w:pPr>
+      <w:r>
+        <w:rPr>
+          <w:lang w:val="en-US"/>
+        </w:rPr>
+        <w:drawing>
+          <wp:inline distT="0" distB="0" distL="0" distR="0" wp14:anchorId="45E96869" wp14:editId="627A1536">
+            <wp:extent cx="5760720" cy="2127885"/>
+            <wp:effectExtent l="0" t="0" r="0" b="5715"/>
+            <wp:docPr id="25" name="Picture 25"/>
+            <wp:cNvGraphicFramePr>
+              <a:graphicFrameLocks xmlns:a="http://schemas.openxmlformats.org/drawingml/2006/main" noChangeAspect="1"/>
+            </wp:cNvGraphicFramePr>
+            <a:graphic xmlns:a="http://schemas.openxmlformats.org/drawingml/2006/main">
+              <a:graphicData uri="http://schemas.openxmlformats.org/drawingml/2006/picture">
+                <pic:pic xmlns:pic="http://schemas.openxmlformats.org/drawingml/2006/picture">
+                  <pic:nvPicPr>
+                    <pic:cNvPr id="1" name=""/>
+                    <pic:cNvPicPr/>
+                  </pic:nvPicPr>
+                  <pic:blipFill>
+                    <a:blip r:embed="rId24"/>
+                    <a:stretch>
+                      <a:fillRect/>
+                    </a:stretch>
+                  </pic:blipFill>
+                  <pic:spPr>
+                    <a:xfrm>
+                      <a:off x="0" y="0"/>
+                      <a:ext cx="5760720" cy="2127885"/>
+                    </a:xfrm>
+                    <a:prstGeom prst="rect">
+                      <a:avLst/>
+                    </a:prstGeom>
+                  </pic:spPr>
+                </pic:pic>
+              </a:graphicData>
+            </a:graphic>
+          </wp:inline>
+        </w:drawing>
+      </w:r>
+    </w:p>
+    <w:p>
+      <w:pPr>
+        <w:rPr>
+          <w:lang w:val="en-US"/>
+        </w:rPr>
+      </w:pPr>
+      <w:r>
+        <w:rPr>
+          <w:lang w:val="en-US"/>
+        </w:rPr>
+        <w:t xml:space="preserve">This is only possible if the </w:t>
+      </w:r>
+      <w:r>
+        <w:rPr>
+          <w:b/>
+          <w:bCs/>
+          <w:lang w:val="en-US"/>
+        </w:rPr>
+        <w:t>Admin role</w:t>
+      </w:r>
+      <w:r>
+        <w:rPr>
+          <w:lang w:val="en-US"/>
+        </w:rPr>
+        <w:t xml:space="preserve"> user is also a manager. This is an extra filtration added to the User management profile. User </w:t>
+      </w:r>
+      <w:hyperlink r:id="rId25" w:history="1">
+        <w:r>
+          <w:rPr>
+            <w:rStyle w:val="Hyperlink"/>
+            <w:lang w:val="en-US"/>
+          </w:rPr>
+          <w:t>admin@example.com</w:t>
+        </w:r>
+      </w:hyperlink>
+      <w:r>
+        <w:rPr>
+          <w:lang w:val="en-US"/>
+        </w:rPr>
+        <w:t xml:space="preserve"> that was seeded at the start is a manager by default. </w:t>
+      </w:r>
+      <w:r>
+        <w:rPr>
+          <w:lang w:val="en-US"/>
+        </w:rPr>
+        <w:br/>
+      </w:r>
+      <w:r>
+        <w:rPr>
+          <w:lang w:val="en-US"/>
+        </w:rPr>
+        <w:br/>
+        <w:t xml:space="preserve">Now lets create another manager,  demote the  </w:t>
+      </w:r>
+      <w:hyperlink r:id="rId26" w:history="1">
+        <w:r>
+          <w:rPr>
+            <w:rStyle w:val="Hyperlink"/>
+            <w:lang w:val="en-US"/>
+          </w:rPr>
+          <w:t>admin@example.com</w:t>
+        </w:r>
+      </w:hyperlink>
+      <w:r>
+        <w:rPr>
+          <w:lang w:val="en-US"/>
+        </w:rPr>
+        <w:t xml:space="preserve"> user to not manager </w:t>
+      </w:r>
+      <w:r>
+        <w:rPr>
+          <w:lang w:val="en-US"/>
+        </w:rPr>
+        <w:lastRenderedPageBreak/>
+        <w:t xml:space="preserve">and try to restrict the ordinary user again. </w:t>
+      </w:r>
+      <w:r>
+        <w:rPr>
+          <w:lang w:val="en-US"/>
+        </w:rPr>
+        <w:t xml:space="preserve">We create </w:t>
+      </w:r>
+      <w:hyperlink r:id="rId27" w:history="1">
+        <w:r>
+          <w:rPr>
+            <w:rStyle w:val="Hyperlink"/>
+            <w:b/>
+            <w:bCs/>
+            <w:lang w:val="en-US"/>
+          </w:rPr>
+          <w:t>secondmanager@gmail.com</w:t>
+        </w:r>
+      </w:hyperlink>
+      <w:r>
+        <w:rPr>
+          <w:b/>
+          <w:bCs/>
+          <w:lang w:val="en-US"/>
+        </w:rPr>
+        <w:t xml:space="preserve"> </w:t>
+      </w:r>
+      <w:r>
+        <w:rPr>
+          <w:lang w:val="en-US"/>
+        </w:rPr>
+        <w:t xml:space="preserve">and promote him to an </w:t>
+      </w:r>
+      <w:r>
+        <w:rPr>
+          <w:b/>
+          <w:bCs/>
+          <w:lang w:val="en-US"/>
+        </w:rPr>
+        <w:t>Admin Role</w:t>
+      </w:r>
+      <w:r>
+        <w:rPr>
+          <w:lang w:val="en-US"/>
+        </w:rPr>
+        <w:t xml:space="preserve"> user. So that it has more rights. </w:t>
+      </w:r>
+      <w:r>
+        <w:rPr>
+          <w:lang w:val="en-US"/>
+        </w:rPr>
+        <w:t xml:space="preserve">That can be done only via the original user </w:t>
+      </w:r>
+      <w:r>
+        <w:rPr>
+          <w:lang w:val="en-US"/>
+        </w:rPr>
+        <w:t xml:space="preserve"> </w:t>
+      </w:r>
+      <w:hyperlink r:id="rId28" w:history="1">
+        <w:r>
+          <w:rPr>
+            <w:rStyle w:val="Hyperlink"/>
+            <w:lang w:val="en-US"/>
+          </w:rPr>
+          <w:t>admin@example.com</w:t>
+        </w:r>
+      </w:hyperlink>
+      <w:r>
+        <w:rPr>
+          <w:lang w:val="en-US"/>
+        </w:rPr>
+        <w:t xml:space="preserve"> user management panel. </w:t>
+      </w:r>
+    </w:p>
+    <w:p>
+      <w:pPr>
+        <w:rPr>
+          <w:lang w:val="en-US"/>
+        </w:rPr>
+      </w:pPr>
+      <w:r>
+        <w:rPr>
+          <w:lang w:val="en-US"/>
+        </w:rPr>
+        <w:drawing>
+          <wp:inline distT="0" distB="0" distL="0" distR="0" wp14:anchorId="270F568D" wp14:editId="05C51B50">
+            <wp:extent cx="5760720" cy="2319020"/>
+            <wp:effectExtent l="0" t="0" r="0" b="5080"/>
+            <wp:docPr id="26" name="Picture 26"/>
+            <wp:cNvGraphicFramePr>
+              <a:graphicFrameLocks xmlns:a="http://schemas.openxmlformats.org/drawingml/2006/main" noChangeAspect="1"/>
+            </wp:cNvGraphicFramePr>
+            <a:graphic xmlns:a="http://schemas.openxmlformats.org/drawingml/2006/main">
+              <a:graphicData uri="http://schemas.openxmlformats.org/drawingml/2006/picture">
+                <pic:pic xmlns:pic="http://schemas.openxmlformats.org/drawingml/2006/picture">
+                  <pic:nvPicPr>
+                    <pic:cNvPr id="1" name=""/>
+                    <pic:cNvPicPr/>
+                  </pic:nvPicPr>
+                  <pic:blipFill>
+                    <a:blip r:embed="rId29"/>
+                    <a:stretch>
+                      <a:fillRect/>
+                    </a:stretch>
+                  </pic:blipFill>
+                  <pic:spPr>
+                    <a:xfrm>
+                      <a:off x="0" y="0"/>
+                      <a:ext cx="5760720" cy="2319020"/>
+                    </a:xfrm>
+                    <a:prstGeom prst="rect">
+                      <a:avLst/>
+                    </a:prstGeom>
+                  </pic:spPr>
+                </pic:pic>
+              </a:graphicData>
+            </a:graphic>
+          </wp:inline>
+        </w:drawing>
+      </w:r>
+    </w:p>
+    <w:p>
+      <w:pPr>
+        <w:rPr>
+          <w:lang w:val="en-US"/>
+        </w:rPr>
+      </w:pPr>
+      <w:r>
+        <w:rPr>
+          <w:lang w:val="en-US"/>
+        </w:rPr>
+        <w:t xml:space="preserve">Now we log in with the </w:t>
+      </w:r>
+      <w:r>
+        <w:rPr>
+          <w:b/>
+          <w:bCs/>
+          <w:lang w:val="en-US"/>
+        </w:rPr>
+        <w:t>secondmanager@gmail.com</w:t>
+      </w:r>
+      <w:r>
+        <w:rPr>
+          <w:lang w:val="en-US"/>
+        </w:rPr>
+        <w:t xml:space="preserve"> profile and remove the </w:t>
+      </w:r>
+      <w:proofErr w:type="spellStart"/>
+      <w:r>
+        <w:rPr>
+          <w:lang w:val="en-US"/>
+        </w:rPr>
+        <w:t>IsManager</w:t>
+      </w:r>
+      <w:proofErr w:type="spellEnd"/>
+      <w:r>
+        <w:rPr>
+          <w:lang w:val="en-US"/>
+        </w:rPr>
+        <w:t xml:space="preserve"> role from the original </w:t>
+      </w:r>
+      <w:hyperlink r:id="rId30" w:history="1">
+        <w:r>
+          <w:rPr>
+            <w:rStyle w:val="Hyperlink"/>
+            <w:lang w:val="en-US"/>
+          </w:rPr>
+          <w:t>admin@example.com</w:t>
+        </w:r>
+      </w:hyperlink>
+      <w:r>
+        <w:rPr>
+          <w:lang w:val="en-US"/>
+        </w:rPr>
+        <w:t xml:space="preserve"> user. We first need to </w:t>
+      </w:r>
+      <w:proofErr w:type="spellStart"/>
+      <w:r>
+        <w:rPr>
+          <w:lang w:val="en-US"/>
+        </w:rPr>
+        <w:t>deassign</w:t>
+      </w:r>
+      <w:proofErr w:type="spellEnd"/>
+      <w:r>
+        <w:rPr>
+          <w:lang w:val="en-US"/>
+        </w:rPr>
+        <w:t xml:space="preserve"> the admin role and the can </w:t>
+      </w:r>
+      <w:proofErr w:type="spellStart"/>
+      <w:r>
+        <w:rPr>
+          <w:lang w:val="en-US"/>
+        </w:rPr>
+        <w:t>deassign</w:t>
+      </w:r>
+      <w:proofErr w:type="spellEnd"/>
+      <w:r>
+        <w:rPr>
+          <w:lang w:val="en-US"/>
+        </w:rPr>
+        <w:t xml:space="preserve"> the </w:t>
+      </w:r>
+      <w:proofErr w:type="spellStart"/>
+      <w:r>
+        <w:rPr>
+          <w:lang w:val="en-US"/>
+        </w:rPr>
+        <w:t>IsManager</w:t>
+      </w:r>
+      <w:proofErr w:type="spellEnd"/>
+      <w:r>
+        <w:rPr>
+          <w:lang w:val="en-US"/>
+        </w:rPr>
+        <w:t xml:space="preserve"> role. Then assign a new role to the user again. In this case we will assign admin role again. You can see on the photo below that </w:t>
+      </w:r>
+      <w:hyperlink r:id="rId31" w:history="1">
+        <w:r>
+          <w:rPr>
+            <w:rStyle w:val="Hyperlink"/>
+            <w:lang w:val="en-US"/>
+          </w:rPr>
+          <w:t>admin@example.com</w:t>
+        </w:r>
+      </w:hyperlink>
+      <w:r>
+        <w:rPr>
+          <w:lang w:val="en-US"/>
+        </w:rPr>
+        <w:t xml:space="preserve"> – </w:t>
+      </w:r>
+      <w:proofErr w:type="spellStart"/>
+      <w:r>
+        <w:rPr>
+          <w:b/>
+          <w:bCs/>
+          <w:lang w:val="en-US"/>
+        </w:rPr>
+        <w:t>IsManager</w:t>
+      </w:r>
+      <w:proofErr w:type="spellEnd"/>
+      <w:r>
+        <w:rPr>
+          <w:lang w:val="en-US"/>
+        </w:rPr>
+        <w:t xml:space="preserve"> no longer. </w:t>
+      </w:r>
+      <w:r>
+        <w:rPr>
+          <w:lang w:val="en-US"/>
+        </w:rPr>
+        <w:br/>
+      </w:r>
+      <w:r>
+        <w:rPr>
+          <w:lang w:val="en-US"/>
+        </w:rPr>
+        <w:br/>
+      </w:r>
+      <w:r>
+        <w:rPr>
+          <w:lang w:val="en-US"/>
+        </w:rPr>
+        <w:drawing>
+          <wp:inline distT="0" distB="0" distL="0" distR="0" wp14:anchorId="4B30AAC9" wp14:editId="70077F85">
+            <wp:extent cx="5760720" cy="842010"/>
+            <wp:effectExtent l="0" t="0" r="0" b="0"/>
+            <wp:docPr id="27" name="Picture 27"/>
+            <wp:cNvGraphicFramePr>
+              <a:graphicFrameLocks xmlns:a="http://schemas.openxmlformats.org/drawingml/2006/main" noChangeAspect="1"/>
+            </wp:cNvGraphicFramePr>
+            <a:graphic xmlns:a="http://schemas.openxmlformats.org/drawingml/2006/main">
+              <a:graphicData uri="http://schemas.openxmlformats.org/drawingml/2006/picture">
+                <pic:pic xmlns:pic="http://schemas.openxmlformats.org/drawingml/2006/picture">
+                  <pic:nvPicPr>
+                    <pic:cNvPr id="1" name=""/>
+                    <pic:cNvPicPr/>
+                  </pic:nvPicPr>
+                  <pic:blipFill>
+                    <a:blip r:embed="rId32"/>
+                    <a:stretch>
+                      <a:fillRect/>
+                    </a:stretch>
+                  </pic:blipFill>
+                  <pic:spPr>
+                    <a:xfrm>
+                      <a:off x="0" y="0"/>
+                      <a:ext cx="5760720" cy="842010"/>
+                    </a:xfrm>
+                    <a:prstGeom prst="rect">
+                      <a:avLst/>
+                    </a:prstGeom>
+                  </pic:spPr>
+                </pic:pic>
+              </a:graphicData>
+            </a:graphic>
+          </wp:inline>
+        </w:drawing>
+      </w:r>
+      <w:r>
+        <w:rPr>
+          <w:lang w:val="en-US"/>
+        </w:rPr>
+        <w:t xml:space="preserve"> </w:t>
+      </w:r>
+      <w:r>
+        <w:rPr>
+          <w:lang w:val="en-US"/>
+        </w:rPr>
+        <w:br/>
+      </w:r>
+      <w:r>
+        <w:rPr>
+          <w:lang w:val="en-US"/>
+        </w:rPr>
+        <w:br/>
+      </w:r>
+      <w:r>
+        <w:rPr>
+          <w:lang w:val="en-US"/>
+        </w:rPr>
+        <w:t xml:space="preserve">Now </w:t>
+      </w:r>
+      <w:proofErr w:type="spellStart"/>
+      <w:r>
+        <w:rPr>
+          <w:lang w:val="en-US"/>
+        </w:rPr>
+        <w:t>lets</w:t>
+      </w:r>
+      <w:proofErr w:type="spellEnd"/>
+      <w:r>
+        <w:rPr>
+          <w:lang w:val="en-US"/>
+        </w:rPr>
+        <w:t xml:space="preserve"> log with the original </w:t>
+      </w:r>
+      <w:hyperlink r:id="rId33" w:history="1">
+        <w:r>
+          <w:rPr>
+            <w:rStyle w:val="Hyperlink"/>
+            <w:lang w:val="en-US"/>
+          </w:rPr>
+          <w:t>admin@example.com</w:t>
+        </w:r>
+      </w:hyperlink>
+      <w:r>
+        <w:rPr>
+          <w:lang w:val="en-US"/>
+        </w:rPr>
+        <w:t xml:space="preserve"> user and see if we can change the permissions on the document again. </w:t>
+      </w:r>
+      <w:r>
+        <w:rPr>
+          <w:lang w:val="en-US"/>
+        </w:rPr>
+        <w:br/>
+      </w:r>
+      <w:r>
+        <w:rPr>
+          <w:lang w:val="en-US"/>
+        </w:rPr>
+        <w:br/>
+      </w:r>
+      <w:r>
+        <w:rPr>
+          <w:lang w:val="en-US"/>
+        </w:rPr>
+        <w:drawing>
+          <wp:inline distT="0" distB="0" distL="0" distR="0" wp14:anchorId="12F7E1AE" wp14:editId="1996AE94">
+            <wp:extent cx="5760720" cy="1757549"/>
+            <wp:effectExtent l="0" t="0" r="0" b="0"/>
+            <wp:docPr id="28" name="Picture 28"/>
+            <wp:cNvGraphicFramePr>
+              <a:graphicFrameLocks xmlns:a="http://schemas.openxmlformats.org/drawingml/2006/main" noChangeAspect="1"/>
+            </wp:cNvGraphicFramePr>
+            <a:graphic xmlns:a="http://schemas.openxmlformats.org/drawingml/2006/main">
+              <a:graphicData uri="http://schemas.openxmlformats.org/drawingml/2006/picture">
+                <pic:pic xmlns:pic="http://schemas.openxmlformats.org/drawingml/2006/picture">
+                  <pic:nvPicPr>
+                    <pic:cNvPr id="1" name=""/>
+                    <pic:cNvPicPr/>
+                  </pic:nvPicPr>
+                  <pic:blipFill>
+                    <a:blip r:embed="rId34"/>
+                    <a:stretch>
+                      <a:fillRect/>
+                    </a:stretch>
+                  </pic:blipFill>
+                  <pic:spPr>
+                    <a:xfrm>
+                      <a:off x="0" y="0"/>
+                      <a:ext cx="5770782" cy="1760619"/>
+                    </a:xfrm>
+                    <a:prstGeom prst="rect">
+                      <a:avLst/>
+                    </a:prstGeom>
+                  </pic:spPr>
+                </pic:pic>
+              </a:graphicData>
+            </a:graphic>
+          </wp:inline>
+        </w:drawing>
+      </w:r>
+      <w:r>
+        <w:rPr>
+          <w:lang w:val="en-US"/>
+        </w:rPr>
+        <w:br/>
+      </w:r>
+      <w:r>
+        <w:rPr>
+          <w:lang w:val="en-US"/>
+        </w:rPr>
+        <w:br/>
+        <w:t>When we click on the edit document view we can see that this option is not available anymore</w:t>
+      </w:r>
+      <w:r>
+        <w:rPr>
+          <w:lang w:val="en-US"/>
+        </w:rPr>
+        <w:t xml:space="preserve">. </w:t>
+      </w:r>
+      <w:r>
+        <w:rPr>
+          <w:lang w:val="en-US"/>
+        </w:rPr>
+        <w:br/>
+      </w:r>
+      <w:r>
+        <w:rPr>
+          <w:lang w:val="en-US"/>
+        </w:rPr>
+        <w:br/>
+      </w:r>
+      <w:r>
+        <w:rPr>
+          <w:lang w:val="en-US"/>
+        </w:rPr>
+        <w:lastRenderedPageBreak/>
+        <w:t xml:space="preserve">Admin users only </w:t>
+      </w:r>
+      <w:r>
+        <w:rPr>
+          <w:lang w:val="en-US"/>
+        </w:rPr>
+        <w:t xml:space="preserve">can add departments via the department view and categories via the categories view. </w:t>
+      </w:r>
+    </w:p>
+    <w:p>
+      <w:pPr>
+        <w:rPr>
+          <w:lang w:val="en-US"/>
+        </w:rPr>
+      </w:pPr>
+      <w:r>
+        <w:rPr>
+          <w:lang w:val="en-US"/>
+        </w:rPr>
+        <w:t xml:space="preserve">Finally </w:t>
+      </w:r>
+      <w:proofErr w:type="spellStart"/>
+      <w:r>
+        <w:rPr>
+          <w:lang w:val="en-US"/>
+        </w:rPr>
+        <w:t>lets</w:t>
+      </w:r>
+      <w:proofErr w:type="spellEnd"/>
+      <w:r>
+        <w:rPr>
+          <w:lang w:val="en-US"/>
+        </w:rPr>
+        <w:t xml:space="preserve"> check logs for documents via the</w:t>
+      </w:r>
+      <w:r>
+        <w:rPr>
+          <w:b/>
+          <w:bCs/>
+          <w:lang w:val="en-US"/>
+        </w:rPr>
+        <w:t xml:space="preserve"> Admin</w:t>
+      </w:r>
+      <w:r>
+        <w:rPr>
+          <w:b/>
+          <w:bCs/>
+          <w:lang w:val="en-US"/>
+        </w:rPr>
+        <w:t xml:space="preserve"> </w:t>
+      </w:r>
+      <w:r>
+        <w:rPr>
+          <w:lang w:val="en-US"/>
+        </w:rPr>
+        <w:t>dropdown</w:t>
+      </w:r>
+      <w:r>
+        <w:rPr>
+          <w:lang w:val="en-US"/>
+        </w:rPr>
+        <w:t xml:space="preserve"> </w:t>
+      </w:r>
+      <w:r>
+        <w:rPr>
+          <w:b/>
+          <w:bCs/>
+          <w:lang w:val="en-US"/>
+        </w:rPr>
+        <w:t>Check Logs</w:t>
+      </w:r>
+      <w:r>
+        <w:rPr>
+          <w:b/>
+          <w:bCs/>
+          <w:lang w:val="en-US"/>
+        </w:rPr>
+        <w:t xml:space="preserve">. </w:t>
+      </w:r>
+      <w:r>
+        <w:rPr>
+          <w:b/>
+          <w:bCs/>
+          <w:lang w:val="en-US"/>
+        </w:rPr>
+        <w:br/>
+      </w:r>
+      <w:r>
+        <w:rPr>
+          <w:b/>
+          <w:bCs/>
+          <w:lang w:val="en-US"/>
+        </w:rPr>
+        <w:br/>
+      </w:r>
+      <w:r>
+        <w:rPr>
+          <w:lang w:val="en-US"/>
+        </w:rPr>
+        <w:drawing>
+          <wp:inline distT="0" distB="0" distL="0" distR="0" wp14:anchorId="2C092CB3" wp14:editId="2FC325C3">
+            <wp:extent cx="5760720" cy="3470275"/>
+            <wp:effectExtent l="0" t="0" r="0" b="0"/>
+            <wp:docPr id="29" name="Picture 29"/>
+            <wp:cNvGraphicFramePr>
+              <a:graphicFrameLocks xmlns:a="http://schemas.openxmlformats.org/drawingml/2006/main" noChangeAspect="1"/>
+            </wp:cNvGraphicFramePr>
+            <a:graphic xmlns:a="http://schemas.openxmlformats.org/drawingml/2006/main">
+              <a:graphicData uri="http://schemas.openxmlformats.org/drawingml/2006/picture">
+                <pic:pic xmlns:pic="http://schemas.openxmlformats.org/drawingml/2006/picture">
+                  <pic:nvPicPr>
+                    <pic:cNvPr id="1" name=""/>
+                    <pic:cNvPicPr/>
+                  </pic:nvPicPr>
+                  <pic:blipFill>
+                    <a:blip r:embed="rId35"/>
+                    <a:stretch>
+                      <a:fillRect/>
+                    </a:stretch>
+                  </pic:blipFill>
+                  <pic:spPr>
+                    <a:xfrm>
+                      <a:off x="0" y="0"/>
+                      <a:ext cx="5760720" cy="3470275"/>
+                    </a:xfrm>
+                    <a:prstGeom prst="rect">
+                      <a:avLst/>
+                    </a:prstGeom>
+                  </pic:spPr>
+                </pic:pic>
+              </a:graphicData>
+            </a:graphic>
+          </wp:inline>
+        </w:drawing>
+      </w:r>
+      <w:r>
+        <w:rPr>
+          <w:b/>
+          <w:bCs/>
+          <w:lang w:val="en-US"/>
+        </w:rPr>
+        <w:br/>
+      </w:r>
+      <w:r>
+        <w:rPr>
+          <w:b/>
+          <w:bCs/>
+          <w:lang w:val="en-US"/>
+        </w:rPr>
+        <w:br/>
+      </w:r>
+      <w:r>
+        <w:rPr>
+          <w:lang w:val="en-US"/>
+        </w:rPr>
+        <w:t>Th</w:t>
+      </w:r>
+      <w:r>
+        <w:rPr>
+          <w:lang w:val="en-US"/>
+        </w:rPr>
+        <w:t xml:space="preserve">is is a view available only for the </w:t>
+      </w:r>
+      <w:r>
+        <w:rPr>
+          <w:b/>
+          <w:bCs/>
+          <w:lang w:val="en-US"/>
+        </w:rPr>
+        <w:t>Admin role</w:t>
+      </w:r>
+      <w:r>
+        <w:rPr>
+          <w:lang w:val="en-US"/>
+        </w:rPr>
+        <w:t xml:space="preserve"> users used to check on log for every document. Every time a document is amended a log is created. When pressed on</w:t>
+      </w:r>
+      <w:r>
+        <w:rPr>
+          <w:b/>
+          <w:bCs/>
+          <w:lang w:val="en-US"/>
+        </w:rPr>
+        <w:t xml:space="preserve"> More</w:t>
+      </w:r>
+      <w:r>
+        <w:rPr>
+          <w:lang w:val="en-US"/>
+        </w:rPr>
+        <w:t xml:space="preserve">  </w:t>
+      </w:r>
+      <w:r>
+        <w:rPr>
+          <w:b/>
+          <w:bCs/>
+          <w:lang w:val="en-US"/>
+        </w:rPr>
+        <w:t>.</w:t>
+      </w:r>
+      <w:proofErr w:type="spellStart"/>
+      <w:r>
+        <w:rPr>
+          <w:b/>
+          <w:bCs/>
+          <w:lang w:val="en-US"/>
+        </w:rPr>
+        <w:t>js</w:t>
+      </w:r>
+      <w:proofErr w:type="spellEnd"/>
+      <w:r>
+        <w:rPr>
+          <w:b/>
+          <w:bCs/>
+          <w:lang w:val="en-US"/>
+        </w:rPr>
+        <w:t xml:space="preserve"> function </w:t>
+      </w:r>
+      <w:r>
+        <w:rPr>
+          <w:lang w:val="en-US"/>
+        </w:rPr>
+        <w:t>dynamically grabs</w:t>
+      </w:r>
+      <w:r>
+        <w:rPr>
+          <w:b/>
+          <w:bCs/>
+          <w:lang w:val="en-US"/>
+        </w:rPr>
+        <w:t xml:space="preserve"> </w:t>
+      </w:r>
+      <w:r>
+        <w:rPr>
+          <w:lang w:val="en-US"/>
+        </w:rPr>
+        <w:t xml:space="preserve">the content and show it to the user in a descending order by time logged. This is achieved using a modal view and </w:t>
+      </w:r>
+      <w:proofErr w:type="spellStart"/>
+      <w:r>
+        <w:rPr>
+          <w:lang w:val="en-US"/>
+        </w:rPr>
+        <w:t>and</w:t>
+      </w:r>
+      <w:proofErr w:type="spellEnd"/>
+      <w:r>
+        <w:rPr>
+          <w:lang w:val="en-US"/>
+        </w:rPr>
+        <w:t xml:space="preserve"> a partial view. </w:t>
+      </w:r>
+      <w:r>
+        <w:rPr>
+          <w:lang w:val="en-US"/>
+        </w:rPr>
+        <w:t xml:space="preserve">Page has filtration and no pagination on purpose. </w:t>
+      </w:r>
+      <w:r>
+        <w:rPr>
+          <w:lang w:val="en-US"/>
+        </w:rPr>
+        <w:br/>
+      </w:r>
+      <w:r>
+        <w:rPr>
+          <w:lang w:val="en-US"/>
+        </w:rPr>
+        <w:br/>
+      </w:r>
+      <w:r>
+        <w:rPr>
+          <w:lang w:val="en-US"/>
+        </w:rPr>
+        <w:drawing>
+          <wp:inline distT="0" distB="0" distL="0" distR="0" wp14:anchorId="610B2D9B" wp14:editId="7A720E94">
+            <wp:extent cx="5758929" cy="2826328"/>
+            <wp:effectExtent l="0" t="0" r="0" b="0"/>
+            <wp:docPr id="30" name="Picture 30"/>
+            <wp:cNvGraphicFramePr>
+              <a:graphicFrameLocks xmlns:a="http://schemas.openxmlformats.org/drawingml/2006/main" noChangeAspect="1"/>
+            </wp:cNvGraphicFramePr>
+            <a:graphic xmlns:a="http://schemas.openxmlformats.org/drawingml/2006/main">
+              <a:graphicData uri="http://schemas.openxmlformats.org/drawingml/2006/picture">
+                <pic:pic xmlns:pic="http://schemas.openxmlformats.org/drawingml/2006/picture">
+                  <pic:nvPicPr>
+                    <pic:cNvPr id="1" name=""/>
+                    <pic:cNvPicPr/>
+                  </pic:nvPicPr>
+                  <pic:blipFill>
+                    <a:blip r:embed="rId36"/>
+                    <a:stretch>
+                      <a:fillRect/>
+                    </a:stretch>
+                  </pic:blipFill>
+                  <pic:spPr>
+                    <a:xfrm>
+                      <a:off x="0" y="0"/>
+                      <a:ext cx="5788140" cy="2840664"/>
+                    </a:xfrm>
+                    <a:prstGeom prst="rect">
+                      <a:avLst/>
+                    </a:prstGeom>
+                  </pic:spPr>
+                </pic:pic>
+              </a:graphicData>
+            </a:graphic>
+          </wp:inline>
+        </w:drawing>
+      </w:r>
+      <w:r>
+        <w:rPr>
+          <w:lang w:val="en-US"/>
+        </w:rPr>
+        <w:br/>
+      </w:r>
+      <w:r>
+        <w:rPr>
+          <w:lang w:val="en-US"/>
+        </w:rPr>
+        <w:lastRenderedPageBreak/>
+        <w:t xml:space="preserve">At the end I will show you </w:t>
+      </w:r>
+      <w:proofErr w:type="spellStart"/>
+      <w:r>
+        <w:rPr>
+          <w:lang w:val="en-US"/>
+        </w:rPr>
+        <w:t>MYDocuemnts</w:t>
+      </w:r>
+      <w:proofErr w:type="spellEnd"/>
+      <w:r>
+        <w:rPr>
+          <w:lang w:val="en-US"/>
+        </w:rPr>
+        <w:t xml:space="preserve"> view where a user can focus only on his own documents without having to access other </w:t>
+      </w:r>
+      <w:proofErr w:type="spellStart"/>
+      <w:r>
+        <w:rPr>
+          <w:lang w:val="en-US"/>
+        </w:rPr>
+        <w:t>peoples</w:t>
+      </w:r>
+      <w:proofErr w:type="spellEnd"/>
+      <w:r>
+        <w:rPr>
+          <w:lang w:val="en-US"/>
+        </w:rPr>
+        <w:t xml:space="preserve"> documents. </w:t>
+      </w:r>
+      <w:r>
+        <w:rPr>
+          <w:lang w:val="en-US"/>
+        </w:rPr>
+        <w:t xml:space="preserve">User can Edit, see More details and Delete. </w:t>
+      </w:r>
+      <w:r>
+        <w:rPr>
+          <w:lang w:val="en-US"/>
+        </w:rPr>
+        <w:br/>
+      </w:r>
+      <w:r>
+        <w:rPr>
+          <w:lang w:val="en-US"/>
+        </w:rPr>
+        <w:br/>
+      </w:r>
+      <w:r>
+        <w:rPr>
+          <w:lang w:val="en-US"/>
+        </w:rPr>
+        <w:drawing>
+          <wp:inline distT="0" distB="0" distL="0" distR="0" wp14:anchorId="551D03E0" wp14:editId="2A17C6D3">
+            <wp:extent cx="5760720" cy="1172845"/>
+            <wp:effectExtent l="0" t="0" r="0" b="8255"/>
+            <wp:docPr id="31" name="Picture 31"/>
+            <wp:cNvGraphicFramePr>
+              <a:graphicFrameLocks xmlns:a="http://schemas.openxmlformats.org/drawingml/2006/main" noChangeAspect="1"/>
+            </wp:cNvGraphicFramePr>
+            <a:graphic xmlns:a="http://schemas.openxmlformats.org/drawingml/2006/main">
+              <a:graphicData uri="http://schemas.openxmlformats.org/drawingml/2006/picture">
+                <pic:pic xmlns:pic="http://schemas.openxmlformats.org/drawingml/2006/picture">
+                  <pic:nvPicPr>
+                    <pic:cNvPr id="1" name=""/>
+                    <pic:cNvPicPr/>
+                  </pic:nvPicPr>
+                  <pic:blipFill>
+                    <a:blip r:embed="rId37"/>
+                    <a:stretch>
+                      <a:fillRect/>
+                    </a:stretch>
+                  </pic:blipFill>
+                  <pic:spPr>
+                    <a:xfrm>
+                      <a:off x="0" y="0"/>
+                      <a:ext cx="5760720" cy="1172845"/>
+                    </a:xfrm>
+                    <a:prstGeom prst="rect">
+                      <a:avLst/>
+                    </a:prstGeom>
+                  </pic:spPr>
+                </pic:pic>
+              </a:graphicData>
+            </a:graphic>
+          </wp:inline>
+        </w:drawing>
+      </w:r>
+      <w:r>
+        <w:rPr>
+          <w:lang w:val="en-US"/>
+        </w:rPr>
+        <w:br/>
+      </w:r>
     </w:p>
     <w:sectPr>
       <w:pgSz w:w="11906" w:h="16838"/>
@@ -1406,7 +3854,7 @@
 </file>
 
 <file path=word/numbering.xml><?xml version="1.0" encoding="utf-8"?>
-<w:numbering xmlns:wpc="http://schemas.microsoft.com/office/word/2010/wordprocessingCanvas" xmlns:cx="http://schemas.microsoft.com/office/drawing/2014/chartex" xmlns:cx1="http://schemas.microsoft.com/office/drawing/2015/9/8/chartex" xmlns:cx2="http://schemas.microsoft.com/office/drawing/2015/10/21/chartex" xmlns:cx3="http://schemas.microsoft.com/office/drawing/2016/5/9/chartex" xmlns:cx4="http://schemas.microsoft.com/office/drawing/2016/5/10/chartex" xmlns:cx5="http://schemas.microsoft.com/office/drawing/2016/5/11/chartex" xmlns:cx6="http://schemas.microsoft.com/office/drawing/2016/5/12/chartex" xmlns:cx7="http://schemas.microsoft.com/office/drawing/2016/5/13/chartex" xmlns:cx8="http://schemas.microsoft.com/office/drawing/2016/5/14/chartex" xmlns:mc="http://schemas.openxmlformats.org/markup-compatibility/2006" xmlns:aink="http://schemas.microsoft.com/office/drawing/2016/ink" xmlns:am3d="http://schemas.microsoft.com/office/drawing/2017/model3d" xmlns:o="urn:schemas-microsoft-com:office:office" xmlns:oel="http://schemas.microsoft.com/office/2019/extlst" xmlns:r="http://schemas.openxmlformats.org/officeDocument/2006/relationships" xmlns:m="http://schemas.openxmlformats.org/officeDocument/2006/math" xmlns:v="urn:schemas-microsoft-com:vml" xmlns:wp14="http://schemas.microsoft.com/office/word/2010/wordprocessingDrawing" xmlns:wp="http://schemas.openxmlformats.org/drawingml/2006/wordprocessingDrawing" xmlns:w10="urn:schemas-microsoft-com:office:word" xmlns:w="http://schemas.openxmlformats.org/wordprocessingml/2006/main" xmlns:w14="http://schemas.microsoft.com/office/word/2010/wordml" xmlns:w15="http://schemas.microsoft.com/office/word/2012/wordml" xmlns:w16cex="http://schemas.microsoft.com/office/word/2018/wordml/cex" xmlns:w16cid="http://schemas.microsoft.com/office/word/2016/wordml/cid" xmlns:w16="http://schemas.microsoft.com/office/word/2018/wordml" xmlns:w16du="http://schemas.microsoft.com/office/word/2023/wordml/word16du" xmlns:w16sdtdh="http://schemas.microsoft.com/office/word/2020/wordml/sdtdatahash" xmlns:w16sdtfl="http://schemas.microsoft.com/office/word/2024/wordml/sdtformatlock" xmlns:w16se="http://schemas.microsoft.com/office/word/2015/wordml/symex" xmlns:wpg="http://schemas.microsoft.com/office/word/2010/wordprocessingGroup" xmlns:wpi="http://schemas.microsoft.com/office/word/2010/wordprocessingInk" xmlns:wne="http://schemas.microsoft.com/office/word/2006/wordml" xmlns:wps="http://schemas.microsoft.com/office/word/2010/wordprocessingShape" mc:Ignorable="w14 w15 w16se w16cid w16 w16cex w16sdtdh w16sdtfl w16du wp14">
+<w:numbering xmlns:wpc="http://schemas.microsoft.com/office/word/2010/wordprocessingCanvas" xmlns:cx="http://schemas.microsoft.com/office/drawing/2014/chartex" xmlns:cx1="http://schemas.microsoft.com/office/drawing/2015/9/8/chartex" xmlns:cx2="http://schemas.microsoft.com/office/drawing/2015/10/21/chartex" xmlns:cx3="http://schemas.microsoft.com/office/drawing/2016/5/9/chartex" xmlns:cx4="http://schemas.microsoft.com/office/drawing/2016/5/10/chartex" xmlns:cx5="http://schemas.microsoft.com/office/drawing/2016/5/11/chartex" xmlns:cx6="http://schemas.microsoft.com/office/drawing/2016/5/12/chartex" xmlns:cx7="http://schemas.microsoft.com/office/drawing/2016/5/13/chartex" xmlns:cx8="http://schemas.microsoft.com/office/drawing/2016/5/14/chartex" xmlns:mc="http://schemas.openxmlformats.org/markup-compatibility/2006" xmlns:aink="http://schemas.microsoft.com/office/drawing/2016/ink" xmlns:am3d="http://schemas.microsoft.com/office/drawing/2017/model3d" xmlns:o="urn:schemas-microsoft-com:office:office" xmlns:oel="http://schemas.microsoft.com/office/2019/extlst" xmlns:r="http://schemas.openxmlformats.org/officeDocument/2006/relationships" xmlns:m="http://schemas.openxmlformats.org/officeDocument/2006/math" xmlns:v="urn:schemas-microsoft-com:vml" xmlns:wp14="http://schemas.microsoft.com/office/word/2010/wordprocessingDrawing" xmlns:wp="http://schemas.openxmlformats.org/drawingml/2006/wordprocessingDrawing" xmlns:w10="urn:schemas-microsoft-com:office:word" xmlns:w="http://schemas.openxmlformats.org/wordprocessingml/2006/main" xmlns:w14="http://schemas.microsoft.com/office/word/2010/wordml" xmlns:w15="http://schemas.microsoft.com/office/word/2012/wordml" xmlns:w16cex="http://schemas.microsoft.com/office/word/2018/wordml/cex" xmlns:w16cid="http://schemas.microsoft.com/office/word/2016/wordml/cid" xmlns:w16="http://schemas.microsoft.com/office/word/2018/wordml" xmlns:w16sdtdh="http://schemas.microsoft.com/office/word/2020/wordml/sdtdatahash" xmlns:w16se="http://schemas.microsoft.com/office/word/2015/wordml/symex" xmlns:wpg="http://schemas.microsoft.com/office/word/2010/wordprocessingGroup" xmlns:wpi="http://schemas.microsoft.com/office/word/2010/wordprocessingInk" xmlns:wne="http://schemas.microsoft.com/office/word/2006/wordml" xmlns:wps="http://schemas.microsoft.com/office/word/2010/wordprocessingShape" mc:Ignorable="w14 w15 w16se w16cid w16 w16cex w16sdtdh wp14">
   <w:abstractNum w:abstractNumId="0" w15:restartNumberingAfterBreak="0">
     <w:nsid w:val="1F2744E4"/>
     <w:multiLevelType w:val="hybridMultilevel"/>
@@ -1920,7 +4368,7 @@
 </file>
 
 <file path=word/styles.xml><?xml version="1.0" encoding="utf-8"?>
-<w:styles xmlns:mc="http://schemas.openxmlformats.org/markup-compatibility/2006" xmlns:r="http://schemas.openxmlformats.org/officeDocument/2006/relationships" xmlns:w="http://schemas.openxmlformats.org/wordprocessingml/2006/main" xmlns:w14="http://schemas.microsoft.com/office/word/2010/wordml" xmlns:w15="http://schemas.microsoft.com/office/word/2012/wordml" xmlns:w16cex="http://schemas.microsoft.com/office/word/2018/wordml/cex" xmlns:w16cid="http://schemas.microsoft.com/office/word/2016/wordml/cid" xmlns:w16="http://schemas.microsoft.com/office/word/2018/wordml" xmlns:w16du="http://schemas.microsoft.com/office/word/2023/wordml/word16du" xmlns:w16sdtdh="http://schemas.microsoft.com/office/word/2020/wordml/sdtdatahash" xmlns:w16sdtfl="http://schemas.microsoft.com/office/word/2024/wordml/sdtformatlock" xmlns:w16se="http://schemas.microsoft.com/office/word/2015/wordml/symex" mc:Ignorable="w14 w15 w16se w16cid w16 w16cex w16sdtdh w16sdtfl w16du">
+<w:styles xmlns:mc="http://schemas.openxmlformats.org/markup-compatibility/2006" xmlns:r="http://schemas.openxmlformats.org/officeDocument/2006/relationships" xmlns:w="http://schemas.openxmlformats.org/wordprocessingml/2006/main" xmlns:w14="http://schemas.microsoft.com/office/word/2010/wordml" xmlns:w15="http://schemas.microsoft.com/office/word/2012/wordml" xmlns:w16cex="http://schemas.microsoft.com/office/word/2018/wordml/cex" xmlns:w16cid="http://schemas.microsoft.com/office/word/2016/wordml/cid" xmlns:w16="http://schemas.microsoft.com/office/word/2018/wordml" xmlns:w16sdtdh="http://schemas.microsoft.com/office/word/2020/wordml/sdtdatahash" xmlns:w16se="http://schemas.microsoft.com/office/word/2015/wordml/symex" mc:Ignorable="w14 w15 w16se w16cid w16 w16cex w16sdtdh">
   <w:docDefaults>
     <w:rPrDefault>
       <w:rPr>
@@ -2522,6 +4970,7 @@
   <w:style w:type="character" w:default="1" w:styleId="DefaultParagraphFont">
     <w:name w:val="Default Paragraph Font"/>
     <w:uiPriority w:val="1"/>
+    <w:semiHidden/>
     <w:unhideWhenUsed/>
   </w:style>
   <w:style w:type="table" w:default="1" w:styleId="TableNormal">

</xml_diff>

<commit_message>
Minor bug fixes on MyDocuments view
</commit_message>
<xml_diff>
--- a/Clerk System/ClercSystem/ClercSystem/README.docx
+++ b/Clerk System/ClercSystem/ClercSystem/README.docx
@@ -190,7 +190,6 @@
         </w:numPr>
         <w:ind w:left="0"/>
       </w:pPr>
-      <w:proofErr w:type="gramStart"/>
       <w:r>
         <w:rPr>
           <w:b/>
@@ -199,7 +198,6 @@
         </w:rPr>
         <w:t>Data :</w:t>
       </w:r>
-      <w:proofErr w:type="gramEnd"/>
       <w:r>
         <w:rPr>
           <w:lang w:val="en-US"/>
@@ -855,24 +853,14 @@
         </w:rPr>
         <w:t xml:space="preserve">When starting the project Departments, Categories, roles, and the basic admin user tables should be populated automatically via the </w:t>
       </w:r>
-      <w:proofErr w:type="gramStart"/>
-      <w:r>
-        <w:rPr>
-          <w:b/>
-          <w:bCs/>
-          <w:lang w:val="en-US"/>
-        </w:rPr>
-        <w:t>ClercSystem.Data</w:t>
-      </w:r>
-      <w:r>
-        <w:rPr>
-          <w:b/>
-          <w:bCs/>
-          <w:lang w:val="en-US"/>
-        </w:rPr>
-        <w:t>.Seeder</w:t>
-      </w:r>
-      <w:proofErr w:type="gramEnd"/>
+      <w:r>
+        <w:rPr>
+          <w:b/>
+          <w:bCs/>
+          <w:lang w:val="en-US"/>
+        </w:rPr>
+        <w:t>ClercSystem.Data.Seeder</w:t>
+      </w:r>
       <w:r>
         <w:rPr>
           <w:lang w:val="en-US"/>
@@ -965,6 +953,7 @@
       </w:r>
       <w:r>
         <w:rPr>
+          <w:noProof/>
           <w:lang w:val="en-US"/>
         </w:rPr>
         <w:drawing>
@@ -1026,36 +1015,23 @@
         <w:rPr>
           <w:lang w:val="en-US"/>
         </w:rPr>
-        <w:t xml:space="preserve">built in template(bootstrap). Built in Admin user is not a “GOD ADMIN”, and cannot change anything preset in his settings but can apply settings for other users – IsManager, Department_ID etc… You can press on the buttons but different denial </w:t>
-      </w:r>
-      <w:proofErr w:type="gramStart"/>
-      <w:r>
-        <w:rPr>
-          <w:lang w:val="en-US"/>
-        </w:rPr>
-        <w:t>pop</w:t>
-      </w:r>
-      <w:proofErr w:type="gramEnd"/>
-      <w:r>
-        <w:rPr>
-          <w:lang w:val="en-US"/>
-        </w:rPr>
-        <w:t xml:space="preserve"> up messages will appear showing the exact problem. Eample: </w:t>
-      </w:r>
-      <w:r>
-        <w:rPr>
-          <w:lang w:val="en-US"/>
-        </w:rPr>
-        <w:br/>
-      </w:r>
-      <w:r>
-        <w:rPr>
-          <w:lang w:val="en-US"/>
-        </w:rPr>
-        <w:br/>
-      </w:r>
-      <w:r>
-        <w:rPr>
+        <w:t xml:space="preserve">built in template(bootstrap). Built in Admin user is not a “GOD ADMIN”, and cannot change anything preset in his settings but can apply settings for other users – IsManager, Department_ID etc… You can press on the buttons but different denial pop up messages will appear showing the exact problem. Eample: </w:t>
+      </w:r>
+      <w:r>
+        <w:rPr>
+          <w:lang w:val="en-US"/>
+        </w:rPr>
+        <w:br/>
+      </w:r>
+      <w:r>
+        <w:rPr>
+          <w:lang w:val="en-US"/>
+        </w:rPr>
+        <w:br/>
+      </w:r>
+      <w:r>
+        <w:rPr>
+          <w:noProof/>
           <w:lang w:val="en-US"/>
         </w:rPr>
         <w:drawing>
@@ -1130,6 +1106,7 @@
       </w:r>
       <w:r>
         <w:rPr>
+          <w:noProof/>
           <w:lang w:val="en-US"/>
         </w:rPr>
         <w:lastRenderedPageBreak/>
@@ -1195,6 +1172,7 @@
       </w:r>
       <w:r>
         <w:rPr>
+          <w:noProof/>
           <w:lang w:val="en-US"/>
         </w:rPr>
         <w:drawing>
@@ -1241,6 +1219,7 @@
       </w:r>
       <w:r>
         <w:rPr>
+          <w:noProof/>
           <w:lang w:val="en-US"/>
         </w:rPr>
         <w:drawing>
@@ -1303,6 +1282,7 @@
       </w:r>
       <w:r>
         <w:rPr>
+          <w:noProof/>
           <w:lang w:val="en-US"/>
         </w:rPr>
         <w:drawing>
@@ -1361,6 +1341,7 @@
       </w:r>
       <w:r>
         <w:rPr>
+          <w:noProof/>
           <w:lang w:val="en-US"/>
         </w:rPr>
         <w:drawing>
@@ -1406,20 +1387,12 @@
           <w:lang w:val="en-US"/>
         </w:rPr>
       </w:pPr>
-      <w:proofErr w:type="gramStart"/>
       <w:r>
         <w:rPr>
           <w:lang w:val="en-US"/>
         </w:rPr>
         <w:lastRenderedPageBreak/>
-        <w:t>Lets</w:t>
-      </w:r>
-      <w:proofErr w:type="gramEnd"/>
-      <w:r>
-        <w:rPr>
-          <w:lang w:val="en-US"/>
-        </w:rPr>
-        <w:t xml:space="preserve"> add </w:t>
+        <w:t xml:space="preserve">Lets add </w:t>
       </w:r>
       <w:r>
         <w:rPr>
@@ -1431,16 +1404,41 @@
         <w:rPr>
           <w:lang w:val="en-US"/>
         </w:rPr>
-        <w:t xml:space="preserve">the admin Manege Document Interface. </w:t>
-      </w:r>
-      <w:r>
-        <w:rPr>
-          <w:lang w:val="en-US"/>
-        </w:rPr>
-        <w:br/>
-      </w:r>
-      <w:r>
-        <w:rPr>
+        <w:t>the admin Man</w:t>
+      </w:r>
+      <w:r>
+        <w:rPr>
+          <w:lang w:val="en-US"/>
+        </w:rPr>
+        <w:t>a</w:t>
+      </w:r>
+      <w:r>
+        <w:rPr>
+          <w:lang w:val="en-US"/>
+        </w:rPr>
+        <w:t>ge Document</w:t>
+      </w:r>
+      <w:r>
+        <w:rPr>
+          <w:lang w:val="en-US"/>
+        </w:rPr>
+        <w:t>s</w:t>
+      </w:r>
+      <w:r>
+        <w:rPr>
+          <w:lang w:val="en-US"/>
+        </w:rPr>
+        <w:t xml:space="preserve"> Interface. </w:t>
+      </w:r>
+      <w:r>
+        <w:rPr>
+          <w:lang w:val="en-US"/>
+        </w:rPr>
+        <w:br/>
+      </w:r>
+      <w:r>
+        <w:rPr>
+          <w:noProof/>
           <w:lang w:val="en-US"/>
         </w:rPr>
         <w:drawing>
@@ -1519,6 +1517,7 @@
       </w:pPr>
       <w:r>
         <w:rPr>
+          <w:noProof/>
           <w:lang w:val="en-US"/>
         </w:rPr>
         <w:drawing>
@@ -1625,6 +1624,7 @@
       </w:r>
       <w:r>
         <w:rPr>
+          <w:noProof/>
           <w:lang w:val="en-US"/>
         </w:rPr>
         <w:drawing>
@@ -1672,6 +1672,7 @@
       </w:pPr>
       <w:r>
         <w:rPr>
+          <w:noProof/>
           <w:lang w:val="en-US"/>
         </w:rPr>
         <w:drawing>
@@ -1762,56 +1763,29 @@
         <w:rPr>
           <w:lang w:val="en-US"/>
         </w:rPr>
-        <w:t xml:space="preserve"> Still The admin user cannot delete other </w:t>
-      </w:r>
-      <w:proofErr w:type="gramStart"/>
-      <w:r>
-        <w:rPr>
-          <w:lang w:val="en-US"/>
-        </w:rPr>
-        <w:t>peoples</w:t>
-      </w:r>
-      <w:proofErr w:type="gramEnd"/>
-      <w:r>
-        <w:rPr>
-          <w:lang w:val="en-US"/>
-        </w:rPr>
-        <w:t xml:space="preserve"> documents, but only his own. </w:t>
-      </w:r>
-      <w:r>
-        <w:rPr>
-          <w:lang w:val="en-US"/>
-        </w:rPr>
-        <w:t xml:space="preserve">You see the </w:t>
-      </w:r>
-      <w:proofErr w:type="gramStart"/>
-      <w:r>
-        <w:rPr>
-          <w:lang w:val="en-US"/>
-        </w:rPr>
-        <w:t>pop up</w:t>
-      </w:r>
-      <w:proofErr w:type="gramEnd"/>
-      <w:r>
-        <w:rPr>
-          <w:lang w:val="en-US"/>
-        </w:rPr>
-        <w:t xml:space="preserve"> message on the picture below.</w:t>
-      </w:r>
-      <w:r>
-        <w:rPr>
-          <w:lang w:val="en-US"/>
-        </w:rPr>
-        <w:br/>
-      </w:r>
-      <w:r>
-        <w:rPr>
-          <w:lang w:val="en-US"/>
-        </w:rPr>
-        <w:br/>
-      </w:r>
-      <w:r>
-        <w:rPr>
+        <w:t xml:space="preserve"> Still The admin user cannot delete other peoples documents, but only his own. </w:t>
+      </w:r>
+      <w:r>
+        <w:rPr>
+          <w:lang w:val="en-US"/>
+        </w:rPr>
+        <w:t>You see the pop up message on the picture below.</w:t>
+      </w:r>
+      <w:r>
+        <w:rPr>
+          <w:lang w:val="en-US"/>
+        </w:rPr>
+        <w:br/>
+      </w:r>
+      <w:r>
+        <w:rPr>
+          <w:lang w:val="en-US"/>
+        </w:rPr>
+        <w:br/>
+      </w:r>
+      <w:r>
+        <w:rPr>
+          <w:noProof/>
           <w:lang w:val="en-US"/>
         </w:rPr>
         <w:drawing>
@@ -1868,36 +1842,23 @@
         <w:rPr>
           <w:lang w:val="en-US"/>
         </w:rPr>
-        <w:t xml:space="preserve">Now </w:t>
-      </w:r>
-      <w:proofErr w:type="gramStart"/>
-      <w:r>
-        <w:rPr>
-          <w:lang w:val="en-US"/>
-        </w:rPr>
-        <w:t>lets</w:t>
-      </w:r>
-      <w:proofErr w:type="gramEnd"/>
-      <w:r>
-        <w:rPr>
-          <w:lang w:val="en-US"/>
-        </w:rPr>
-        <w:t xml:space="preserve"> see what happens when an ordinary user tries to delete his document. You see a document deleted successfully message and the document disappears from screen. </w:t>
-      </w:r>
-      <w:r>
-        <w:rPr>
-          <w:lang w:val="en-US"/>
-        </w:rPr>
-        <w:br/>
-      </w:r>
-      <w:r>
-        <w:rPr>
-          <w:lang w:val="en-US"/>
-        </w:rPr>
-        <w:br/>
-      </w:r>
-      <w:r>
-        <w:rPr>
+        <w:t xml:space="preserve">Now lets see what happens when an ordinary user tries to delete his document. You see a document deleted successfully message and the document disappears from screen. </w:t>
+      </w:r>
+      <w:r>
+        <w:rPr>
+          <w:lang w:val="en-US"/>
+        </w:rPr>
+        <w:br/>
+      </w:r>
+      <w:r>
+        <w:rPr>
+          <w:lang w:val="en-US"/>
+        </w:rPr>
+        <w:br/>
+      </w:r>
+      <w:r>
+        <w:rPr>
+          <w:noProof/>
           <w:lang w:val="en-US"/>
         </w:rPr>
         <w:drawing>
@@ -1942,19 +1903,11 @@
         </w:rPr>
         <w:br/>
       </w:r>
-      <w:proofErr w:type="gramStart"/>
-      <w:r>
-        <w:rPr>
-          <w:lang w:val="en-US"/>
-        </w:rPr>
-        <w:t>Lets</w:t>
-      </w:r>
-      <w:proofErr w:type="gramEnd"/>
-      <w:r>
-        <w:rPr>
-          <w:lang w:val="en-US"/>
-        </w:rPr>
-        <w:t xml:space="preserve"> change users and log in with our </w:t>
+      <w:r>
+        <w:rPr>
+          <w:lang w:val="en-US"/>
+        </w:rPr>
+        <w:t xml:space="preserve">Lets change users and log in with our </w:t>
       </w:r>
       <w:r>
         <w:rPr>
@@ -1974,27 +1927,13 @@
         <w:rPr>
           <w:lang w:val="en-US"/>
         </w:rPr>
-        <w:t xml:space="preserve">Manage </w:t>
-      </w:r>
-      <w:proofErr w:type="gramStart"/>
-      <w:r>
-        <w:rPr>
-          <w:lang w:val="en-US"/>
-        </w:rPr>
-        <w:t xml:space="preserve">Documents </w:t>
-      </w:r>
-      <w:r>
-        <w:rPr>
-          <w:lang w:val="en-US"/>
-        </w:rPr>
-        <w:t xml:space="preserve"> dropdown</w:t>
-      </w:r>
-      <w:proofErr w:type="gramEnd"/>
-      <w:r>
-        <w:rPr>
-          <w:lang w:val="en-US"/>
-        </w:rPr>
-        <w:t xml:space="preserve"> menu. </w:t>
+        <w:t xml:space="preserve">Manage Documents </w:t>
+      </w:r>
+      <w:r>
+        <w:rPr>
+          <w:lang w:val="en-US"/>
+        </w:rPr>
+        <w:t xml:space="preserve"> dropdown menu. </w:t>
       </w:r>
       <w:r>
         <w:rPr>
@@ -2014,30 +1953,17 @@
         <w:rPr>
           <w:lang w:val="en-US"/>
         </w:rPr>
-        <w:t xml:space="preserve"> or hidden and a user with an Admin Role can see that. You can see that it says undelete at the bottom, which means that it can be restored. </w:t>
-      </w:r>
-      <w:proofErr w:type="gramStart"/>
-      <w:r>
-        <w:rPr>
-          <w:lang w:val="en-US"/>
-        </w:rPr>
-        <w:t>Lets</w:t>
-      </w:r>
-      <w:proofErr w:type="gramEnd"/>
-      <w:r>
-        <w:rPr>
-          <w:lang w:val="en-US"/>
-        </w:rPr>
-        <w:t xml:space="preserve"> restore it. </w:t>
-      </w:r>
-      <w:r>
-        <w:rPr>
-          <w:lang w:val="en-US"/>
-        </w:rPr>
-        <w:br/>
-      </w:r>
-      <w:r>
-        <w:rPr>
+        <w:t xml:space="preserve"> or hidden and a user with an Admin Role can see that. You can see that it says undelete at the bottom, which means that it can be restored. Lets restore it. </w:t>
+      </w:r>
+      <w:r>
+        <w:rPr>
+          <w:lang w:val="en-US"/>
+        </w:rPr>
+        <w:br/>
+      </w:r>
+      <w:r>
+        <w:rPr>
+          <w:noProof/>
           <w:lang w:val="en-US"/>
         </w:rPr>
         <w:drawing>
@@ -2106,6 +2032,7 @@
       </w:pPr>
       <w:r>
         <w:rPr>
+          <w:noProof/>
           <w:lang w:val="en-US"/>
         </w:rPr>
         <w:drawing>
@@ -2174,21 +2101,7 @@
         <w:rPr>
           <w:lang w:val="en-US"/>
         </w:rPr>
-        <w:t xml:space="preserve">And the user can again edit and delete </w:t>
-      </w:r>
-      <w:proofErr w:type="gramStart"/>
-      <w:r>
-        <w:rPr>
-          <w:lang w:val="en-US"/>
-        </w:rPr>
-        <w:t>it</w:t>
-      </w:r>
-      <w:proofErr w:type="gramEnd"/>
-      <w:r>
-        <w:rPr>
-          <w:lang w:val="en-US"/>
-        </w:rPr>
-        <w:t xml:space="preserve"> or can he? User with an </w:t>
+        <w:t xml:space="preserve">And the user can again edit and delete it or can he? User with an </w:t>
       </w:r>
       <w:r>
         <w:rPr>
@@ -2217,23 +2130,13 @@
         <w:br/>
         <w:t xml:space="preserve"> If we login with the </w:t>
       </w:r>
-      <w:proofErr w:type="gramStart"/>
-      <w:r>
-        <w:rPr>
-          <w:b/>
-          <w:bCs/>
-          <w:lang w:val="en-US"/>
-        </w:rPr>
-        <w:t>Admin</w:t>
-      </w:r>
-      <w:proofErr w:type="gramEnd"/>
-      <w:r>
-        <w:rPr>
-          <w:b/>
-          <w:bCs/>
-          <w:lang w:val="en-US"/>
-        </w:rPr>
-        <w:t xml:space="preserve"> role</w:t>
+      <w:r>
+        <w:rPr>
+          <w:b/>
+          <w:bCs/>
+          <w:lang w:val="en-US"/>
+        </w:rPr>
+        <w:t>Admin role</w:t>
       </w:r>
       <w:r>
         <w:rPr>
@@ -2249,6 +2152,7 @@
       </w:r>
       <w:r>
         <w:rPr>
+          <w:noProof/>
           <w:lang w:val="en-US"/>
         </w:rPr>
         <w:drawing>
@@ -2342,6 +2246,7 @@
       </w:r>
       <w:r>
         <w:rPr>
+          <w:noProof/>
           <w:lang w:val="en-US"/>
         </w:rPr>
         <w:drawing>
@@ -2389,6 +2294,7 @@
       </w:pPr>
       <w:r>
         <w:rPr>
+          <w:noProof/>
           <w:lang w:val="en-US"/>
         </w:rPr>
         <w:drawing>
@@ -2440,23 +2346,13 @@
         </w:rPr>
         <w:t xml:space="preserve">This is only possible if the </w:t>
       </w:r>
-      <w:proofErr w:type="gramStart"/>
-      <w:r>
-        <w:rPr>
-          <w:b/>
-          <w:bCs/>
-          <w:lang w:val="en-US"/>
-        </w:rPr>
-        <w:t>Admin</w:t>
-      </w:r>
-      <w:proofErr w:type="gramEnd"/>
-      <w:r>
-        <w:rPr>
-          <w:b/>
-          <w:bCs/>
-          <w:lang w:val="en-US"/>
-        </w:rPr>
-        <w:t xml:space="preserve"> role</w:t>
+      <w:r>
+        <w:rPr>
+          <w:b/>
+          <w:bCs/>
+          <w:lang w:val="en-US"/>
+        </w:rPr>
+        <w:t>Admin role</w:t>
       </w:r>
       <w:r>
         <w:rPr>
@@ -2490,21 +2386,7 @@
           <w:lang w:val="en-US"/>
         </w:rPr>
         <w:br/>
-        <w:t xml:space="preserve">Now lets create another </w:t>
-      </w:r>
-      <w:proofErr w:type="gramStart"/>
-      <w:r>
-        <w:rPr>
-          <w:lang w:val="en-US"/>
-        </w:rPr>
-        <w:t>manager,  demote</w:t>
-      </w:r>
-      <w:proofErr w:type="gramEnd"/>
-      <w:r>
-        <w:rPr>
-          <w:lang w:val="en-US"/>
-        </w:rPr>
-        <w:t xml:space="preserve"> the  </w:t>
+        <w:t xml:space="preserve">Now lets create another manager,  demote the  </w:t>
       </w:r>
       <w:hyperlink r:id="rId26" w:history="1">
         <w:r>
@@ -2577,13 +2459,7 @@
         <w:rPr>
           <w:lang w:val="en-US"/>
         </w:rPr>
-        <w:t xml:space="preserve">That can be done only via the original user </w:t>
-      </w:r>
-      <w:r>
-        <w:rPr>
-          <w:lang w:val="en-US"/>
-        </w:rPr>
-        <w:t xml:space="preserve"> </w:t>
+        <w:t xml:space="preserve">That can be done only via the original user  </w:t>
       </w:r>
       <w:hyperlink r:id="rId28" w:history="1">
         <w:r>
@@ -2609,6 +2485,7 @@
       </w:pPr>
       <w:r>
         <w:rPr>
+          <w:noProof/>
           <w:lang w:val="en-US"/>
         </w:rPr>
         <w:drawing>
@@ -2732,6 +2609,7 @@
       </w:r>
       <w:r>
         <w:rPr>
+          <w:noProof/>
           <w:lang w:val="en-US"/>
         </w:rPr>
         <w:drawing>
@@ -2792,21 +2670,7 @@
         <w:rPr>
           <w:lang w:val="en-US"/>
         </w:rPr>
-        <w:t xml:space="preserve">Now </w:t>
-      </w:r>
-      <w:proofErr w:type="gramStart"/>
-      <w:r>
-        <w:rPr>
-          <w:lang w:val="en-US"/>
-        </w:rPr>
-        <w:t>lets</w:t>
-      </w:r>
-      <w:proofErr w:type="gramEnd"/>
-      <w:r>
-        <w:rPr>
-          <w:lang w:val="en-US"/>
-        </w:rPr>
-        <w:t xml:space="preserve"> log with the original </w:t>
+        <w:t xml:space="preserve">Now lets log with the original </w:t>
       </w:r>
       <w:hyperlink r:id="rId33" w:history="1">
         <w:r>
@@ -2837,6 +2701,7 @@
       </w:r>
       <w:r>
         <w:rPr>
+          <w:noProof/>
           <w:lang w:val="en-US"/>
         </w:rPr>
         <w:drawing>
@@ -2886,21 +2751,7 @@
           <w:lang w:val="en-US"/>
         </w:rPr>
         <w:br/>
-        <w:t xml:space="preserve">When we click on the edit document </w:t>
-      </w:r>
-      <w:proofErr w:type="gramStart"/>
-      <w:r>
-        <w:rPr>
-          <w:lang w:val="en-US"/>
-        </w:rPr>
-        <w:t>view</w:t>
-      </w:r>
-      <w:proofErr w:type="gramEnd"/>
-      <w:r>
-        <w:rPr>
-          <w:lang w:val="en-US"/>
-        </w:rPr>
-        <w:t xml:space="preserve"> we can see that this option is not available anymore</w:t>
+        <w:t>When we click on the edit document view we can see that this option is not available anymore</w:t>
       </w:r>
       <w:r>
         <w:rPr>
@@ -2944,21 +2795,7 @@
         <w:rPr>
           <w:lang w:val="en-US"/>
         </w:rPr>
-        <w:t xml:space="preserve">Finally </w:t>
-      </w:r>
-      <w:proofErr w:type="gramStart"/>
-      <w:r>
-        <w:rPr>
-          <w:lang w:val="en-US"/>
-        </w:rPr>
-        <w:t>lets</w:t>
-      </w:r>
-      <w:proofErr w:type="gramEnd"/>
-      <w:r>
-        <w:rPr>
-          <w:lang w:val="en-US"/>
-        </w:rPr>
-        <w:t xml:space="preserve"> check logs for documents via the</w:t>
+        <w:t>Finally lets check logs for documents via the</w:t>
       </w:r>
       <w:r>
         <w:rPr>
@@ -3022,6 +2859,7 @@
       </w:r>
       <w:r>
         <w:rPr>
+          <w:noProof/>
           <w:lang w:val="en-US"/>
         </w:rPr>
         <w:drawing>
@@ -3088,23 +2926,13 @@
         </w:rPr>
         <w:t xml:space="preserve">is is a view available only for the </w:t>
       </w:r>
-      <w:proofErr w:type="gramStart"/>
-      <w:r>
-        <w:rPr>
-          <w:b/>
-          <w:bCs/>
-          <w:lang w:val="en-US"/>
-        </w:rPr>
-        <w:t>Admin</w:t>
-      </w:r>
-      <w:proofErr w:type="gramEnd"/>
-      <w:r>
-        <w:rPr>
-          <w:b/>
-          <w:bCs/>
-          <w:lang w:val="en-US"/>
-        </w:rPr>
-        <w:t xml:space="preserve"> role</w:t>
+      <w:r>
+        <w:rPr>
+          <w:b/>
+          <w:bCs/>
+          <w:lang w:val="en-US"/>
+        </w:rPr>
+        <w:t>Admin role</w:t>
       </w:r>
       <w:r>
         <w:rPr>
@@ -3118,54 +2946,36 @@
           <w:bCs/>
           <w:lang w:val="en-US"/>
         </w:rPr>
+        <w:t xml:space="preserve"> More</w:t>
+      </w:r>
+      <w:r>
+        <w:rPr>
+          <w:lang w:val="en-US"/>
+        </w:rPr>
+        <w:t xml:space="preserve">  </w:t>
+      </w:r>
+      <w:r>
+        <w:rPr>
+          <w:b/>
+          <w:bCs/>
+          <w:lang w:val="en-US"/>
+        </w:rPr>
+        <w:t xml:space="preserve">.js function </w:t>
+      </w:r>
+      <w:r>
+        <w:rPr>
+          <w:lang w:val="en-US"/>
+        </w:rPr>
+        <w:t>dynamically grabs</w:t>
+      </w:r>
+      <w:r>
+        <w:rPr>
+          <w:b/>
+          <w:bCs/>
+          <w:lang w:val="en-US"/>
+        </w:rPr>
         <w:t xml:space="preserve"> </w:t>
       </w:r>
-      <w:proofErr w:type="gramStart"/>
-      <w:r>
-        <w:rPr>
-          <w:b/>
-          <w:bCs/>
-          <w:lang w:val="en-US"/>
-        </w:rPr>
-        <w:t>More</w:t>
-      </w:r>
-      <w:r>
-        <w:rPr>
-          <w:lang w:val="en-US"/>
-        </w:rPr>
-        <w:t xml:space="preserve">  </w:t>
-      </w:r>
-      <w:r>
-        <w:rPr>
-          <w:b/>
-          <w:bCs/>
-          <w:lang w:val="en-US"/>
-        </w:rPr>
-        <w:t>.</w:t>
-      </w:r>
-      <w:proofErr w:type="gramEnd"/>
-      <w:r>
-        <w:rPr>
-          <w:b/>
-          <w:bCs/>
-          <w:lang w:val="en-US"/>
-        </w:rPr>
-        <w:t xml:space="preserve">js function </w:t>
-      </w:r>
-      <w:r>
-        <w:rPr>
-          <w:lang w:val="en-US"/>
-        </w:rPr>
-        <w:t>dynamically grabs</w:t>
-      </w:r>
-      <w:r>
-        <w:rPr>
-          <w:b/>
-          <w:bCs/>
-          <w:lang w:val="en-US"/>
-        </w:rPr>
-        <w:t xml:space="preserve"> </w:t>
-      </w:r>
       <w:r>
         <w:rPr>
           <w:lang w:val="en-US"/>
@@ -3192,6 +3002,7 @@
       </w:r>
       <w:r>
         <w:rPr>
+          <w:noProof/>
           <w:lang w:val="en-US"/>
         </w:rPr>
         <w:drawing>
@@ -3259,56 +3070,29 @@
         <w:rPr>
           <w:lang w:val="en-US"/>
         </w:rPr>
-        <w:t xml:space="preserve">Docuemnts view where a user can focus only on his own documents without having to access other </w:t>
-      </w:r>
-      <w:proofErr w:type="gramStart"/>
-      <w:r>
-        <w:rPr>
-          <w:lang w:val="en-US"/>
-        </w:rPr>
-        <w:t>peoples</w:t>
-      </w:r>
-      <w:proofErr w:type="gramEnd"/>
-      <w:r>
-        <w:rPr>
-          <w:lang w:val="en-US"/>
-        </w:rPr>
-        <w:t xml:space="preserve"> documents. </w:t>
-      </w:r>
-      <w:r>
-        <w:rPr>
-          <w:lang w:val="en-US"/>
-        </w:rPr>
-        <w:t xml:space="preserve">User can Edit, see More </w:t>
-      </w:r>
-      <w:proofErr w:type="gramStart"/>
-      <w:r>
-        <w:rPr>
-          <w:lang w:val="en-US"/>
-        </w:rPr>
-        <w:t>details</w:t>
-      </w:r>
-      <w:proofErr w:type="gramEnd"/>
-      <w:r>
-        <w:rPr>
-          <w:lang w:val="en-US"/>
-        </w:rPr>
-        <w:t xml:space="preserve"> and Delete. </w:t>
-      </w:r>
-      <w:r>
-        <w:rPr>
-          <w:lang w:val="en-US"/>
-        </w:rPr>
-        <w:br/>
-      </w:r>
-      <w:r>
-        <w:rPr>
-          <w:lang w:val="en-US"/>
-        </w:rPr>
-        <w:br/>
-      </w:r>
-      <w:r>
-        <w:rPr>
+        <w:t xml:space="preserve">Docuemnts view where a user can focus only on his own documents without having to access other peoples documents. </w:t>
+      </w:r>
+      <w:r>
+        <w:rPr>
+          <w:lang w:val="en-US"/>
+        </w:rPr>
+        <w:t xml:space="preserve">User can Edit, see More details and Delete. </w:t>
+      </w:r>
+      <w:r>
+        <w:rPr>
+          <w:lang w:val="en-US"/>
+        </w:rPr>
+        <w:br/>
+      </w:r>
+      <w:r>
+        <w:rPr>
+          <w:lang w:val="en-US"/>
+        </w:rPr>
+        <w:br/>
+      </w:r>
+      <w:r>
+        <w:rPr>
+          <w:noProof/>
           <w:lang w:val="en-US"/>
         </w:rPr>
         <w:drawing>
@@ -3373,6 +3157,7 @@
       </w:r>
       <w:r>
         <w:rPr>
+          <w:noProof/>
           <w:lang w:val="en-US"/>
         </w:rPr>
         <w:drawing>

</xml_diff>

<commit_message>
Readme updated with a LINK VIDEO FILE in Google Drive
</commit_message>
<xml_diff>
--- a/Clerk System/ClercSystem/ClercSystem/README.docx
+++ b/Clerk System/ClercSystem/ClercSystem/README.docx
@@ -12,7 +12,63 @@
         <w:rPr>
           <w:u w:val="single"/>
         </w:rPr>
-        <w:t xml:space="preserve">Project is a document logging system </w:t>
+        <w:t xml:space="preserve">Project </w:t>
+      </w:r>
+      <w:proofErr w:type="spellStart"/>
+      <w:r>
+        <w:rPr>
+          <w:u w:val="single"/>
+        </w:rPr>
+        <w:t>is</w:t>
+      </w:r>
+      <w:proofErr w:type="spellEnd"/>
+      <w:r>
+        <w:rPr>
+          <w:u w:val="single"/>
+        </w:rPr>
+        <w:t xml:space="preserve"> a </w:t>
+      </w:r>
+      <w:proofErr w:type="spellStart"/>
+      <w:r>
+        <w:rPr>
+          <w:u w:val="single"/>
+        </w:rPr>
+        <w:t>document</w:t>
+      </w:r>
+      <w:proofErr w:type="spellEnd"/>
+      <w:r>
+        <w:rPr>
+          <w:u w:val="single"/>
+        </w:rPr>
+        <w:t xml:space="preserve"> </w:t>
+      </w:r>
+      <w:proofErr w:type="spellStart"/>
+      <w:r>
+        <w:rPr>
+          <w:u w:val="single"/>
+        </w:rPr>
+        <w:t>logging</w:t>
+      </w:r>
+      <w:proofErr w:type="spellEnd"/>
+      <w:r>
+        <w:rPr>
+          <w:u w:val="single"/>
+        </w:rPr>
+        <w:t xml:space="preserve"> </w:t>
+      </w:r>
+      <w:proofErr w:type="spellStart"/>
+      <w:r>
+        <w:rPr>
+          <w:u w:val="single"/>
+        </w:rPr>
+        <w:t>system</w:t>
+      </w:r>
+      <w:proofErr w:type="spellEnd"/>
+      <w:r>
+        <w:rPr>
+          <w:u w:val="single"/>
+        </w:rPr>
+        <w:t xml:space="preserve"> </w:t>
       </w:r>
       <w:r>
         <w:rPr>
@@ -149,8 +205,21 @@
         </w:rPr>
         <w:t xml:space="preserve"> </w:t>
       </w:r>
-      <w:r>
-        <w:t>Visual Studio 202</w:t>
+      <w:proofErr w:type="spellStart"/>
+      <w:r>
+        <w:t>Visual</w:t>
+      </w:r>
+      <w:proofErr w:type="spellEnd"/>
+      <w:r>
+        <w:t xml:space="preserve"> </w:t>
+      </w:r>
+      <w:proofErr w:type="spellStart"/>
+      <w:r>
+        <w:t>Studio</w:t>
+      </w:r>
+      <w:proofErr w:type="spellEnd"/>
+      <w:r>
+        <w:t xml:space="preserve"> 202</w:t>
       </w:r>
       <w:r>
         <w:rPr>
@@ -167,19 +236,43 @@
         </w:numPr>
         <w:ind w:left="0"/>
       </w:pPr>
-      <w:r>
-        <w:rPr>
-          <w:b/>
-          <w:bCs/>
-          <w:lang w:val="en-US"/>
-        </w:rPr>
-        <w:t>FrontEnd:</w:t>
-      </w:r>
-      <w:r>
-        <w:rPr>
-          <w:lang w:val="en-US"/>
-        </w:rPr>
-        <w:t xml:space="preserve"> Razor Pages, Bootsrap 5, JQUERY/AJAX </w:t>
+      <w:proofErr w:type="spellStart"/>
+      <w:r>
+        <w:rPr>
+          <w:b/>
+          <w:bCs/>
+          <w:lang w:val="en-US"/>
+        </w:rPr>
+        <w:t>FrontEnd</w:t>
+      </w:r>
+      <w:proofErr w:type="spellEnd"/>
+      <w:r>
+        <w:rPr>
+          <w:b/>
+          <w:bCs/>
+          <w:lang w:val="en-US"/>
+        </w:rPr>
+        <w:t>:</w:t>
+      </w:r>
+      <w:r>
+        <w:rPr>
+          <w:lang w:val="en-US"/>
+        </w:rPr>
+        <w:t xml:space="preserve"> Razor Pages, </w:t>
+      </w:r>
+      <w:proofErr w:type="spellStart"/>
+      <w:r>
+        <w:rPr>
+          <w:lang w:val="en-US"/>
+        </w:rPr>
+        <w:t>Bootsrap</w:t>
+      </w:r>
+      <w:proofErr w:type="spellEnd"/>
+      <w:r>
+        <w:rPr>
+          <w:lang w:val="en-US"/>
+        </w:rPr>
+        <w:t xml:space="preserve"> 5, JQUERY/AJAX </w:t>
       </w:r>
     </w:p>
     <w:p>
@@ -190,6 +283,7 @@
         </w:numPr>
         <w:ind w:left="0"/>
       </w:pPr>
+      <w:proofErr w:type="gramStart"/>
       <w:r>
         <w:rPr>
           <w:b/>
@@ -198,15 +292,21 @@
         </w:rPr>
         <w:t>Data :</w:t>
       </w:r>
-      <w:r>
-        <w:rPr>
-          <w:lang w:val="en-US"/>
-        </w:rPr>
-        <w:t xml:space="preserve"> </w:t>
-      </w:r>
-      <w:r>
-        <w:t>SQL Server / LocalDB</w:t>
-      </w:r>
+      <w:proofErr w:type="gramEnd"/>
+      <w:r>
+        <w:rPr>
+          <w:lang w:val="en-US"/>
+        </w:rPr>
+        <w:t xml:space="preserve"> </w:t>
+      </w:r>
+      <w:r>
+        <w:t xml:space="preserve">SQL Server / </w:t>
+      </w:r>
+      <w:proofErr w:type="spellStart"/>
+      <w:r>
+        <w:t>LocalDB</w:t>
+      </w:r>
+      <w:proofErr w:type="spellEnd"/>
       <w:r>
         <w:rPr>
           <w:lang w:val="en-US"/>
@@ -234,7 +334,35 @@
         <w:rPr>
           <w:lang w:val="en-US"/>
         </w:rPr>
-        <w:t xml:space="preserve"> Rpository pattern, Services Pattern, ViewModel pattern</w:t>
+        <w:t xml:space="preserve"> </w:t>
+      </w:r>
+      <w:proofErr w:type="spellStart"/>
+      <w:r>
+        <w:rPr>
+          <w:lang w:val="en-US"/>
+        </w:rPr>
+        <w:t>Rpository</w:t>
+      </w:r>
+      <w:proofErr w:type="spellEnd"/>
+      <w:r>
+        <w:rPr>
+          <w:lang w:val="en-US"/>
+        </w:rPr>
+        <w:t xml:space="preserve"> pattern, Services Pattern, </w:t>
+      </w:r>
+      <w:proofErr w:type="spellStart"/>
+      <w:r>
+        <w:rPr>
+          <w:lang w:val="en-US"/>
+        </w:rPr>
+        <w:t>ViewModel</w:t>
+      </w:r>
+      <w:proofErr w:type="spellEnd"/>
+      <w:r>
+        <w:rPr>
+          <w:lang w:val="en-US"/>
+        </w:rPr>
+        <w:t xml:space="preserve"> pattern</w:t>
       </w:r>
     </w:p>
     <w:p>
@@ -296,12 +424,42 @@
         </w:rPr>
         <w:t xml:space="preserve"> </w:t>
       </w:r>
-      <w:r>
-        <w:rPr>
-          <w:lang w:val="en-US"/>
-        </w:rPr>
-        <w:t>gh repo clone vdjalov/Project-Defence</w:t>
-      </w:r>
+      <w:proofErr w:type="spellStart"/>
+      <w:r>
+        <w:rPr>
+          <w:lang w:val="en-US"/>
+        </w:rPr>
+        <w:t>gh</w:t>
+      </w:r>
+      <w:proofErr w:type="spellEnd"/>
+      <w:r>
+        <w:rPr>
+          <w:lang w:val="en-US"/>
+        </w:rPr>
+        <w:t xml:space="preserve"> repo clone </w:t>
+      </w:r>
+      <w:proofErr w:type="spellStart"/>
+      <w:r>
+        <w:rPr>
+          <w:lang w:val="en-US"/>
+        </w:rPr>
+        <w:t>vdjalov</w:t>
+      </w:r>
+      <w:proofErr w:type="spellEnd"/>
+      <w:r>
+        <w:rPr>
+          <w:lang w:val="en-US"/>
+        </w:rPr>
+        <w:t>/Project-</w:t>
+      </w:r>
+      <w:proofErr w:type="spellStart"/>
+      <w:r>
+        <w:rPr>
+          <w:lang w:val="en-US"/>
+        </w:rPr>
+        <w:t>Defence</w:t>
+      </w:r>
+      <w:proofErr w:type="spellEnd"/>
       <w:r>
         <w:rPr>
           <w:lang w:val="en-US"/>
@@ -324,6 +482,23 @@
         </w:rPr>
         <w:t>:</w:t>
       </w:r>
+      <w:r>
+        <w:rPr>
+          <w:b/>
+          <w:bCs/>
+          <w:lang w:val="en-US"/>
+        </w:rPr>
+        <w:t xml:space="preserve"> </w:t>
+      </w:r>
+      <w:hyperlink r:id="rId6" w:history="1">
+        <w:r>
+          <w:rPr>
+            <w:rStyle w:val="Hyperlink"/>
+            <w:lang w:val="en-US"/>
+          </w:rPr>
+          <w:t>https://drive.google.com/file/d/1rdSJC8iH_RgjkH97oUX8gJdv_VBvUogM/view?usp=sharing</w:t>
+        </w:r>
+      </w:hyperlink>
       <w:r>
         <w:rPr>
           <w:lang w:val="en-US"/>
@@ -386,6 +561,7 @@
         </w:rPr>
         <w:t xml:space="preserve"> </w:t>
       </w:r>
+      <w:proofErr w:type="spellStart"/>
       <w:r>
         <w:rPr>
           <w:b/>
@@ -393,8 +569,65 @@
         </w:rPr>
         <w:t>ClercSystem.Data</w:t>
       </w:r>
-      <w:r>
-        <w:t>: Contains the DbContext and data access configuration.</w:t>
+      <w:proofErr w:type="spellEnd"/>
+      <w:r>
+        <w:t xml:space="preserve">: </w:t>
+      </w:r>
+      <w:proofErr w:type="spellStart"/>
+      <w:r>
+        <w:t>Contains</w:t>
+      </w:r>
+      <w:proofErr w:type="spellEnd"/>
+      <w:r>
+        <w:t xml:space="preserve"> </w:t>
+      </w:r>
+      <w:proofErr w:type="spellStart"/>
+      <w:r>
+        <w:t>the</w:t>
+      </w:r>
+      <w:proofErr w:type="spellEnd"/>
+      <w:r>
+        <w:t xml:space="preserve"> </w:t>
+      </w:r>
+      <w:proofErr w:type="spellStart"/>
+      <w:r>
+        <w:t>DbContext</w:t>
+      </w:r>
+      <w:proofErr w:type="spellEnd"/>
+      <w:r>
+        <w:t xml:space="preserve"> </w:t>
+      </w:r>
+      <w:proofErr w:type="spellStart"/>
+      <w:r>
+        <w:t>and</w:t>
+      </w:r>
+      <w:proofErr w:type="spellEnd"/>
+      <w:r>
+        <w:t xml:space="preserve"> </w:t>
+      </w:r>
+      <w:proofErr w:type="spellStart"/>
+      <w:r>
+        <w:t>data</w:t>
+      </w:r>
+      <w:proofErr w:type="spellEnd"/>
+      <w:r>
+        <w:t xml:space="preserve"> </w:t>
+      </w:r>
+      <w:proofErr w:type="spellStart"/>
+      <w:r>
+        <w:t>access</w:t>
+      </w:r>
+      <w:proofErr w:type="spellEnd"/>
+      <w:r>
+        <w:t xml:space="preserve"> </w:t>
+      </w:r>
+      <w:proofErr w:type="spellStart"/>
+      <w:r>
+        <w:t>configuration</w:t>
+      </w:r>
+      <w:proofErr w:type="spellEnd"/>
+      <w:r>
+        <w:t>.</w:t>
       </w:r>
       <w:r>
         <w:rPr>
@@ -410,6 +643,7 @@
         </w:rPr>
         <w:t xml:space="preserve"> </w:t>
       </w:r>
+      <w:proofErr w:type="spellStart"/>
       <w:r>
         <w:rPr>
           <w:b/>
@@ -417,6 +651,7 @@
         </w:rPr>
         <w:t>ClercSystem.Data.Models</w:t>
       </w:r>
+      <w:proofErr w:type="spellEnd"/>
       <w:r>
         <w:t xml:space="preserve">: </w:t>
       </w:r>
@@ -426,8 +661,61 @@
         </w:rPr>
         <w:t>Contains c</w:t>
       </w:r>
-      <w:r>
-        <w:t>ore domain entities and database schema definitions.</w:t>
+      <w:proofErr w:type="spellStart"/>
+      <w:r>
+        <w:t>ore</w:t>
+      </w:r>
+      <w:proofErr w:type="spellEnd"/>
+      <w:r>
+        <w:t xml:space="preserve"> </w:t>
+      </w:r>
+      <w:proofErr w:type="spellStart"/>
+      <w:r>
+        <w:t>domain</w:t>
+      </w:r>
+      <w:proofErr w:type="spellEnd"/>
+      <w:r>
+        <w:t xml:space="preserve"> </w:t>
+      </w:r>
+      <w:proofErr w:type="spellStart"/>
+      <w:r>
+        <w:t>entities</w:t>
+      </w:r>
+      <w:proofErr w:type="spellEnd"/>
+      <w:r>
+        <w:t xml:space="preserve"> </w:t>
+      </w:r>
+      <w:proofErr w:type="spellStart"/>
+      <w:r>
+        <w:t>and</w:t>
+      </w:r>
+      <w:proofErr w:type="spellEnd"/>
+      <w:r>
+        <w:t xml:space="preserve"> </w:t>
+      </w:r>
+      <w:proofErr w:type="spellStart"/>
+      <w:r>
+        <w:t>database</w:t>
+      </w:r>
+      <w:proofErr w:type="spellEnd"/>
+      <w:r>
+        <w:t xml:space="preserve"> </w:t>
+      </w:r>
+      <w:proofErr w:type="spellStart"/>
+      <w:r>
+        <w:t>schema</w:t>
+      </w:r>
+      <w:proofErr w:type="spellEnd"/>
+      <w:r>
+        <w:t xml:space="preserve"> </w:t>
+      </w:r>
+      <w:proofErr w:type="spellStart"/>
+      <w:r>
+        <w:t>definitions</w:t>
+      </w:r>
+      <w:proofErr w:type="spellEnd"/>
+      <w:r>
+        <w:t>.</w:t>
       </w:r>
     </w:p>
     <w:p>
@@ -442,6 +730,7 @@
       <w:r>
         <w:t xml:space="preserve"> </w:t>
       </w:r>
+      <w:proofErr w:type="spellStart"/>
       <w:r>
         <w:rPr>
           <w:b/>
@@ -449,8 +738,17 @@
         </w:rPr>
         <w:t>ClercSystem.Infrastructure</w:t>
       </w:r>
-      <w:r>
-        <w:t xml:space="preserve">: Implementation </w:t>
+      <w:proofErr w:type="spellEnd"/>
+      <w:r>
+        <w:t xml:space="preserve">: </w:t>
+      </w:r>
+      <w:proofErr w:type="spellStart"/>
+      <w:r>
+        <w:t>Implementation</w:t>
+      </w:r>
+      <w:proofErr w:type="spellEnd"/>
+      <w:r>
+        <w:t xml:space="preserve"> </w:t>
       </w:r>
       <w:r>
         <w:rPr>
@@ -465,7 +763,15 @@
         <w:t>d</w:t>
       </w:r>
       <w:r>
-        <w:t xml:space="preserve"> Repository </w:t>
+        <w:t xml:space="preserve"> </w:t>
+      </w:r>
+      <w:proofErr w:type="spellStart"/>
+      <w:r>
+        <w:t>Repository</w:t>
+      </w:r>
+      <w:proofErr w:type="spellEnd"/>
+      <w:r>
+        <w:t xml:space="preserve"> </w:t>
       </w:r>
       <w:r>
         <w:rPr>
@@ -473,9 +779,11 @@
         </w:rPr>
         <w:t xml:space="preserve">    </w:t>
       </w:r>
+      <w:proofErr w:type="spellStart"/>
       <w:r>
         <w:t>Pattern</w:t>
       </w:r>
+      <w:proofErr w:type="spellEnd"/>
       <w:r>
         <w:rPr>
           <w:lang w:val="en-US"/>
@@ -541,13 +849,23 @@
           <w:lang w:val="en-US"/>
         </w:rPr>
       </w:pPr>
-      <w:r>
-        <w:rPr>
-          <w:b/>
-          <w:bCs/>
-          <w:lang w:val="en-US"/>
-        </w:rPr>
-        <w:t>ClercSystem.Services:</w:t>
+      <w:proofErr w:type="spellStart"/>
+      <w:r>
+        <w:rPr>
+          <w:b/>
+          <w:bCs/>
+          <w:lang w:val="en-US"/>
+        </w:rPr>
+        <w:t>ClercSystem.Services</w:t>
+      </w:r>
+      <w:proofErr w:type="spellEnd"/>
+      <w:r>
+        <w:rPr>
+          <w:b/>
+          <w:bCs/>
+          <w:lang w:val="en-US"/>
+        </w:rPr>
+        <w:t>:</w:t>
       </w:r>
       <w:r>
         <w:rPr>
@@ -592,6 +910,7 @@
           <w:lang w:val="en-US"/>
         </w:rPr>
       </w:pPr>
+      <w:proofErr w:type="spellStart"/>
       <w:r>
         <w:rPr>
           <w:b/>
@@ -600,6 +919,7 @@
         </w:rPr>
         <w:t>ClercSystem.ViewModels</w:t>
       </w:r>
+      <w:proofErr w:type="spellEnd"/>
       <w:r>
         <w:rPr>
           <w:lang w:val="en-US"/>
@@ -613,13 +933,23 @@
           <w:lang w:val="en-US"/>
         </w:rPr>
       </w:pPr>
-      <w:r>
-        <w:rPr>
-          <w:b/>
-          <w:bCs/>
-          <w:lang w:val="en-US"/>
-        </w:rPr>
-        <w:t>ClercSystem.Common:</w:t>
+      <w:proofErr w:type="spellStart"/>
+      <w:r>
+        <w:rPr>
+          <w:b/>
+          <w:bCs/>
+          <w:lang w:val="en-US"/>
+        </w:rPr>
+        <w:t>ClercSystem.Common</w:t>
+      </w:r>
+      <w:proofErr w:type="spellEnd"/>
+      <w:r>
+        <w:rPr>
+          <w:b/>
+          <w:bCs/>
+          <w:lang w:val="en-US"/>
+        </w:rPr>
+        <w:t>:</w:t>
       </w:r>
       <w:r>
         <w:rPr>
@@ -667,16 +997,94 @@
         </w:rPr>
         <w:br/>
       </w:r>
-      <w:r>
-        <w:rPr>
-          <w:b/>
-          <w:bCs/>
-        </w:rPr>
-        <w:t>ClercSystem (Main Web App):</w:t>
-      </w:r>
-      <w:r>
-        <w:t xml:space="preserve"> The entry point</w:t>
-      </w:r>
+      <w:proofErr w:type="spellStart"/>
+      <w:r>
+        <w:rPr>
+          <w:b/>
+          <w:bCs/>
+        </w:rPr>
+        <w:t>ClercSystem</w:t>
+      </w:r>
+      <w:proofErr w:type="spellEnd"/>
+      <w:r>
+        <w:rPr>
+          <w:b/>
+          <w:bCs/>
+        </w:rPr>
+        <w:t xml:space="preserve"> (</w:t>
+      </w:r>
+      <w:proofErr w:type="spellStart"/>
+      <w:r>
+        <w:rPr>
+          <w:b/>
+          <w:bCs/>
+        </w:rPr>
+        <w:t>Main</w:t>
+      </w:r>
+      <w:proofErr w:type="spellEnd"/>
+      <w:r>
+        <w:rPr>
+          <w:b/>
+          <w:bCs/>
+        </w:rPr>
+        <w:t xml:space="preserve"> </w:t>
+      </w:r>
+      <w:proofErr w:type="spellStart"/>
+      <w:r>
+        <w:rPr>
+          <w:b/>
+          <w:bCs/>
+        </w:rPr>
+        <w:t>Web</w:t>
+      </w:r>
+      <w:proofErr w:type="spellEnd"/>
+      <w:r>
+        <w:rPr>
+          <w:b/>
+          <w:bCs/>
+        </w:rPr>
+        <w:t xml:space="preserve"> </w:t>
+      </w:r>
+      <w:proofErr w:type="spellStart"/>
+      <w:r>
+        <w:rPr>
+          <w:b/>
+          <w:bCs/>
+        </w:rPr>
+        <w:t>App</w:t>
+      </w:r>
+      <w:proofErr w:type="spellEnd"/>
+      <w:r>
+        <w:rPr>
+          <w:b/>
+          <w:bCs/>
+        </w:rPr>
+        <w:t>):</w:t>
+      </w:r>
+      <w:r>
+        <w:t xml:space="preserve"> </w:t>
+      </w:r>
+      <w:proofErr w:type="spellStart"/>
+      <w:r>
+        <w:t>The</w:t>
+      </w:r>
+      <w:proofErr w:type="spellEnd"/>
+      <w:r>
+        <w:t xml:space="preserve"> </w:t>
+      </w:r>
+      <w:proofErr w:type="spellStart"/>
+      <w:r>
+        <w:t>entry</w:t>
+      </w:r>
+      <w:proofErr w:type="spellEnd"/>
+      <w:r>
+        <w:t xml:space="preserve"> </w:t>
+      </w:r>
+      <w:proofErr w:type="spellStart"/>
+      <w:r>
+        <w:t>point</w:t>
+      </w:r>
+      <w:proofErr w:type="spellEnd"/>
       <w:r>
         <w:rPr>
           <w:lang w:val="en-US"/>
@@ -712,8 +1120,14 @@
           <w:numId w:val="4"/>
         </w:numPr>
       </w:pPr>
-      <w:r>
-        <w:t>Areas/Admin</w:t>
+      <w:proofErr w:type="spellStart"/>
+      <w:r>
+        <w:lastRenderedPageBreak/>
+        <w:t>Areas</w:t>
+      </w:r>
+      <w:proofErr w:type="spellEnd"/>
+      <w:r>
+        <w:t>/Admin</w:t>
       </w:r>
       <w:r>
         <w:rPr>
@@ -722,7 +1136,39 @@
         <w:t xml:space="preserve"> - </w:t>
       </w:r>
       <w:r>
-        <w:t xml:space="preserve"> Secured administrative module for </w:t>
+        <w:t xml:space="preserve"> </w:t>
+      </w:r>
+      <w:proofErr w:type="spellStart"/>
+      <w:r>
+        <w:t>Secured</w:t>
+      </w:r>
+      <w:proofErr w:type="spellEnd"/>
+      <w:r>
+        <w:t xml:space="preserve"> </w:t>
+      </w:r>
+      <w:proofErr w:type="spellStart"/>
+      <w:r>
+        <w:t>administrative</w:t>
+      </w:r>
+      <w:proofErr w:type="spellEnd"/>
+      <w:r>
+        <w:t xml:space="preserve"> </w:t>
+      </w:r>
+      <w:proofErr w:type="spellStart"/>
+      <w:r>
+        <w:t>module</w:t>
+      </w:r>
+      <w:proofErr w:type="spellEnd"/>
+      <w:r>
+        <w:t xml:space="preserve"> </w:t>
+      </w:r>
+      <w:proofErr w:type="spellStart"/>
+      <w:r>
+        <w:t>for</w:t>
+      </w:r>
+      <w:proofErr w:type="spellEnd"/>
+      <w:r>
+        <w:t xml:space="preserve"> </w:t>
       </w:r>
       <w:r>
         <w:rPr>
@@ -731,8 +1177,21 @@
         <w:t>document</w:t>
       </w:r>
       <w:r>
-        <w:t xml:space="preserve"> log monitoring</w:t>
-      </w:r>
+        <w:t xml:space="preserve"> </w:t>
+      </w:r>
+      <w:proofErr w:type="spellStart"/>
+      <w:r>
+        <w:t>log</w:t>
+      </w:r>
+      <w:proofErr w:type="spellEnd"/>
+      <w:r>
+        <w:t xml:space="preserve"> </w:t>
+      </w:r>
+      <w:proofErr w:type="spellStart"/>
+      <w:r>
+        <w:t>monitoring</w:t>
+      </w:r>
+      <w:proofErr w:type="spellEnd"/>
       <w:r>
         <w:rPr>
           <w:lang w:val="en-US"/>
@@ -751,13 +1210,14 @@
           <w:numId w:val="4"/>
         </w:numPr>
       </w:pPr>
-      <w:r>
-        <w:lastRenderedPageBreak/>
+      <w:proofErr w:type="spellStart"/>
+      <w:r>
         <w:t>W</w:t>
       </w:r>
       <w:r>
         <w:t>wwroot</w:t>
       </w:r>
+      <w:proofErr w:type="spellEnd"/>
       <w:r>
         <w:rPr>
           <w:lang w:val="en-US"/>
@@ -765,7 +1225,55 @@
         <w:t xml:space="preserve"> -</w:t>
       </w:r>
       <w:r>
-        <w:t xml:space="preserve"> Static assets (Custom js/Logs.js for AJAX operations).</w:t>
+        <w:t xml:space="preserve"> </w:t>
+      </w:r>
+      <w:proofErr w:type="spellStart"/>
+      <w:r>
+        <w:t>Static</w:t>
+      </w:r>
+      <w:proofErr w:type="spellEnd"/>
+      <w:r>
+        <w:t xml:space="preserve"> </w:t>
+      </w:r>
+      <w:proofErr w:type="spellStart"/>
+      <w:r>
+        <w:t>assets</w:t>
+      </w:r>
+      <w:proofErr w:type="spellEnd"/>
+      <w:r>
+        <w:t xml:space="preserve"> (</w:t>
+      </w:r>
+      <w:proofErr w:type="spellStart"/>
+      <w:r>
+        <w:t>Custom</w:t>
+      </w:r>
+      <w:proofErr w:type="spellEnd"/>
+      <w:r>
+        <w:t xml:space="preserve"> </w:t>
+      </w:r>
+      <w:proofErr w:type="spellStart"/>
+      <w:r>
+        <w:t>js</w:t>
+      </w:r>
+      <w:proofErr w:type="spellEnd"/>
+      <w:r>
+        <w:t xml:space="preserve">/Logs.js </w:t>
+      </w:r>
+      <w:proofErr w:type="spellStart"/>
+      <w:r>
+        <w:t>for</w:t>
+      </w:r>
+      <w:proofErr w:type="spellEnd"/>
+      <w:r>
+        <w:t xml:space="preserve"> AJAX </w:t>
+      </w:r>
+      <w:proofErr w:type="spellStart"/>
+      <w:r>
+        <w:t>operations</w:t>
+      </w:r>
+      <w:proofErr w:type="spellEnd"/>
+      <w:r>
+        <w:t>).</w:t>
       </w:r>
     </w:p>
     <w:p>
@@ -776,9 +1284,11 @@
           <w:numId w:val="4"/>
         </w:numPr>
       </w:pPr>
+      <w:proofErr w:type="spellStart"/>
       <w:r>
         <w:t>Authorisation</w:t>
       </w:r>
+      <w:proofErr w:type="spellEnd"/>
       <w:r>
         <w:rPr>
           <w:lang w:val="en-US"/>
@@ -786,7 +1296,47 @@
         <w:t xml:space="preserve"> - </w:t>
       </w:r>
       <w:r>
-        <w:t xml:space="preserve"> Custom logic for Role-Based Access Control (RBAC)</w:t>
+        <w:t xml:space="preserve"> </w:t>
+      </w:r>
+      <w:proofErr w:type="spellStart"/>
+      <w:r>
+        <w:t>Custom</w:t>
+      </w:r>
+      <w:proofErr w:type="spellEnd"/>
+      <w:r>
+        <w:t xml:space="preserve"> </w:t>
+      </w:r>
+      <w:proofErr w:type="spellStart"/>
+      <w:r>
+        <w:t>logic</w:t>
+      </w:r>
+      <w:proofErr w:type="spellEnd"/>
+      <w:r>
+        <w:t xml:space="preserve"> </w:t>
+      </w:r>
+      <w:proofErr w:type="spellStart"/>
+      <w:r>
+        <w:t>for</w:t>
+      </w:r>
+      <w:proofErr w:type="spellEnd"/>
+      <w:r>
+        <w:t xml:space="preserve"> </w:t>
+      </w:r>
+      <w:proofErr w:type="spellStart"/>
+      <w:r>
+        <w:t>Role-Based</w:t>
+      </w:r>
+      <w:proofErr w:type="spellEnd"/>
+      <w:r>
+        <w:t xml:space="preserve"> Access </w:t>
+      </w:r>
+      <w:proofErr w:type="spellStart"/>
+      <w:r>
+        <w:t>Control</w:t>
+      </w:r>
+      <w:proofErr w:type="spellEnd"/>
+      <w:r>
+        <w:t xml:space="preserve"> (RBAC)</w:t>
       </w:r>
       <w:r>
         <w:rPr>
@@ -816,7 +1366,21 @@
         <w:rPr>
           <w:lang w:val="en-US"/>
         </w:rPr>
-        <w:t xml:space="preserve">Extensions – contains configuration extensions for system. Helps with better program.cs readability. </w:t>
+        <w:t xml:space="preserve">Extensions – contains configuration extensions for system. Helps with better </w:t>
+      </w:r>
+      <w:proofErr w:type="spellStart"/>
+      <w:r>
+        <w:rPr>
+          <w:lang w:val="en-US"/>
+        </w:rPr>
+        <w:t>program.cs</w:t>
+      </w:r>
+      <w:proofErr w:type="spellEnd"/>
+      <w:r>
+        <w:rPr>
+          <w:lang w:val="en-US"/>
+        </w:rPr>
+        <w:t xml:space="preserve"> readability. </w:t>
       </w:r>
     </w:p>
     <w:p>
@@ -853,6 +1417,8 @@
         </w:rPr>
         <w:t xml:space="preserve">When starting the project Departments, Categories, roles, and the basic admin user tables should be populated automatically via the </w:t>
       </w:r>
+      <w:proofErr w:type="spellStart"/>
+      <w:proofErr w:type="gramStart"/>
       <w:r>
         <w:rPr>
           <w:b/>
@@ -861,6 +1427,8 @@
         </w:rPr>
         <w:t>ClercSystem.Data.Seeder</w:t>
       </w:r>
+      <w:proofErr w:type="spellEnd"/>
+      <w:proofErr w:type="gramEnd"/>
       <w:r>
         <w:rPr>
           <w:lang w:val="en-US"/>
@@ -886,7 +1454,7 @@
         </w:rPr>
         <w:br/>
       </w:r>
-      <w:hyperlink r:id="rId6" w:history="1">
+      <w:hyperlink r:id="rId7" w:history="1">
         <w:r>
           <w:rPr>
             <w:rStyle w:val="Hyperlink"/>
@@ -961,84 +1529,6 @@
             <wp:extent cx="5760720" cy="1044575"/>
             <wp:effectExtent l="0" t="0" r="0" b="3175"/>
             <wp:docPr id="1" name="Picture 1"/>
-            <wp:cNvGraphicFramePr>
-              <a:graphicFrameLocks xmlns:a="http://schemas.openxmlformats.org/drawingml/2006/main" noChangeAspect="1"/>
-            </wp:cNvGraphicFramePr>
-            <a:graphic xmlns:a="http://schemas.openxmlformats.org/drawingml/2006/main">
-              <a:graphicData uri="http://schemas.openxmlformats.org/drawingml/2006/picture">
-                <pic:pic xmlns:pic="http://schemas.openxmlformats.org/drawingml/2006/picture">
-                  <pic:nvPicPr>
-                    <pic:cNvPr id="1" name=""/>
-                    <pic:cNvPicPr/>
-                  </pic:nvPicPr>
-                  <pic:blipFill>
-                    <a:blip r:embed="rId7"/>
-                    <a:stretch>
-                      <a:fillRect/>
-                    </a:stretch>
-                  </pic:blipFill>
-                  <pic:spPr>
-                    <a:xfrm>
-                      <a:off x="0" y="0"/>
-                      <a:ext cx="5760720" cy="1044575"/>
-                    </a:xfrm>
-                    <a:prstGeom prst="rect">
-                      <a:avLst/>
-                    </a:prstGeom>
-                  </pic:spPr>
-                </pic:pic>
-              </a:graphicData>
-            </a:graphic>
-          </wp:inline>
-        </w:drawing>
-      </w:r>
-      <w:r>
-        <w:rPr>
-          <w:lang w:val="en-US"/>
-        </w:rPr>
-        <w:t xml:space="preserve"> </w:t>
-      </w:r>
-    </w:p>
-    <w:p>
-      <w:pPr>
-        <w:rPr>
-          <w:lang w:val="en-US"/>
-        </w:rPr>
-      </w:pPr>
-      <w:r>
-        <w:rPr>
-          <w:lang w:val="en-US"/>
-        </w:rPr>
-        <w:t xml:space="preserve">I am using </w:t>
-      </w:r>
-      <w:r>
-        <w:rPr>
-          <w:lang w:val="en-US"/>
-        </w:rPr>
-        <w:t xml:space="preserve">built in template(bootstrap). Built in Admin user is not a “GOD ADMIN”, and cannot change anything preset in his settings but can apply settings for other users – IsManager, Department_ID etc… You can press on the buttons but different denial pop up messages will appear showing the exact problem. Eample: </w:t>
-      </w:r>
-      <w:r>
-        <w:rPr>
-          <w:lang w:val="en-US"/>
-        </w:rPr>
-        <w:br/>
-      </w:r>
-      <w:r>
-        <w:rPr>
-          <w:lang w:val="en-US"/>
-        </w:rPr>
-        <w:br/>
-      </w:r>
-      <w:r>
-        <w:rPr>
-          <w:noProof/>
-          <w:lang w:val="en-US"/>
-        </w:rPr>
-        <w:drawing>
-          <wp:inline distT="0" distB="0" distL="0" distR="0" wp14:anchorId="36A0CC5C" wp14:editId="74520D81">
-            <wp:extent cx="5760720" cy="1546225"/>
-            <wp:effectExtent l="0" t="0" r="0" b="0"/>
-            <wp:docPr id="2" name="Picture 2"/>
             <wp:cNvGraphicFramePr>
               <a:graphicFrameLocks xmlns:a="http://schemas.openxmlformats.org/drawingml/2006/main" noChangeAspect="1"/>
             </wp:cNvGraphicFramePr>
@@ -1058,7 +1548,7 @@
                   <pic:spPr>
                     <a:xfrm>
                       <a:off x="0" y="0"/>
-                      <a:ext cx="5760720" cy="1546225"/>
+                      <a:ext cx="5760720" cy="1044575"/>
                     </a:xfrm>
                     <a:prstGeom prst="rect">
                       <a:avLst/>
@@ -1074,29 +1564,102 @@
         <w:rPr>
           <w:lang w:val="en-US"/>
         </w:rPr>
-        <w:br/>
-      </w:r>
-      <w:r>
-        <w:rPr>
-          <w:b/>
-          <w:bCs/>
-          <w:lang w:val="en-US"/>
-        </w:rPr>
-        <w:t xml:space="preserve"> </w:t>
-      </w:r>
-      <w:r>
-        <w:rPr>
-          <w:b/>
-          <w:bCs/>
-          <w:lang w:val="en-US"/>
-        </w:rPr>
-        <w:t>New Users are being added via the registration page.</w:t>
-      </w:r>
-      <w:r>
-        <w:rPr>
-          <w:lang w:val="en-US"/>
-        </w:rPr>
-        <w:t xml:space="preserve"> </w:t>
+        <w:t xml:space="preserve"> </w:t>
+      </w:r>
+    </w:p>
+    <w:p>
+      <w:pPr>
+        <w:rPr>
+          <w:lang w:val="en-US"/>
+        </w:rPr>
+      </w:pPr>
+      <w:r>
+        <w:rPr>
+          <w:lang w:val="en-US"/>
+        </w:rPr>
+        <w:t xml:space="preserve">I am using </w:t>
+      </w:r>
+      <w:r>
+        <w:rPr>
+          <w:lang w:val="en-US"/>
+        </w:rPr>
+        <w:t xml:space="preserve">built in template(bootstrap). Built in Admin user is not a “GOD ADMIN”, and cannot change anything preset in his settings but can apply settings for other users – </w:t>
+      </w:r>
+      <w:proofErr w:type="spellStart"/>
+      <w:r>
+        <w:rPr>
+          <w:lang w:val="en-US"/>
+        </w:rPr>
+        <w:t>IsManager</w:t>
+      </w:r>
+      <w:proofErr w:type="spellEnd"/>
+      <w:r>
+        <w:rPr>
+          <w:lang w:val="en-US"/>
+        </w:rPr>
+        <w:t xml:space="preserve">, </w:t>
+      </w:r>
+      <w:proofErr w:type="spellStart"/>
+      <w:r>
+        <w:rPr>
+          <w:lang w:val="en-US"/>
+        </w:rPr>
+        <w:t>Department_ID</w:t>
+      </w:r>
+      <w:proofErr w:type="spellEnd"/>
+      <w:r>
+        <w:rPr>
+          <w:lang w:val="en-US"/>
+        </w:rPr>
+        <w:t xml:space="preserve"> </w:t>
+      </w:r>
+      <w:proofErr w:type="spellStart"/>
+      <w:r>
+        <w:rPr>
+          <w:lang w:val="en-US"/>
+        </w:rPr>
+        <w:t>etc</w:t>
+      </w:r>
+      <w:proofErr w:type="spellEnd"/>
+      <w:r>
+        <w:rPr>
+          <w:lang w:val="en-US"/>
+        </w:rPr>
+        <w:t xml:space="preserve">… You can press on the buttons but different denial </w:t>
+      </w:r>
+      <w:proofErr w:type="gramStart"/>
+      <w:r>
+        <w:rPr>
+          <w:lang w:val="en-US"/>
+        </w:rPr>
+        <w:t>pop</w:t>
+      </w:r>
+      <w:proofErr w:type="gramEnd"/>
+      <w:r>
+        <w:rPr>
+          <w:lang w:val="en-US"/>
+        </w:rPr>
+        <w:t xml:space="preserve"> up messages will appear showing the exact problem. </w:t>
+      </w:r>
+      <w:proofErr w:type="spellStart"/>
+      <w:r>
+        <w:rPr>
+          <w:lang w:val="en-US"/>
+        </w:rPr>
+        <w:t>Eample</w:t>
+      </w:r>
+      <w:proofErr w:type="spellEnd"/>
+      <w:r>
+        <w:rPr>
+          <w:lang w:val="en-US"/>
+        </w:rPr>
+        <w:t xml:space="preserve">: </w:t>
+      </w:r>
+      <w:r>
+        <w:rPr>
+          <w:lang w:val="en-US"/>
+        </w:rPr>
+        <w:br/>
       </w:r>
       <w:r>
         <w:rPr>
@@ -1109,12 +1672,11 @@
           <w:noProof/>
           <w:lang w:val="en-US"/>
         </w:rPr>
-        <w:lastRenderedPageBreak/>
         <w:drawing>
-          <wp:inline distT="0" distB="0" distL="0" distR="0" wp14:anchorId="3A06DC29" wp14:editId="13C7A10E">
-            <wp:extent cx="5760720" cy="1264285"/>
+          <wp:inline distT="0" distB="0" distL="0" distR="0" wp14:anchorId="36A0CC5C" wp14:editId="74520D81">
+            <wp:extent cx="5760720" cy="1546225"/>
             <wp:effectExtent l="0" t="0" r="0" b="0"/>
-            <wp:docPr id="4" name="Picture 4"/>
+            <wp:docPr id="2" name="Picture 2"/>
             <wp:cNvGraphicFramePr>
               <a:graphicFrameLocks xmlns:a="http://schemas.openxmlformats.org/drawingml/2006/main" noChangeAspect="1"/>
             </wp:cNvGraphicFramePr>
@@ -1134,7 +1696,7 @@
                   <pic:spPr>
                     <a:xfrm>
                       <a:off x="0" y="0"/>
-                      <a:ext cx="5760720" cy="1264285"/>
+                      <a:ext cx="5760720" cy="1546225"/>
                     </a:xfrm>
                     <a:prstGeom prst="rect">
                       <a:avLst/>
@@ -1154,15 +1716,25 @@
       </w:r>
       <w:r>
         <w:rPr>
-          <w:lang w:val="en-US"/>
-        </w:rPr>
-        <w:t xml:space="preserve">Once registered the user gets a basic observer status where he can have only view access to everything in the system. Additional fields during registration are for better clarification of the who the user is. </w:t>
-      </w:r>
-      <w:r>
-        <w:rPr>
-          <w:lang w:val="en-US"/>
-        </w:rPr>
-        <w:br/>
+          <w:b/>
+          <w:bCs/>
+          <w:lang w:val="en-US"/>
+        </w:rPr>
+        <w:t xml:space="preserve"> </w:t>
+      </w:r>
+      <w:r>
+        <w:rPr>
+          <w:b/>
+          <w:bCs/>
+          <w:lang w:val="en-US"/>
+        </w:rPr>
+        <w:t>New Users are being added via the registration page.</w:t>
+      </w:r>
+      <w:r>
+        <w:rPr>
+          <w:lang w:val="en-US"/>
+        </w:rPr>
+        <w:t xml:space="preserve"> </w:t>
       </w:r>
       <w:r>
         <w:rPr>
@@ -1175,11 +1747,12 @@
           <w:noProof/>
           <w:lang w:val="en-US"/>
         </w:rPr>
+        <w:lastRenderedPageBreak/>
         <w:drawing>
-          <wp:inline distT="0" distB="0" distL="0" distR="0" wp14:anchorId="6EA8556F" wp14:editId="5D1F5788">
-            <wp:extent cx="5760720" cy="1520825"/>
-            <wp:effectExtent l="0" t="0" r="0" b="3175"/>
-            <wp:docPr id="5" name="Picture 5"/>
+          <wp:inline distT="0" distB="0" distL="0" distR="0" wp14:anchorId="3A06DC29" wp14:editId="13C7A10E">
+            <wp:extent cx="5760720" cy="1264285"/>
+            <wp:effectExtent l="0" t="0" r="0" b="0"/>
+            <wp:docPr id="4" name="Picture 4"/>
             <wp:cNvGraphicFramePr>
               <a:graphicFrameLocks xmlns:a="http://schemas.openxmlformats.org/drawingml/2006/main" noChangeAspect="1"/>
             </wp:cNvGraphicFramePr>
@@ -1199,7 +1772,7 @@
                   <pic:spPr>
                     <a:xfrm>
                       <a:off x="0" y="0"/>
-                      <a:ext cx="5760720" cy="1520825"/>
+                      <a:ext cx="5760720" cy="1264285"/>
                     </a:xfrm>
                     <a:prstGeom prst="rect">
                       <a:avLst/>
@@ -1213,20 +1786,38 @@
       </w:r>
       <w:r>
         <w:rPr>
+          <w:lang w:val="en-US"/>
+        </w:rPr>
+        <w:br/>
+      </w:r>
+      <w:r>
+        <w:rPr>
+          <w:lang w:val="en-US"/>
+        </w:rPr>
+        <w:t xml:space="preserve">Once registered the user gets a basic observer status where he can have only view access to everything in the system. Additional fields during registration are for better clarification of the who the user is. </w:t>
+      </w:r>
+      <w:r>
+        <w:rPr>
+          <w:lang w:val="en-US"/>
+        </w:rPr>
+        <w:br/>
+      </w:r>
+      <w:r>
+        <w:rPr>
+          <w:lang w:val="en-US"/>
+        </w:rPr>
+        <w:br/>
+      </w:r>
+      <w:r>
+        <w:rPr>
           <w:noProof/>
-        </w:rPr>
-        <w:t xml:space="preserve"> </w:t>
-      </w:r>
-      <w:r>
-        <w:rPr>
-          <w:noProof/>
           <w:lang w:val="en-US"/>
         </w:rPr>
         <w:drawing>
-          <wp:inline distT="0" distB="0" distL="0" distR="0" wp14:anchorId="6250011D" wp14:editId="2965660B">
-            <wp:extent cx="5760720" cy="1317625"/>
-            <wp:effectExtent l="0" t="0" r="0" b="0"/>
-            <wp:docPr id="6" name="Picture 6"/>
+          <wp:inline distT="0" distB="0" distL="0" distR="0" wp14:anchorId="6EA8556F" wp14:editId="5D1F5788">
+            <wp:extent cx="5760720" cy="1520825"/>
+            <wp:effectExtent l="0" t="0" r="0" b="3175"/>
+            <wp:docPr id="5" name="Picture 5"/>
             <wp:cNvGraphicFramePr>
               <a:graphicFrameLocks xmlns:a="http://schemas.openxmlformats.org/drawingml/2006/main" noChangeAspect="1"/>
             </wp:cNvGraphicFramePr>
@@ -1246,7 +1837,7 @@
                   <pic:spPr>
                     <a:xfrm>
                       <a:off x="0" y="0"/>
-                      <a:ext cx="5760720" cy="1317625"/>
+                      <a:ext cx="5760720" cy="1520825"/>
                     </a:xfrm>
                     <a:prstGeom prst="rect">
                       <a:avLst/>
@@ -1261,35 +1852,19 @@
       <w:r>
         <w:rPr>
           <w:noProof/>
-          <w:lang w:val="en-US"/>
-        </w:rPr>
-        <w:br/>
-        <w:t>The observer user does not have access to admin panel</w:t>
+        </w:rPr>
+        <w:t xml:space="preserve"> </w:t>
       </w:r>
       <w:r>
         <w:rPr>
           <w:noProof/>
           <w:lang w:val="en-US"/>
         </w:rPr>
-        <w:t xml:space="preserve">, cant change amend or log documents. </w:t>
-      </w:r>
-      <w:r>
-        <w:rPr>
-          <w:noProof/>
-          <w:lang w:val="en-US"/>
-        </w:rPr>
-        <w:br/>
-      </w:r>
-      <w:r>
-        <w:rPr>
-          <w:noProof/>
-          <w:lang w:val="en-US"/>
-        </w:rPr>
         <w:drawing>
-          <wp:inline distT="0" distB="0" distL="0" distR="0" wp14:anchorId="6E4E32BD" wp14:editId="1A63328D">
-            <wp:extent cx="5677593" cy="1059815"/>
-            <wp:effectExtent l="0" t="0" r="0" b="6985"/>
-            <wp:docPr id="7" name="Picture 7"/>
+          <wp:inline distT="0" distB="0" distL="0" distR="0" wp14:anchorId="6250011D" wp14:editId="2965660B">
+            <wp:extent cx="5760720" cy="1317625"/>
+            <wp:effectExtent l="0" t="0" r="0" b="0"/>
+            <wp:docPr id="6" name="Picture 6"/>
             <wp:cNvGraphicFramePr>
               <a:graphicFrameLocks xmlns:a="http://schemas.openxmlformats.org/drawingml/2006/main" noChangeAspect="1"/>
             </wp:cNvGraphicFramePr>
@@ -1309,7 +1884,7 @@
                   <pic:spPr>
                     <a:xfrm>
                       <a:off x="0" y="0"/>
-                      <a:ext cx="5681694" cy="1060581"/>
+                      <a:ext cx="5760720" cy="1317625"/>
                     </a:xfrm>
                     <a:prstGeom prst="rect">
                       <a:avLst/>
@@ -1323,32 +1898,36 @@
       </w:r>
       <w:r>
         <w:rPr>
-          <w:lang w:val="en-US"/>
-        </w:rPr>
-        <w:br/>
-      </w:r>
-      <w:r>
-        <w:rPr>
-          <w:lang w:val="en-US"/>
-        </w:rPr>
-        <w:t xml:space="preserve">This is the User Management Panel accessible only for the managers. We have just added the new user that is currently simply an observer. </w:t>
-      </w:r>
-      <w:r>
-        <w:rPr>
-          <w:lang w:val="en-US"/>
-        </w:rPr>
-        <w:br/>
-      </w:r>
-      <w:r>
-        <w:rPr>
           <w:noProof/>
           <w:lang w:val="en-US"/>
         </w:rPr>
+        <w:br/>
+        <w:t>The observer user does not have access to admin panel</w:t>
+      </w:r>
+      <w:r>
+        <w:rPr>
+          <w:noProof/>
+          <w:lang w:val="en-US"/>
+        </w:rPr>
+        <w:t xml:space="preserve">, cant change amend or log documents. </w:t>
+      </w:r>
+      <w:r>
+        <w:rPr>
+          <w:noProof/>
+          <w:lang w:val="en-US"/>
+        </w:rPr>
+        <w:br/>
+      </w:r>
+      <w:r>
+        <w:rPr>
+          <w:noProof/>
+          <w:lang w:val="en-US"/>
+        </w:rPr>
         <w:drawing>
-          <wp:inline distT="0" distB="0" distL="0" distR="0" wp14:anchorId="027E7031" wp14:editId="74933A5D">
-            <wp:extent cx="5760720" cy="1556385"/>
-            <wp:effectExtent l="0" t="0" r="0" b="5715"/>
-            <wp:docPr id="8" name="Picture 8"/>
+          <wp:inline distT="0" distB="0" distL="0" distR="0" wp14:anchorId="6E4E32BD" wp14:editId="1A63328D">
+            <wp:extent cx="5677593" cy="1059815"/>
+            <wp:effectExtent l="0" t="0" r="0" b="6985"/>
+            <wp:docPr id="7" name="Picture 7"/>
             <wp:cNvGraphicFramePr>
               <a:graphicFrameLocks xmlns:a="http://schemas.openxmlformats.org/drawingml/2006/main" noChangeAspect="1"/>
             </wp:cNvGraphicFramePr>
@@ -1368,7 +1947,7 @@
                   <pic:spPr>
                     <a:xfrm>
                       <a:off x="0" y="0"/>
-                      <a:ext cx="5760720" cy="1556385"/>
+                      <a:ext cx="5681694" cy="1060581"/>
                     </a:xfrm>
                     <a:prstGeom prst="rect">
                       <a:avLst/>
@@ -1380,55 +1959,17 @@
           </wp:inline>
         </w:drawing>
       </w:r>
-    </w:p>
-    <w:p>
-      <w:pPr>
-        <w:rPr>
-          <w:lang w:val="en-US"/>
-        </w:rPr>
-      </w:pPr>
-      <w:r>
-        <w:rPr>
-          <w:lang w:val="en-US"/>
-        </w:rPr>
-        <w:lastRenderedPageBreak/>
-        <w:t xml:space="preserve">Lets add </w:t>
-      </w:r>
-      <w:r>
-        <w:rPr>
-          <w:lang w:val="en-US"/>
-        </w:rPr>
-        <w:t xml:space="preserve">some documents using </w:t>
-      </w:r>
-      <w:r>
-        <w:rPr>
-          <w:lang w:val="en-US"/>
-        </w:rPr>
-        <w:t>the admin Man</w:t>
-      </w:r>
-      <w:r>
-        <w:rPr>
-          <w:lang w:val="en-US"/>
-        </w:rPr>
-        <w:t>a</w:t>
-      </w:r>
-      <w:r>
-        <w:rPr>
-          <w:lang w:val="en-US"/>
-        </w:rPr>
-        <w:t>ge Document</w:t>
-      </w:r>
-      <w:r>
-        <w:rPr>
-          <w:lang w:val="en-US"/>
-        </w:rPr>
-        <w:t>s</w:t>
-      </w:r>
-      <w:r>
-        <w:rPr>
-          <w:lang w:val="en-US"/>
-        </w:rPr>
-        <w:t xml:space="preserve"> Interface. </w:t>
+      <w:r>
+        <w:rPr>
+          <w:lang w:val="en-US"/>
+        </w:rPr>
+        <w:br/>
+      </w:r>
+      <w:r>
+        <w:rPr>
+          <w:lang w:val="en-US"/>
+        </w:rPr>
+        <w:t xml:space="preserve">This is the User Management Panel accessible only for the managers. We have just added the new user that is currently simply an observer. </w:t>
       </w:r>
       <w:r>
         <w:rPr>
@@ -1442,10 +1983,10 @@
           <w:lang w:val="en-US"/>
         </w:rPr>
         <w:drawing>
-          <wp:inline distT="0" distB="0" distL="0" distR="0" wp14:anchorId="17D21DCC" wp14:editId="19CAFA07">
-            <wp:extent cx="5760720" cy="1765300"/>
-            <wp:effectExtent l="0" t="0" r="0" b="6350"/>
-            <wp:docPr id="11" name="Picture 11"/>
+          <wp:inline distT="0" distB="0" distL="0" distR="0" wp14:anchorId="027E7031" wp14:editId="74933A5D">
+            <wp:extent cx="5760720" cy="1556385"/>
+            <wp:effectExtent l="0" t="0" r="0" b="5715"/>
+            <wp:docPr id="8" name="Picture 8"/>
             <wp:cNvGraphicFramePr>
               <a:graphicFrameLocks xmlns:a="http://schemas.openxmlformats.org/drawingml/2006/main" noChangeAspect="1"/>
             </wp:cNvGraphicFramePr>
@@ -1465,7 +2006,7 @@
                   <pic:spPr>
                     <a:xfrm>
                       <a:off x="0" y="0"/>
-                      <a:ext cx="5760720" cy="1765300"/>
+                      <a:ext cx="5760720" cy="1556385"/>
                     </a:xfrm>
                     <a:prstGeom prst="rect">
                       <a:avLst/>
@@ -1477,12 +2018,6 @@
           </wp:inline>
         </w:drawing>
       </w:r>
-      <w:r>
-        <w:rPr>
-          <w:lang w:val="en-US"/>
-        </w:rPr>
-        <w:br/>
-      </w:r>
     </w:p>
     <w:p>
       <w:pPr>
@@ -1490,41 +2025,75 @@
           <w:lang w:val="en-US"/>
         </w:rPr>
       </w:pPr>
-      <w:r>
-        <w:rPr>
-          <w:lang w:val="en-US"/>
-        </w:rPr>
-        <w:t>Click on add document and follow the form. You should get something like that at the end</w:t>
-      </w:r>
-      <w:r>
-        <w:rPr>
-          <w:lang w:val="en-US"/>
-        </w:rPr>
-        <w:t xml:space="preserve"> when document is added.</w:t>
-      </w:r>
-      <w:r>
-        <w:rPr>
-          <w:lang w:val="en-US"/>
-        </w:rPr>
-        <w:t xml:space="preserve"> </w:t>
-      </w:r>
-    </w:p>
-    <w:p>
-      <w:pPr>
-        <w:rPr>
-          <w:lang w:val="en-US"/>
-        </w:rPr>
-      </w:pPr>
+      <w:proofErr w:type="spellStart"/>
+      <w:proofErr w:type="gramStart"/>
+      <w:r>
+        <w:rPr>
+          <w:lang w:val="en-US"/>
+        </w:rPr>
+        <w:lastRenderedPageBreak/>
+        <w:t>Lets</w:t>
+      </w:r>
+      <w:proofErr w:type="spellEnd"/>
+      <w:proofErr w:type="gramEnd"/>
+      <w:r>
+        <w:rPr>
+          <w:lang w:val="en-US"/>
+        </w:rPr>
+        <w:t xml:space="preserve"> add </w:t>
+      </w:r>
+      <w:r>
+        <w:rPr>
+          <w:lang w:val="en-US"/>
+        </w:rPr>
+        <w:t xml:space="preserve">some documents using </w:t>
+      </w:r>
+      <w:r>
+        <w:rPr>
+          <w:lang w:val="en-US"/>
+        </w:rPr>
+        <w:t>the admin Man</w:t>
+      </w:r>
+      <w:r>
+        <w:rPr>
+          <w:lang w:val="en-US"/>
+        </w:rPr>
+        <w:t>a</w:t>
+      </w:r>
+      <w:r>
+        <w:rPr>
+          <w:lang w:val="en-US"/>
+        </w:rPr>
+        <w:t>ge Document</w:t>
+      </w:r>
+      <w:r>
+        <w:rPr>
+          <w:lang w:val="en-US"/>
+        </w:rPr>
+        <w:t>s</w:t>
+      </w:r>
+      <w:r>
+        <w:rPr>
+          <w:lang w:val="en-US"/>
+        </w:rPr>
+        <w:t xml:space="preserve"> Interface. </w:t>
+      </w:r>
+      <w:r>
+        <w:rPr>
+          <w:lang w:val="en-US"/>
+        </w:rPr>
+        <w:br/>
+      </w:r>
       <w:r>
         <w:rPr>
           <w:noProof/>
           <w:lang w:val="en-US"/>
         </w:rPr>
         <w:drawing>
-          <wp:inline distT="0" distB="0" distL="0" distR="0" wp14:anchorId="27FDC999" wp14:editId="3F25A507">
-            <wp:extent cx="5760720" cy="874395"/>
-            <wp:effectExtent l="0" t="0" r="0" b="1905"/>
-            <wp:docPr id="12" name="Picture 12"/>
+          <wp:inline distT="0" distB="0" distL="0" distR="0" wp14:anchorId="17D21DCC" wp14:editId="19CAFA07">
+            <wp:extent cx="5760720" cy="1765300"/>
+            <wp:effectExtent l="0" t="0" r="0" b="6350"/>
+            <wp:docPr id="11" name="Picture 11"/>
             <wp:cNvGraphicFramePr>
               <a:graphicFrameLocks xmlns:a="http://schemas.openxmlformats.org/drawingml/2006/main" noChangeAspect="1"/>
             </wp:cNvGraphicFramePr>
@@ -1544,7 +2113,7 @@
                   <pic:spPr>
                     <a:xfrm>
                       <a:off x="0" y="0"/>
-                      <a:ext cx="5760720" cy="874395"/>
+                      <a:ext cx="5760720" cy="1765300"/>
                     </a:xfrm>
                     <a:prstGeom prst="rect">
                       <a:avLst/>
@@ -1562,76 +2131,48 @@
         </w:rPr>
         <w:br/>
       </w:r>
-      <w:r>
-        <w:rPr>
-          <w:lang w:val="en-US"/>
-        </w:rPr>
-        <w:t>Users</w:t>
-      </w:r>
-      <w:r>
-        <w:rPr>
-          <w:b/>
-          <w:bCs/>
-          <w:lang w:val="en-US"/>
-        </w:rPr>
-        <w:t xml:space="preserve"> </w:t>
-      </w:r>
-      <w:r>
-        <w:rPr>
-          <w:b/>
-          <w:bCs/>
-          <w:lang w:val="en-US"/>
-        </w:rPr>
-        <w:t>Admin</w:t>
-      </w:r>
-      <w:r>
-        <w:rPr>
-          <w:lang w:val="en-US"/>
-        </w:rPr>
-        <w:t xml:space="preserve"> and </w:t>
-      </w:r>
-      <w:r>
-        <w:rPr>
-          <w:b/>
-          <w:bCs/>
-          <w:lang w:val="en-US"/>
-        </w:rPr>
-        <w:t>User</w:t>
-      </w:r>
-      <w:r>
-        <w:rPr>
-          <w:lang w:val="en-US"/>
-        </w:rPr>
-        <w:t xml:space="preserve"> roles can edit, delete or check more details about the documents they have created. </w:t>
-      </w:r>
-      <w:r>
-        <w:rPr>
-          <w:lang w:val="en-US"/>
-        </w:rPr>
-        <w:t>Example edit:</w:t>
-      </w:r>
-      <w:r>
-        <w:rPr>
-          <w:lang w:val="en-US"/>
-        </w:rPr>
-        <w:br/>
-      </w:r>
-      <w:r>
-        <w:rPr>
-          <w:lang w:val="en-US"/>
-        </w:rPr>
-        <w:br/>
-      </w:r>
+    </w:p>
+    <w:p>
+      <w:pPr>
+        <w:rPr>
+          <w:lang w:val="en-US"/>
+        </w:rPr>
+      </w:pPr>
+      <w:r>
+        <w:rPr>
+          <w:lang w:val="en-US"/>
+        </w:rPr>
+        <w:t>Click on add document and follow the form. You should get something like that at the end</w:t>
+      </w:r>
+      <w:r>
+        <w:rPr>
+          <w:lang w:val="en-US"/>
+        </w:rPr>
+        <w:t xml:space="preserve"> when document is added.</w:t>
+      </w:r>
+      <w:r>
+        <w:rPr>
+          <w:lang w:val="en-US"/>
+        </w:rPr>
+        <w:t xml:space="preserve"> </w:t>
+      </w:r>
+    </w:p>
+    <w:p>
+      <w:pPr>
+        <w:rPr>
+          <w:lang w:val="en-US"/>
+        </w:rPr>
+      </w:pPr>
       <w:r>
         <w:rPr>
           <w:noProof/>
           <w:lang w:val="en-US"/>
         </w:rPr>
         <w:drawing>
-          <wp:inline distT="0" distB="0" distL="0" distR="0" wp14:anchorId="2411755F" wp14:editId="4E9685CA">
-            <wp:extent cx="5760720" cy="1769424"/>
-            <wp:effectExtent l="0" t="0" r="0" b="2540"/>
-            <wp:docPr id="16" name="Picture 16"/>
+          <wp:inline distT="0" distB="0" distL="0" distR="0" wp14:anchorId="27FDC999" wp14:editId="3F25A507">
+            <wp:extent cx="5760720" cy="874395"/>
+            <wp:effectExtent l="0" t="0" r="0" b="1905"/>
+            <wp:docPr id="12" name="Picture 12"/>
             <wp:cNvGraphicFramePr>
               <a:graphicFrameLocks xmlns:a="http://schemas.openxmlformats.org/drawingml/2006/main" noChangeAspect="1"/>
             </wp:cNvGraphicFramePr>
@@ -1651,7 +2192,7 @@
                   <pic:spPr>
                     <a:xfrm>
                       <a:off x="0" y="0"/>
-                      <a:ext cx="5786705" cy="1777405"/>
+                      <a:ext cx="5760720" cy="874395"/>
                     </a:xfrm>
                     <a:prstGeom prst="rect">
                       <a:avLst/>
@@ -1663,23 +2204,82 @@
           </wp:inline>
         </w:drawing>
       </w:r>
-    </w:p>
-    <w:p>
-      <w:pPr>
-        <w:rPr>
-          <w:lang w:val="en-US"/>
-        </w:rPr>
-      </w:pPr>
+      <w:r>
+        <w:rPr>
+          <w:lang w:val="en-US"/>
+        </w:rPr>
+        <w:br/>
+      </w:r>
+      <w:r>
+        <w:rPr>
+          <w:lang w:val="en-US"/>
+        </w:rPr>
+        <w:t>Users</w:t>
+      </w:r>
+      <w:r>
+        <w:rPr>
+          <w:b/>
+          <w:bCs/>
+          <w:lang w:val="en-US"/>
+        </w:rPr>
+        <w:t xml:space="preserve"> </w:t>
+      </w:r>
+      <w:r>
+        <w:rPr>
+          <w:b/>
+          <w:bCs/>
+          <w:lang w:val="en-US"/>
+        </w:rPr>
+        <w:t>Admin</w:t>
+      </w:r>
+      <w:r>
+        <w:rPr>
+          <w:lang w:val="en-US"/>
+        </w:rPr>
+        <w:t xml:space="preserve"> and </w:t>
+      </w:r>
+      <w:r>
+        <w:rPr>
+          <w:b/>
+          <w:bCs/>
+          <w:lang w:val="en-US"/>
+        </w:rPr>
+        <w:t>User</w:t>
+      </w:r>
+      <w:r>
+        <w:rPr>
+          <w:lang w:val="en-US"/>
+        </w:rPr>
+        <w:t xml:space="preserve"> roles can edit, delete or check more details about the documents they have created. </w:t>
+      </w:r>
+      <w:r>
+        <w:rPr>
+          <w:lang w:val="en-US"/>
+        </w:rPr>
+        <w:t>Example edit:</w:t>
+      </w:r>
+      <w:r>
+        <w:rPr>
+          <w:lang w:val="en-US"/>
+        </w:rPr>
+        <w:br/>
+      </w:r>
+      <w:r>
+        <w:rPr>
+          <w:lang w:val="en-US"/>
+        </w:rPr>
+        <w:br/>
+      </w:r>
       <w:r>
         <w:rPr>
           <w:noProof/>
           <w:lang w:val="en-US"/>
         </w:rPr>
         <w:drawing>
-          <wp:inline distT="0" distB="0" distL="0" distR="0" wp14:anchorId="0FBDC883" wp14:editId="55359360">
-            <wp:extent cx="5760720" cy="1852550"/>
-            <wp:effectExtent l="0" t="0" r="0" b="0"/>
-            <wp:docPr id="17" name="Picture 17"/>
+          <wp:inline distT="0" distB="0" distL="0" distR="0" wp14:anchorId="2411755F" wp14:editId="4E9685CA">
+            <wp:extent cx="5760720" cy="1769424"/>
+            <wp:effectExtent l="0" t="0" r="0" b="2540"/>
+            <wp:docPr id="16" name="Picture 16"/>
             <wp:cNvGraphicFramePr>
               <a:graphicFrameLocks xmlns:a="http://schemas.openxmlformats.org/drawingml/2006/main" noChangeAspect="1"/>
             </wp:cNvGraphicFramePr>
@@ -1699,7 +2299,7 @@
                   <pic:spPr>
                     <a:xfrm>
                       <a:off x="0" y="0"/>
-                      <a:ext cx="5769991" cy="1855531"/>
+                      <a:ext cx="5786705" cy="1777405"/>
                     </a:xfrm>
                     <a:prstGeom prst="rect">
                       <a:avLst/>
@@ -1720,79 +2320,14 @@
       </w:pPr>
       <w:r>
         <w:rPr>
-          <w:lang w:val="en-US"/>
-        </w:rPr>
-        <w:t xml:space="preserve">Notice that even the two Edit document views may look alike they are not. The second photo has a permissions dropdown that I will explain later. </w:t>
-      </w:r>
-      <w:r>
-        <w:rPr>
-          <w:lang w:val="en-US"/>
-        </w:rPr>
-        <w:t xml:space="preserve">Via that view every user can edit the </w:t>
-      </w:r>
-      <w:r>
-        <w:rPr>
-          <w:lang w:val="en-US"/>
-        </w:rPr>
-        <w:lastRenderedPageBreak/>
-        <w:t>document that they own. If they try to edit someone elses document it will not work except if you have an</w:t>
-      </w:r>
-      <w:r>
-        <w:rPr>
-          <w:b/>
-          <w:bCs/>
-          <w:lang w:val="en-US"/>
-        </w:rPr>
-        <w:t xml:space="preserve"> Admin</w:t>
-      </w:r>
-      <w:r>
-        <w:rPr>
-          <w:b/>
-          <w:bCs/>
-          <w:lang w:val="en-US"/>
-        </w:rPr>
-        <w:t xml:space="preserve"> </w:t>
-      </w:r>
-      <w:r>
-        <w:rPr>
-          <w:lang w:val="en-US"/>
-        </w:rPr>
-        <w:t>role.</w:t>
-      </w:r>
-      <w:r>
-        <w:rPr>
-          <w:lang w:val="en-US"/>
-        </w:rPr>
-        <w:t xml:space="preserve"> Still The admin user cannot delete other peoples documents, but only his own. </w:t>
-      </w:r>
-      <w:r>
-        <w:rPr>
-          <w:lang w:val="en-US"/>
-        </w:rPr>
-        <w:t>You see the pop up message on the picture below.</w:t>
-      </w:r>
-      <w:r>
-        <w:rPr>
-          <w:lang w:val="en-US"/>
-        </w:rPr>
-        <w:br/>
-      </w:r>
-      <w:r>
-        <w:rPr>
-          <w:lang w:val="en-US"/>
-        </w:rPr>
-        <w:br/>
-      </w:r>
-      <w:r>
-        <w:rPr>
           <w:noProof/>
           <w:lang w:val="en-US"/>
         </w:rPr>
         <w:drawing>
-          <wp:inline distT="0" distB="0" distL="0" distR="0" wp14:anchorId="522E57D8" wp14:editId="35A42FC2">
-            <wp:extent cx="5760720" cy="1711960"/>
-            <wp:effectExtent l="0" t="0" r="0" b="2540"/>
-            <wp:docPr id="18" name="Picture 18"/>
+          <wp:inline distT="0" distB="0" distL="0" distR="0" wp14:anchorId="0FBDC883" wp14:editId="55359360">
+            <wp:extent cx="5760720" cy="1852550"/>
+            <wp:effectExtent l="0" t="0" r="0" b="0"/>
+            <wp:docPr id="17" name="Picture 17"/>
             <wp:cNvGraphicFramePr>
               <a:graphicFrameLocks xmlns:a="http://schemas.openxmlformats.org/drawingml/2006/main" noChangeAspect="1"/>
             </wp:cNvGraphicFramePr>
@@ -1812,7 +2347,7 @@
                   <pic:spPr>
                     <a:xfrm>
                       <a:off x="0" y="0"/>
-                      <a:ext cx="5760720" cy="1711960"/>
+                      <a:ext cx="5769991" cy="1855531"/>
                     </a:xfrm>
                     <a:prstGeom prst="rect">
                       <a:avLst/>
@@ -1824,48 +2359,132 @@
           </wp:inline>
         </w:drawing>
       </w:r>
-      <w:r>
-        <w:rPr>
-          <w:lang w:val="en-US"/>
-        </w:rPr>
-        <w:t xml:space="preserve"> </w:t>
-      </w:r>
     </w:p>
     <w:p>
       <w:pPr>
         <w:rPr>
+          <w:lang w:val="en-US"/>
+        </w:rPr>
+      </w:pPr>
+      <w:r>
+        <w:rPr>
+          <w:lang w:val="en-US"/>
+        </w:rPr>
+        <w:t xml:space="preserve">Notice that even the two Edit document views may look alike they are not. The second photo has a permissions dropdown that I will explain later. </w:t>
+      </w:r>
+      <w:r>
+        <w:rPr>
+          <w:lang w:val="en-US"/>
+        </w:rPr>
+        <w:t xml:space="preserve">Via that view every user can edit the </w:t>
+      </w:r>
+      <w:r>
+        <w:rPr>
+          <w:lang w:val="en-US"/>
+        </w:rPr>
+        <w:lastRenderedPageBreak/>
+        <w:t xml:space="preserve">document that they own. If they try to edit someone </w:t>
+      </w:r>
+      <w:proofErr w:type="spellStart"/>
+      <w:r>
+        <w:rPr>
+          <w:lang w:val="en-US"/>
+        </w:rPr>
+        <w:t>elses</w:t>
+      </w:r>
+      <w:proofErr w:type="spellEnd"/>
+      <w:r>
+        <w:rPr>
+          <w:lang w:val="en-US"/>
+        </w:rPr>
+        <w:t xml:space="preserve"> document it will not work except if you have an</w:t>
+      </w:r>
+      <w:r>
+        <w:rPr>
+          <w:b/>
+          <w:bCs/>
+          <w:lang w:val="en-US"/>
+        </w:rPr>
+        <w:t xml:space="preserve"> Admin</w:t>
+      </w:r>
+      <w:r>
+        <w:rPr>
+          <w:b/>
+          <w:bCs/>
+          <w:lang w:val="en-US"/>
+        </w:rPr>
+        <w:t xml:space="preserve"> </w:t>
+      </w:r>
+      <w:r>
+        <w:rPr>
+          <w:lang w:val="en-US"/>
+        </w:rPr>
+        <w:t>role.</w:t>
+      </w:r>
+      <w:r>
+        <w:rPr>
+          <w:lang w:val="en-US"/>
+        </w:rPr>
+        <w:t xml:space="preserve"> Still The admin user cannot delete other </w:t>
+      </w:r>
+      <w:proofErr w:type="spellStart"/>
+      <w:proofErr w:type="gramStart"/>
+      <w:r>
+        <w:rPr>
+          <w:lang w:val="en-US"/>
+        </w:rPr>
+        <w:t>peoples</w:t>
+      </w:r>
+      <w:proofErr w:type="spellEnd"/>
+      <w:proofErr w:type="gramEnd"/>
+      <w:r>
+        <w:rPr>
+          <w:lang w:val="en-US"/>
+        </w:rPr>
+        <w:t xml:space="preserve"> documents, but only his own. </w:t>
+      </w:r>
+      <w:r>
+        <w:rPr>
+          <w:lang w:val="en-US"/>
+        </w:rPr>
+        <w:t xml:space="preserve">You see the </w:t>
+      </w:r>
+      <w:proofErr w:type="gramStart"/>
+      <w:r>
+        <w:rPr>
+          <w:lang w:val="en-US"/>
+        </w:rPr>
+        <w:t>pop up</w:t>
+      </w:r>
+      <w:proofErr w:type="gramEnd"/>
+      <w:r>
+        <w:rPr>
+          <w:lang w:val="en-US"/>
+        </w:rPr>
+        <w:t xml:space="preserve"> message on the picture below.</w:t>
+      </w:r>
+      <w:r>
+        <w:rPr>
+          <w:lang w:val="en-US"/>
+        </w:rPr>
+        <w:br/>
+      </w:r>
+      <w:r>
+        <w:rPr>
+          <w:lang w:val="en-US"/>
+        </w:rPr>
+        <w:br/>
+      </w:r>
+      <w:r>
+        <w:rPr>
           <w:noProof/>
           <w:lang w:val="en-US"/>
         </w:rPr>
-      </w:pPr>
-      <w:r>
-        <w:rPr>
-          <w:lang w:val="en-US"/>
-        </w:rPr>
-        <w:t xml:space="preserve">Now lets see what happens when an ordinary user tries to delete his document. You see a document deleted successfully message and the document disappears from screen. </w:t>
-      </w:r>
-      <w:r>
-        <w:rPr>
-          <w:lang w:val="en-US"/>
-        </w:rPr>
-        <w:br/>
-      </w:r>
-      <w:r>
-        <w:rPr>
-          <w:lang w:val="en-US"/>
-        </w:rPr>
-        <w:br/>
-      </w:r>
-      <w:r>
-        <w:rPr>
-          <w:noProof/>
-          <w:lang w:val="en-US"/>
-        </w:rPr>
         <w:drawing>
-          <wp:inline distT="0" distB="0" distL="0" distR="0" wp14:anchorId="36CD6C75" wp14:editId="0155E08A">
-            <wp:extent cx="5760720" cy="1682115"/>
-            <wp:effectExtent l="0" t="0" r="0" b="0"/>
-            <wp:docPr id="19" name="Picture 19"/>
+          <wp:inline distT="0" distB="0" distL="0" distR="0" wp14:anchorId="522E57D8" wp14:editId="35A42FC2">
+            <wp:extent cx="5760720" cy="1711960"/>
+            <wp:effectExtent l="0" t="0" r="0" b="2540"/>
+            <wp:docPr id="18" name="Picture 18"/>
             <wp:cNvGraphicFramePr>
               <a:graphicFrameLocks xmlns:a="http://schemas.openxmlformats.org/drawingml/2006/main" noChangeAspect="1"/>
             </wp:cNvGraphicFramePr>
@@ -1885,7 +2504,7 @@
                   <pic:spPr>
                     <a:xfrm>
                       <a:off x="0" y="0"/>
-                      <a:ext cx="5760720" cy="1682115"/>
+                      <a:ext cx="5760720" cy="1711960"/>
                     </a:xfrm>
                     <a:prstGeom prst="rect">
                       <a:avLst/>
@@ -1901,76 +2520,60 @@
         <w:rPr>
           <w:lang w:val="en-US"/>
         </w:rPr>
-        <w:br/>
-      </w:r>
-      <w:r>
-        <w:rPr>
-          <w:lang w:val="en-US"/>
-        </w:rPr>
-        <w:t xml:space="preserve">Lets change users and log in with our </w:t>
-      </w:r>
-      <w:r>
-        <w:rPr>
-          <w:b/>
-          <w:bCs/>
-          <w:lang w:val="en-US"/>
-        </w:rPr>
-        <w:t>Admin</w:t>
-      </w:r>
-      <w:r>
-        <w:rPr>
-          <w:lang w:val="en-US"/>
-        </w:rPr>
-        <w:t xml:space="preserve"> user. Go to </w:t>
-      </w:r>
-      <w:r>
-        <w:rPr>
-          <w:lang w:val="en-US"/>
-        </w:rPr>
-        <w:t xml:space="preserve">Manage Documents </w:t>
-      </w:r>
-      <w:r>
-        <w:rPr>
-          <w:lang w:val="en-US"/>
-        </w:rPr>
-        <w:t xml:space="preserve"> dropdown menu. </w:t>
-      </w:r>
-      <w:r>
-        <w:rPr>
-          <w:lang w:val="en-US"/>
-        </w:rPr>
-        <w:t xml:space="preserve">Recent photo shows that the document the was deleted was not actually permanently deleted, but instead was only </w:t>
-      </w:r>
-      <w:r>
-        <w:rPr>
-          <w:b/>
-          <w:bCs/>
-          <w:lang w:val="en-US"/>
-        </w:rPr>
-        <w:t>SoftDeleted</w:t>
-      </w:r>
-      <w:r>
-        <w:rPr>
-          <w:lang w:val="en-US"/>
-        </w:rPr>
-        <w:t xml:space="preserve"> or hidden and a user with an Admin Role can see that. You can see that it says undelete at the bottom, which means that it can be restored. Lets restore it. </w:t>
-      </w:r>
-      <w:r>
-        <w:rPr>
-          <w:lang w:val="en-US"/>
-        </w:rPr>
-        <w:br/>
-      </w:r>
-      <w:r>
+        <w:t xml:space="preserve"> </w:t>
+      </w:r>
+    </w:p>
+    <w:p>
+      <w:pPr>
         <w:rPr>
           <w:noProof/>
           <w:lang w:val="en-US"/>
         </w:rPr>
+      </w:pPr>
+      <w:r>
+        <w:rPr>
+          <w:lang w:val="en-US"/>
+        </w:rPr>
+        <w:t xml:space="preserve">Now </w:t>
+      </w:r>
+      <w:proofErr w:type="spellStart"/>
+      <w:proofErr w:type="gramStart"/>
+      <w:r>
+        <w:rPr>
+          <w:lang w:val="en-US"/>
+        </w:rPr>
+        <w:t>lets</w:t>
+      </w:r>
+      <w:proofErr w:type="spellEnd"/>
+      <w:proofErr w:type="gramEnd"/>
+      <w:r>
+        <w:rPr>
+          <w:lang w:val="en-US"/>
+        </w:rPr>
+        <w:t xml:space="preserve"> see what happens when an ordinary user tries to delete his document. You see a document deleted successfully message and the document disappears from screen. </w:t>
+      </w:r>
+      <w:r>
+        <w:rPr>
+          <w:lang w:val="en-US"/>
+        </w:rPr>
+        <w:br/>
+      </w:r>
+      <w:r>
+        <w:rPr>
+          <w:lang w:val="en-US"/>
+        </w:rPr>
+        <w:br/>
+      </w:r>
+      <w:r>
+        <w:rPr>
+          <w:noProof/>
+          <w:lang w:val="en-US"/>
+        </w:rPr>
         <w:drawing>
-          <wp:inline distT="0" distB="0" distL="0" distR="0" wp14:anchorId="050EA9C1" wp14:editId="7061D617">
-            <wp:extent cx="5760720" cy="973776"/>
+          <wp:inline distT="0" distB="0" distL="0" distR="0" wp14:anchorId="36CD6C75" wp14:editId="0155E08A">
+            <wp:extent cx="5760720" cy="1682115"/>
             <wp:effectExtent l="0" t="0" r="0" b="0"/>
-            <wp:docPr id="20" name="Picture 20"/>
+            <wp:docPr id="19" name="Picture 19"/>
             <wp:cNvGraphicFramePr>
               <a:graphicFrameLocks xmlns:a="http://schemas.openxmlformats.org/drawingml/2006/main" noChangeAspect="1"/>
             </wp:cNvGraphicFramePr>
@@ -1990,7 +2593,7 @@
                   <pic:spPr>
                     <a:xfrm>
                       <a:off x="0" y="0"/>
-                      <a:ext cx="5775390" cy="976256"/>
+                      <a:ext cx="5760720" cy="1682115"/>
                     </a:xfrm>
                     <a:prstGeom prst="rect">
                       <a:avLst/>
@@ -2004,42 +2607,120 @@
       </w:r>
       <w:r>
         <w:rPr>
+          <w:lang w:val="en-US"/>
+        </w:rPr>
+        <w:br/>
+      </w:r>
+      <w:proofErr w:type="spellStart"/>
+      <w:proofErr w:type="gramStart"/>
+      <w:r>
+        <w:rPr>
+          <w:lang w:val="en-US"/>
+        </w:rPr>
+        <w:t>Lets</w:t>
+      </w:r>
+      <w:proofErr w:type="spellEnd"/>
+      <w:proofErr w:type="gramEnd"/>
+      <w:r>
+        <w:rPr>
+          <w:lang w:val="en-US"/>
+        </w:rPr>
+        <w:t xml:space="preserve"> change users and log in with our </w:t>
+      </w:r>
+      <w:r>
+        <w:rPr>
+          <w:b/>
+          <w:bCs/>
+          <w:lang w:val="en-US"/>
+        </w:rPr>
+        <w:t>Admin</w:t>
+      </w:r>
+      <w:r>
+        <w:rPr>
+          <w:lang w:val="en-US"/>
+        </w:rPr>
+        <w:t xml:space="preserve"> user. Go to </w:t>
+      </w:r>
+      <w:r>
+        <w:rPr>
+          <w:lang w:val="en-US"/>
+        </w:rPr>
+        <w:t xml:space="preserve">Manage </w:t>
+      </w:r>
+      <w:proofErr w:type="gramStart"/>
+      <w:r>
+        <w:rPr>
+          <w:lang w:val="en-US"/>
+        </w:rPr>
+        <w:t xml:space="preserve">Documents </w:t>
+      </w:r>
+      <w:r>
+        <w:rPr>
+          <w:lang w:val="en-US"/>
+        </w:rPr>
+        <w:t xml:space="preserve"> dropdown</w:t>
+      </w:r>
+      <w:proofErr w:type="gramEnd"/>
+      <w:r>
+        <w:rPr>
+          <w:lang w:val="en-US"/>
+        </w:rPr>
+        <w:t xml:space="preserve"> menu. </w:t>
+      </w:r>
+      <w:r>
+        <w:rPr>
+          <w:lang w:val="en-US"/>
+        </w:rPr>
+        <w:t xml:space="preserve">Recent photo shows that the document the was deleted was not actually permanently deleted, but instead was only </w:t>
+      </w:r>
+      <w:proofErr w:type="spellStart"/>
+      <w:r>
+        <w:rPr>
+          <w:b/>
+          <w:bCs/>
+          <w:lang w:val="en-US"/>
+        </w:rPr>
+        <w:t>SoftDeleted</w:t>
+      </w:r>
+      <w:proofErr w:type="spellEnd"/>
+      <w:r>
+        <w:rPr>
+          <w:lang w:val="en-US"/>
+        </w:rPr>
+        <w:t xml:space="preserve"> or hidden and a user with an Admin Role can see that. You can see that it says undelete at the bottom, which means that it can be restored. </w:t>
+      </w:r>
+      <w:proofErr w:type="spellStart"/>
+      <w:proofErr w:type="gramStart"/>
+      <w:r>
+        <w:rPr>
+          <w:lang w:val="en-US"/>
+        </w:rPr>
+        <w:t>Lets</w:t>
+      </w:r>
+      <w:proofErr w:type="spellEnd"/>
+      <w:proofErr w:type="gramEnd"/>
+      <w:r>
+        <w:rPr>
+          <w:lang w:val="en-US"/>
+        </w:rPr>
+        <w:t xml:space="preserve"> restore it. </w:t>
+      </w:r>
+      <w:r>
+        <w:rPr>
+          <w:lang w:val="en-US"/>
+        </w:rPr>
+        <w:br/>
+      </w:r>
+      <w:r>
+        <w:rPr>
           <w:noProof/>
-        </w:rPr>
-        <w:t xml:space="preserve"> </w:t>
-      </w:r>
-    </w:p>
-    <w:p>
-      <w:pPr>
-        <w:rPr>
-          <w:noProof/>
-          <w:lang w:val="en-US"/>
-        </w:rPr>
-      </w:pPr>
-      <w:r>
-        <w:rPr>
-          <w:noProof/>
-          <w:lang w:val="en-US"/>
-        </w:rPr>
-        <w:t xml:space="preserve">Second phot shows the restored document. </w:t>
-      </w:r>
-    </w:p>
-    <w:p>
-      <w:pPr>
-        <w:rPr>
-          <w:lang w:val="en-US"/>
-        </w:rPr>
-      </w:pPr>
-      <w:r>
-        <w:rPr>
-          <w:noProof/>
           <w:lang w:val="en-US"/>
         </w:rPr>
         <w:drawing>
-          <wp:inline distT="0" distB="0" distL="0" distR="0" wp14:anchorId="3CC39D10" wp14:editId="62854A75">
-            <wp:extent cx="5757505" cy="1122218"/>
-            <wp:effectExtent l="0" t="0" r="0" b="1905"/>
-            <wp:docPr id="21" name="Picture 21"/>
+          <wp:inline distT="0" distB="0" distL="0" distR="0" wp14:anchorId="050EA9C1" wp14:editId="7061D617">
+            <wp:extent cx="5760720" cy="973776"/>
+            <wp:effectExtent l="0" t="0" r="0" b="0"/>
+            <wp:docPr id="20" name="Picture 20"/>
             <wp:cNvGraphicFramePr>
               <a:graphicFrameLocks xmlns:a="http://schemas.openxmlformats.org/drawingml/2006/main" noChangeAspect="1"/>
             </wp:cNvGraphicFramePr>
@@ -2059,7 +2740,7 @@
                   <pic:spPr>
                     <a:xfrm>
                       <a:off x="0" y="0"/>
-                      <a:ext cx="5851212" cy="1140483"/>
+                      <a:ext cx="5775390" cy="976256"/>
                     </a:xfrm>
                     <a:prstGeom prst="rect">
                       <a:avLst/>
@@ -2071,95 +2752,44 @@
           </wp:inline>
         </w:drawing>
       </w:r>
+      <w:r>
+        <w:rPr>
+          <w:noProof/>
+        </w:rPr>
+        <w:t xml:space="preserve"> </w:t>
+      </w:r>
     </w:p>
     <w:p>
       <w:pPr>
         <w:rPr>
-          <w:lang w:val="en-US"/>
-        </w:rPr>
-      </w:pPr>
-      <w:r>
-        <w:rPr>
-          <w:lang w:val="en-US"/>
-        </w:rPr>
-        <w:lastRenderedPageBreak/>
-        <w:t>If we log with the ordinary user that deleted the document in the first place. We can see that the document has been restore</w:t>
-      </w:r>
-      <w:r>
-        <w:rPr>
-          <w:lang w:val="en-US"/>
-        </w:rPr>
-        <w:t>d</w:t>
-      </w:r>
-      <w:r>
-        <w:rPr>
-          <w:lang w:val="en-US"/>
-        </w:rPr>
-        <w:t xml:space="preserve">. </w:t>
-      </w:r>
-      <w:r>
-        <w:rPr>
-          <w:lang w:val="en-US"/>
-        </w:rPr>
-        <w:t xml:space="preserve">And the user can again edit and delete it or can he? User with an </w:t>
-      </w:r>
-      <w:r>
-        <w:rPr>
-          <w:b/>
-          <w:bCs/>
-          <w:lang w:val="en-US"/>
-        </w:rPr>
-        <w:t>Admin role</w:t>
-      </w:r>
-      <w:r>
-        <w:rPr>
-          <w:lang w:val="en-US"/>
-        </w:rPr>
-        <w:t xml:space="preserve"> has 2 more options in order to prevent future wrong deletions or edits.</w:t>
-      </w:r>
-      <w:r>
-        <w:rPr>
-          <w:lang w:val="en-US"/>
-        </w:rPr>
-        <w:br/>
-      </w:r>
-      <w:r>
-        <w:rPr>
-          <w:lang w:val="en-US"/>
-        </w:rPr>
-        <w:br/>
-        <w:t xml:space="preserve"> If we login with the </w:t>
-      </w:r>
-      <w:r>
-        <w:rPr>
-          <w:b/>
-          <w:bCs/>
-          <w:lang w:val="en-US"/>
-        </w:rPr>
-        <w:t>Admin role</w:t>
-      </w:r>
-      <w:r>
-        <w:rPr>
-          <w:lang w:val="en-US"/>
-        </w:rPr>
-        <w:t xml:space="preserve"> user again go to manage documents and press to edit the ordinary user document we can see at the bottom permission. </w:t>
-      </w:r>
-      <w:r>
-        <w:rPr>
-          <w:lang w:val="en-US"/>
-        </w:rPr>
-        <w:br/>
-      </w:r>
-      <w:r>
-        <w:rPr>
           <w:noProof/>
           <w:lang w:val="en-US"/>
         </w:rPr>
+      </w:pPr>
+      <w:r>
+        <w:rPr>
+          <w:noProof/>
+          <w:lang w:val="en-US"/>
+        </w:rPr>
+        <w:t xml:space="preserve">Second phot shows the restored document. </w:t>
+      </w:r>
+    </w:p>
+    <w:p>
+      <w:pPr>
+        <w:rPr>
+          <w:lang w:val="en-US"/>
+        </w:rPr>
+      </w:pPr>
+      <w:r>
+        <w:rPr>
+          <w:noProof/>
+          <w:lang w:val="en-US"/>
+        </w:rPr>
         <w:drawing>
-          <wp:inline distT="0" distB="0" distL="0" distR="0" wp14:anchorId="2FFD8134" wp14:editId="388CB3AA">
-            <wp:extent cx="5760720" cy="1082040"/>
-            <wp:effectExtent l="0" t="0" r="0" b="3810"/>
-            <wp:docPr id="22" name="Picture 22"/>
+          <wp:inline distT="0" distB="0" distL="0" distR="0" wp14:anchorId="3CC39D10" wp14:editId="62854A75">
+            <wp:extent cx="5757505" cy="1122218"/>
+            <wp:effectExtent l="0" t="0" r="0" b="1905"/>
+            <wp:docPr id="21" name="Picture 21"/>
             <wp:cNvGraphicFramePr>
               <a:graphicFrameLocks xmlns:a="http://schemas.openxmlformats.org/drawingml/2006/main" noChangeAspect="1"/>
             </wp:cNvGraphicFramePr>
@@ -2179,7 +2809,7 @@
                   <pic:spPr>
                     <a:xfrm>
                       <a:off x="0" y="0"/>
-                      <a:ext cx="5760720" cy="1082040"/>
+                      <a:ext cx="5851212" cy="1140483"/>
                     </a:xfrm>
                     <a:prstGeom prst="rect">
                       <a:avLst/>
@@ -2202,41 +2832,91 @@
         <w:rPr>
           <w:lang w:val="en-US"/>
         </w:rPr>
-        <w:t xml:space="preserve">If we choose </w:t>
-      </w:r>
-      <w:r>
-        <w:rPr>
-          <w:b/>
-          <w:bCs/>
-          <w:lang w:val="en-US"/>
-        </w:rPr>
-        <w:t xml:space="preserve">Read </w:t>
-      </w:r>
-      <w:r>
-        <w:rPr>
-          <w:lang w:val="en-US"/>
-        </w:rPr>
-        <w:t>permission that means that the ordinary user will no longer be able to edit or delete its own document. If we choose</w:t>
-      </w:r>
-      <w:r>
-        <w:rPr>
-          <w:b/>
-          <w:bCs/>
-          <w:lang w:val="en-US"/>
-        </w:rPr>
-        <w:t xml:space="preserve"> Write</w:t>
-      </w:r>
-      <w:r>
-        <w:rPr>
-          <w:lang w:val="en-US"/>
-        </w:rPr>
-        <w:t xml:space="preserve"> this will allow only access to edit document without being able to delete it anymore. </w:t>
-      </w:r>
-      <w:r>
-        <w:rPr>
-          <w:lang w:val="en-US"/>
-        </w:rPr>
-        <w:br/>
+        <w:lastRenderedPageBreak/>
+        <w:t>If we log with the ordinary user that deleted the document in the first place. We can see that the document has been restore</w:t>
+      </w:r>
+      <w:r>
+        <w:rPr>
+          <w:lang w:val="en-US"/>
+        </w:rPr>
+        <w:t>d</w:t>
+      </w:r>
+      <w:r>
+        <w:rPr>
+          <w:lang w:val="en-US"/>
+        </w:rPr>
+        <w:t xml:space="preserve">. </w:t>
+      </w:r>
+      <w:r>
+        <w:rPr>
+          <w:lang w:val="en-US"/>
+        </w:rPr>
+        <w:t xml:space="preserve">And the user can again edit and delete </w:t>
+      </w:r>
+      <w:proofErr w:type="gramStart"/>
+      <w:r>
+        <w:rPr>
+          <w:lang w:val="en-US"/>
+        </w:rPr>
+        <w:t>it</w:t>
+      </w:r>
+      <w:proofErr w:type="gramEnd"/>
+      <w:r>
+        <w:rPr>
+          <w:lang w:val="en-US"/>
+        </w:rPr>
+        <w:t xml:space="preserve"> or can he? User with an </w:t>
+      </w:r>
+      <w:r>
+        <w:rPr>
+          <w:b/>
+          <w:bCs/>
+          <w:lang w:val="en-US"/>
+        </w:rPr>
+        <w:t>Admin role</w:t>
+      </w:r>
+      <w:r>
+        <w:rPr>
+          <w:lang w:val="en-US"/>
+        </w:rPr>
+        <w:t xml:space="preserve"> has 2 more options in order to prevent future wrong deletions or edits.</w:t>
+      </w:r>
+      <w:r>
+        <w:rPr>
+          <w:lang w:val="en-US"/>
+        </w:rPr>
+        <w:br/>
+      </w:r>
+      <w:r>
+        <w:rPr>
+          <w:lang w:val="en-US"/>
+        </w:rPr>
+        <w:br/>
+        <w:t xml:space="preserve"> If we login with the </w:t>
+      </w:r>
+      <w:proofErr w:type="gramStart"/>
+      <w:r>
+        <w:rPr>
+          <w:b/>
+          <w:bCs/>
+          <w:lang w:val="en-US"/>
+        </w:rPr>
+        <w:t>Admin</w:t>
+      </w:r>
+      <w:proofErr w:type="gramEnd"/>
+      <w:r>
+        <w:rPr>
+          <w:b/>
+          <w:bCs/>
+          <w:lang w:val="en-US"/>
+        </w:rPr>
+        <w:t xml:space="preserve"> role</w:t>
+      </w:r>
+      <w:r>
+        <w:rPr>
+          <w:lang w:val="en-US"/>
+        </w:rPr>
+        <w:t xml:space="preserve"> user again go to manage documents and press to edit the ordinary user document we can see at the bottom permission. </w:t>
       </w:r>
       <w:r>
         <w:rPr>
@@ -2250,10 +2930,10 @@
           <w:lang w:val="en-US"/>
         </w:rPr>
         <w:drawing>
-          <wp:inline distT="0" distB="0" distL="0" distR="0" wp14:anchorId="613EF403" wp14:editId="1F4F3149">
-            <wp:extent cx="5760720" cy="2047240"/>
-            <wp:effectExtent l="0" t="0" r="0" b="0"/>
-            <wp:docPr id="23" name="Picture 23"/>
+          <wp:inline distT="0" distB="0" distL="0" distR="0" wp14:anchorId="2FFD8134" wp14:editId="388CB3AA">
+            <wp:extent cx="5760720" cy="1082040"/>
+            <wp:effectExtent l="0" t="0" r="0" b="3810"/>
+            <wp:docPr id="22" name="Picture 22"/>
             <wp:cNvGraphicFramePr>
               <a:graphicFrameLocks xmlns:a="http://schemas.openxmlformats.org/drawingml/2006/main" noChangeAspect="1"/>
             </wp:cNvGraphicFramePr>
@@ -2273,7 +2953,7 @@
                   <pic:spPr>
                     <a:xfrm>
                       <a:off x="0" y="0"/>
-                      <a:ext cx="5760720" cy="2047240"/>
+                      <a:ext cx="5760720" cy="1082040"/>
                     </a:xfrm>
                     <a:prstGeom prst="rect">
                       <a:avLst/>
@@ -2294,14 +2974,60 @@
       </w:pPr>
       <w:r>
         <w:rPr>
+          <w:lang w:val="en-US"/>
+        </w:rPr>
+        <w:t xml:space="preserve">If we choose </w:t>
+      </w:r>
+      <w:r>
+        <w:rPr>
+          <w:b/>
+          <w:bCs/>
+          <w:lang w:val="en-US"/>
+        </w:rPr>
+        <w:t xml:space="preserve">Read </w:t>
+      </w:r>
+      <w:r>
+        <w:rPr>
+          <w:lang w:val="en-US"/>
+        </w:rPr>
+        <w:t>permission that means that the ordinary user will no longer be able to edit or delete its own document. If we choose</w:t>
+      </w:r>
+      <w:r>
+        <w:rPr>
+          <w:b/>
+          <w:bCs/>
+          <w:lang w:val="en-US"/>
+        </w:rPr>
+        <w:t xml:space="preserve"> Write</w:t>
+      </w:r>
+      <w:r>
+        <w:rPr>
+          <w:lang w:val="en-US"/>
+        </w:rPr>
+        <w:t xml:space="preserve"> this will allow only access to edit document without being able to delete it anymore. </w:t>
+      </w:r>
+      <w:r>
+        <w:rPr>
+          <w:lang w:val="en-US"/>
+        </w:rPr>
+        <w:br/>
+      </w:r>
+      <w:r>
+        <w:rPr>
+          <w:lang w:val="en-US"/>
+        </w:rPr>
+        <w:br/>
+      </w:r>
+      <w:r>
+        <w:rPr>
           <w:noProof/>
           <w:lang w:val="en-US"/>
         </w:rPr>
         <w:drawing>
-          <wp:inline distT="0" distB="0" distL="0" distR="0" wp14:anchorId="45E96869" wp14:editId="627A1536">
-            <wp:extent cx="5760720" cy="2127885"/>
-            <wp:effectExtent l="0" t="0" r="0" b="5715"/>
-            <wp:docPr id="25" name="Picture 25"/>
+          <wp:inline distT="0" distB="0" distL="0" distR="0" wp14:anchorId="613EF403" wp14:editId="1F4F3149">
+            <wp:extent cx="5760720" cy="2047240"/>
+            <wp:effectExtent l="0" t="0" r="0" b="0"/>
+            <wp:docPr id="23" name="Picture 23"/>
             <wp:cNvGraphicFramePr>
               <a:graphicFrameLocks xmlns:a="http://schemas.openxmlformats.org/drawingml/2006/main" noChangeAspect="1"/>
             </wp:cNvGraphicFramePr>
@@ -2321,6 +3047,54 @@
                   <pic:spPr>
                     <a:xfrm>
                       <a:off x="0" y="0"/>
+                      <a:ext cx="5760720" cy="2047240"/>
+                    </a:xfrm>
+                    <a:prstGeom prst="rect">
+                      <a:avLst/>
+                    </a:prstGeom>
+                  </pic:spPr>
+                </pic:pic>
+              </a:graphicData>
+            </a:graphic>
+          </wp:inline>
+        </w:drawing>
+      </w:r>
+    </w:p>
+    <w:p>
+      <w:pPr>
+        <w:rPr>
+          <w:lang w:val="en-US"/>
+        </w:rPr>
+      </w:pPr>
+      <w:r>
+        <w:rPr>
+          <w:noProof/>
+          <w:lang w:val="en-US"/>
+        </w:rPr>
+        <w:drawing>
+          <wp:inline distT="0" distB="0" distL="0" distR="0" wp14:anchorId="45E96869" wp14:editId="627A1536">
+            <wp:extent cx="5760720" cy="2127885"/>
+            <wp:effectExtent l="0" t="0" r="0" b="5715"/>
+            <wp:docPr id="25" name="Picture 25"/>
+            <wp:cNvGraphicFramePr>
+              <a:graphicFrameLocks xmlns:a="http://schemas.openxmlformats.org/drawingml/2006/main" noChangeAspect="1"/>
+            </wp:cNvGraphicFramePr>
+            <a:graphic xmlns:a="http://schemas.openxmlformats.org/drawingml/2006/main">
+              <a:graphicData uri="http://schemas.openxmlformats.org/drawingml/2006/picture">
+                <pic:pic xmlns:pic="http://schemas.openxmlformats.org/drawingml/2006/picture">
+                  <pic:nvPicPr>
+                    <pic:cNvPr id="1" name=""/>
+                    <pic:cNvPicPr/>
+                  </pic:nvPicPr>
+                  <pic:blipFill>
+                    <a:blip r:embed="rId25"/>
+                    <a:stretch>
+                      <a:fillRect/>
+                    </a:stretch>
+                  </pic:blipFill>
+                  <pic:spPr>
+                    <a:xfrm>
+                      <a:off x="0" y="0"/>
                       <a:ext cx="5760720" cy="2127885"/>
                     </a:xfrm>
                     <a:prstGeom prst="rect">
@@ -2346,47 +3120,29 @@
         </w:rPr>
         <w:t xml:space="preserve">This is only possible if the </w:t>
       </w:r>
-      <w:r>
-        <w:rPr>
-          <w:b/>
-          <w:bCs/>
-          <w:lang w:val="en-US"/>
-        </w:rPr>
-        <w:t>Admin role</w:t>
+      <w:proofErr w:type="gramStart"/>
+      <w:r>
+        <w:rPr>
+          <w:b/>
+          <w:bCs/>
+          <w:lang w:val="en-US"/>
+        </w:rPr>
+        <w:t>Admin</w:t>
+      </w:r>
+      <w:proofErr w:type="gramEnd"/>
+      <w:r>
+        <w:rPr>
+          <w:b/>
+          <w:bCs/>
+          <w:lang w:val="en-US"/>
+        </w:rPr>
+        <w:t xml:space="preserve"> role</w:t>
       </w:r>
       <w:r>
         <w:rPr>
           <w:lang w:val="en-US"/>
         </w:rPr>
         <w:t xml:space="preserve"> user is also a manager. This is an extra filtration added to the User management profile. User </w:t>
-      </w:r>
-      <w:hyperlink r:id="rId25" w:history="1">
-        <w:r>
-          <w:rPr>
-            <w:rStyle w:val="Hyperlink"/>
-            <w:lang w:val="en-US"/>
-          </w:rPr>
-          <w:t>admin@example.com</w:t>
-        </w:r>
-      </w:hyperlink>
-      <w:r>
-        <w:rPr>
-          <w:lang w:val="en-US"/>
-        </w:rPr>
-        <w:t xml:space="preserve"> that was seeded at the start is a manager by default. </w:t>
-      </w:r>
-      <w:r>
-        <w:rPr>
-          <w:lang w:val="en-US"/>
-        </w:rPr>
-        <w:br/>
-      </w:r>
-      <w:r>
-        <w:rPr>
-          <w:lang w:val="en-US"/>
-        </w:rPr>
-        <w:br/>
-        <w:t xml:space="preserve">Now lets create another manager,  demote the  </w:t>
       </w:r>
       <w:hyperlink r:id="rId26" w:history="1">
         <w:r>
@@ -2401,6 +3157,62 @@
         <w:rPr>
           <w:lang w:val="en-US"/>
         </w:rPr>
+        <w:t xml:space="preserve"> that was seeded at the start is a manager by default. </w:t>
+      </w:r>
+      <w:r>
+        <w:rPr>
+          <w:lang w:val="en-US"/>
+        </w:rPr>
+        <w:br/>
+      </w:r>
+      <w:r>
+        <w:rPr>
+          <w:lang w:val="en-US"/>
+        </w:rPr>
+        <w:br/>
+        <w:t xml:space="preserve">Now </w:t>
+      </w:r>
+      <w:proofErr w:type="spellStart"/>
+      <w:r>
+        <w:rPr>
+          <w:lang w:val="en-US"/>
+        </w:rPr>
+        <w:t>lets</w:t>
+      </w:r>
+      <w:proofErr w:type="spellEnd"/>
+      <w:r>
+        <w:rPr>
+          <w:lang w:val="en-US"/>
+        </w:rPr>
+        <w:t xml:space="preserve"> create another </w:t>
+      </w:r>
+      <w:proofErr w:type="gramStart"/>
+      <w:r>
+        <w:rPr>
+          <w:lang w:val="en-US"/>
+        </w:rPr>
+        <w:t>manager,  demote</w:t>
+      </w:r>
+      <w:proofErr w:type="gramEnd"/>
+      <w:r>
+        <w:rPr>
+          <w:lang w:val="en-US"/>
+        </w:rPr>
+        <w:t xml:space="preserve"> the  </w:t>
+      </w:r>
+      <w:hyperlink r:id="rId27" w:history="1">
+        <w:r>
+          <w:rPr>
+            <w:rStyle w:val="Hyperlink"/>
+            <w:lang w:val="en-US"/>
+          </w:rPr>
+          <w:t>admin@example.com</w:t>
+        </w:r>
+      </w:hyperlink>
+      <w:r>
+        <w:rPr>
+          <w:lang w:val="en-US"/>
+        </w:rPr>
         <w:t xml:space="preserve"> user to not manager </w:t>
       </w:r>
       <w:r>
@@ -2416,7 +3228,7 @@
         </w:rPr>
         <w:t xml:space="preserve">We create </w:t>
       </w:r>
-      <w:hyperlink r:id="rId27" w:history="1">
+      <w:hyperlink r:id="rId28" w:history="1">
         <w:r>
           <w:rPr>
             <w:rStyle w:val="Hyperlink"/>
@@ -2461,7 +3273,7 @@
         </w:rPr>
         <w:t xml:space="preserve">That can be done only via the original user  </w:t>
       </w:r>
-      <w:hyperlink r:id="rId28" w:history="1">
+      <w:hyperlink r:id="rId29" w:history="1">
         <w:r>
           <w:rPr>
             <w:rStyle w:val="Hyperlink"/>
@@ -2504,7 +3316,7 @@
                     <pic:cNvPicPr/>
                   </pic:nvPicPr>
                   <pic:blipFill>
-                    <a:blip r:embed="rId29"/>
+                    <a:blip r:embed="rId30"/>
                     <a:stretch>
                       <a:fillRect/>
                     </a:stretch>
@@ -2549,22 +3361,21 @@
         <w:rPr>
           <w:lang w:val="en-US"/>
         </w:rPr>
-        <w:t xml:space="preserve"> profile and remove the IsManager role from the original </w:t>
-      </w:r>
-      <w:hyperlink r:id="rId30" w:history="1">
-        <w:r>
-          <w:rPr>
-            <w:rStyle w:val="Hyperlink"/>
-            <w:lang w:val="en-US"/>
-          </w:rPr>
-          <w:t>admin@example.com</w:t>
-        </w:r>
-      </w:hyperlink>
-      <w:r>
-        <w:rPr>
-          <w:lang w:val="en-US"/>
-        </w:rPr>
-        <w:t xml:space="preserve"> user. We first need to deassign the admin role and the can deassign the IsManager role. Then assign a new role to the user again. In this case we will assign admin role again. You can see on the photo below that </w:t>
+        <w:t xml:space="preserve"> profile and remove the </w:t>
+      </w:r>
+      <w:proofErr w:type="spellStart"/>
+      <w:r>
+        <w:rPr>
+          <w:lang w:val="en-US"/>
+        </w:rPr>
+        <w:t>IsManager</w:t>
+      </w:r>
+      <w:proofErr w:type="spellEnd"/>
+      <w:r>
+        <w:rPr>
+          <w:lang w:val="en-US"/>
+        </w:rPr>
+        <w:t xml:space="preserve"> role from the original </w:t>
       </w:r>
       <w:hyperlink r:id="rId31" w:history="1">
         <w:r>
@@ -2579,8 +3390,66 @@
         <w:rPr>
           <w:lang w:val="en-US"/>
         </w:rPr>
+        <w:t xml:space="preserve"> user. We first need to </w:t>
+      </w:r>
+      <w:proofErr w:type="spellStart"/>
+      <w:r>
+        <w:rPr>
+          <w:lang w:val="en-US"/>
+        </w:rPr>
+        <w:t>deassign</w:t>
+      </w:r>
+      <w:proofErr w:type="spellEnd"/>
+      <w:r>
+        <w:rPr>
+          <w:lang w:val="en-US"/>
+        </w:rPr>
+        <w:t xml:space="preserve"> the admin role and the can </w:t>
+      </w:r>
+      <w:proofErr w:type="spellStart"/>
+      <w:r>
+        <w:rPr>
+          <w:lang w:val="en-US"/>
+        </w:rPr>
+        <w:t>deassign</w:t>
+      </w:r>
+      <w:proofErr w:type="spellEnd"/>
+      <w:r>
+        <w:rPr>
+          <w:lang w:val="en-US"/>
+        </w:rPr>
+        <w:t xml:space="preserve"> the </w:t>
+      </w:r>
+      <w:proofErr w:type="spellStart"/>
+      <w:r>
+        <w:rPr>
+          <w:lang w:val="en-US"/>
+        </w:rPr>
+        <w:t>IsManager</w:t>
+      </w:r>
+      <w:proofErr w:type="spellEnd"/>
+      <w:r>
+        <w:rPr>
+          <w:lang w:val="en-US"/>
+        </w:rPr>
+        <w:t xml:space="preserve"> role. Then assign a new role to the user again. In this case we will assign admin role again. You can see on the photo below that </w:t>
+      </w:r>
+      <w:hyperlink r:id="rId32" w:history="1">
+        <w:r>
+          <w:rPr>
+            <w:rStyle w:val="Hyperlink"/>
+            <w:lang w:val="en-US"/>
+          </w:rPr>
+          <w:t>admin@example.com</w:t>
+        </w:r>
+      </w:hyperlink>
+      <w:r>
+        <w:rPr>
+          <w:lang w:val="en-US"/>
+        </w:rPr>
         <w:t xml:space="preserve"> – </w:t>
       </w:r>
+      <w:proofErr w:type="spellStart"/>
       <w:r>
         <w:rPr>
           <w:b/>
@@ -2589,6 +3458,7 @@
         </w:rPr>
         <w:t>IsManager</w:t>
       </w:r>
+      <w:proofErr w:type="spellEnd"/>
       <w:r>
         <w:rPr>
           <w:lang w:val="en-US"/>
@@ -2628,7 +3498,7 @@
                     <pic:cNvPicPr/>
                   </pic:nvPicPr>
                   <pic:blipFill>
-                    <a:blip r:embed="rId32"/>
+                    <a:blip r:embed="rId33"/>
                     <a:stretch>
                       <a:fillRect/>
                     </a:stretch>
@@ -2670,9 +3540,25 @@
         <w:rPr>
           <w:lang w:val="en-US"/>
         </w:rPr>
-        <w:t xml:space="preserve">Now lets log with the original </w:t>
-      </w:r>
-      <w:hyperlink r:id="rId33" w:history="1">
+        <w:t xml:space="preserve">Now </w:t>
+      </w:r>
+      <w:proofErr w:type="spellStart"/>
+      <w:proofErr w:type="gramStart"/>
+      <w:r>
+        <w:rPr>
+          <w:lang w:val="en-US"/>
+        </w:rPr>
+        <w:t>lets</w:t>
+      </w:r>
+      <w:proofErr w:type="spellEnd"/>
+      <w:proofErr w:type="gramEnd"/>
+      <w:r>
+        <w:rPr>
+          <w:lang w:val="en-US"/>
+        </w:rPr>
+        <w:t xml:space="preserve"> log with the original </w:t>
+      </w:r>
+      <w:hyperlink r:id="rId34" w:history="1">
         <w:r>
           <w:rPr>
             <w:rStyle w:val="Hyperlink"/>
@@ -2709,164 +3595,6 @@
             <wp:extent cx="5760720" cy="1757549"/>
             <wp:effectExtent l="0" t="0" r="0" b="0"/>
             <wp:docPr id="28" name="Picture 28"/>
-            <wp:cNvGraphicFramePr>
-              <a:graphicFrameLocks xmlns:a="http://schemas.openxmlformats.org/drawingml/2006/main" noChangeAspect="1"/>
-            </wp:cNvGraphicFramePr>
-            <a:graphic xmlns:a="http://schemas.openxmlformats.org/drawingml/2006/main">
-              <a:graphicData uri="http://schemas.openxmlformats.org/drawingml/2006/picture">
-                <pic:pic xmlns:pic="http://schemas.openxmlformats.org/drawingml/2006/picture">
-                  <pic:nvPicPr>
-                    <pic:cNvPr id="1" name=""/>
-                    <pic:cNvPicPr/>
-                  </pic:nvPicPr>
-                  <pic:blipFill>
-                    <a:blip r:embed="rId34"/>
-                    <a:stretch>
-                      <a:fillRect/>
-                    </a:stretch>
-                  </pic:blipFill>
-                  <pic:spPr>
-                    <a:xfrm>
-                      <a:off x="0" y="0"/>
-                      <a:ext cx="5770782" cy="1760619"/>
-                    </a:xfrm>
-                    <a:prstGeom prst="rect">
-                      <a:avLst/>
-                    </a:prstGeom>
-                  </pic:spPr>
-                </pic:pic>
-              </a:graphicData>
-            </a:graphic>
-          </wp:inline>
-        </w:drawing>
-      </w:r>
-      <w:r>
-        <w:rPr>
-          <w:lang w:val="en-US"/>
-        </w:rPr>
-        <w:br/>
-      </w:r>
-      <w:r>
-        <w:rPr>
-          <w:lang w:val="en-US"/>
-        </w:rPr>
-        <w:br/>
-        <w:t>When we click on the edit document view we can see that this option is not available anymore</w:t>
-      </w:r>
-      <w:r>
-        <w:rPr>
-          <w:lang w:val="en-US"/>
-        </w:rPr>
-        <w:t xml:space="preserve">. </w:t>
-      </w:r>
-      <w:r>
-        <w:rPr>
-          <w:lang w:val="en-US"/>
-        </w:rPr>
-        <w:br/>
-      </w:r>
-      <w:r>
-        <w:rPr>
-          <w:lang w:val="en-US"/>
-        </w:rPr>
-        <w:br/>
-      </w:r>
-      <w:r>
-        <w:rPr>
-          <w:lang w:val="en-US"/>
-        </w:rPr>
-        <w:lastRenderedPageBreak/>
-        <w:t xml:space="preserve">Admin users only </w:t>
-      </w:r>
-      <w:r>
-        <w:rPr>
-          <w:lang w:val="en-US"/>
-        </w:rPr>
-        <w:t xml:space="preserve">can add departments via the department view and categories via the categories view. </w:t>
-      </w:r>
-    </w:p>
-    <w:p>
-      <w:pPr>
-        <w:rPr>
-          <w:lang w:val="en-US"/>
-        </w:rPr>
-      </w:pPr>
-      <w:r>
-        <w:rPr>
-          <w:lang w:val="en-US"/>
-        </w:rPr>
-        <w:t>Finally lets check logs for documents via the</w:t>
-      </w:r>
-      <w:r>
-        <w:rPr>
-          <w:b/>
-          <w:bCs/>
-          <w:lang w:val="en-US"/>
-        </w:rPr>
-        <w:t xml:space="preserve"> Admin</w:t>
-      </w:r>
-      <w:r>
-        <w:rPr>
-          <w:b/>
-          <w:bCs/>
-          <w:lang w:val="en-US"/>
-        </w:rPr>
-        <w:t xml:space="preserve"> </w:t>
-      </w:r>
-      <w:r>
-        <w:rPr>
-          <w:lang w:val="en-US"/>
-        </w:rPr>
-        <w:t>dropdown</w:t>
-      </w:r>
-      <w:r>
-        <w:rPr>
-          <w:lang w:val="en-US"/>
-        </w:rPr>
-        <w:t xml:space="preserve"> </w:t>
-      </w:r>
-      <w:r>
-        <w:rPr>
-          <w:b/>
-          <w:bCs/>
-          <w:lang w:val="en-US"/>
-        </w:rPr>
-        <w:t>Check Logs</w:t>
-      </w:r>
-      <w:r>
-        <w:rPr>
-          <w:b/>
-          <w:bCs/>
-          <w:lang w:val="en-US"/>
-        </w:rPr>
-        <w:t xml:space="preserve">. </w:t>
-      </w:r>
-      <w:r>
-        <w:rPr>
-          <w:b/>
-          <w:bCs/>
-          <w:lang w:val="en-US"/>
-        </w:rPr>
-        <w:br/>
-      </w:r>
-      <w:r>
-        <w:rPr>
-          <w:b/>
-          <w:bCs/>
-          <w:lang w:val="en-US"/>
-        </w:rPr>
-        <w:br/>
-      </w:r>
-      <w:r>
-        <w:rPr>
-          <w:noProof/>
-          <w:lang w:val="en-US"/>
-        </w:rPr>
-        <w:drawing>
-          <wp:inline distT="0" distB="0" distL="0" distR="0" wp14:anchorId="2C092CB3" wp14:editId="2FC325C3">
-            <wp:extent cx="5760720" cy="3470275"/>
-            <wp:effectExtent l="0" t="0" r="0" b="0"/>
-            <wp:docPr id="29" name="Picture 29"/>
             <wp:cNvGraphicFramePr>
               <a:graphicFrameLocks xmlns:a="http://schemas.openxmlformats.org/drawingml/2006/main" noChangeAspect="1"/>
             </wp:cNvGraphicFramePr>
@@ -2886,7 +3614,7 @@
                   <pic:spPr>
                     <a:xfrm>
                       <a:off x="0" y="0"/>
-                      <a:ext cx="5760720" cy="3470275"/>
+                      <a:ext cx="5770782" cy="1760619"/>
                     </a:xfrm>
                     <a:prstGeom prst="rect">
                       <a:avLst/>
@@ -2900,102 +3628,147 @@
       </w:r>
       <w:r>
         <w:rPr>
-          <w:b/>
-          <w:bCs/>
-          <w:lang w:val="en-US"/>
-        </w:rPr>
-        <w:br/>
-      </w:r>
-      <w:r>
-        <w:rPr>
-          <w:b/>
-          <w:bCs/>
-          <w:lang w:val="en-US"/>
-        </w:rPr>
-        <w:br/>
-      </w:r>
-      <w:r>
-        <w:rPr>
-          <w:lang w:val="en-US"/>
-        </w:rPr>
-        <w:t>Th</w:t>
-      </w:r>
-      <w:r>
-        <w:rPr>
-          <w:lang w:val="en-US"/>
-        </w:rPr>
-        <w:t xml:space="preserve">is is a view available only for the </w:t>
-      </w:r>
-      <w:r>
-        <w:rPr>
-          <w:b/>
-          <w:bCs/>
-          <w:lang w:val="en-US"/>
-        </w:rPr>
-        <w:t>Admin role</w:t>
-      </w:r>
-      <w:r>
-        <w:rPr>
-          <w:lang w:val="en-US"/>
-        </w:rPr>
-        <w:t xml:space="preserve"> users used to check on log for every document. Every time a document is amended a log is created. When pressed on</w:t>
-      </w:r>
-      <w:r>
-        <w:rPr>
-          <w:b/>
-          <w:bCs/>
-          <w:lang w:val="en-US"/>
-        </w:rPr>
-        <w:t xml:space="preserve"> More</w:t>
-      </w:r>
-      <w:r>
-        <w:rPr>
-          <w:lang w:val="en-US"/>
-        </w:rPr>
-        <w:t xml:space="preserve">  </w:t>
-      </w:r>
-      <w:r>
-        <w:rPr>
-          <w:b/>
-          <w:bCs/>
-          <w:lang w:val="en-US"/>
-        </w:rPr>
-        <w:t xml:space="preserve">.js function </w:t>
-      </w:r>
-      <w:r>
-        <w:rPr>
-          <w:lang w:val="en-US"/>
-        </w:rPr>
-        <w:t>dynamically grabs</w:t>
-      </w:r>
-      <w:r>
-        <w:rPr>
-          <w:b/>
-          <w:bCs/>
-          <w:lang w:val="en-US"/>
-        </w:rPr>
-        <w:t xml:space="preserve"> </w:t>
-      </w:r>
-      <w:r>
-        <w:rPr>
-          <w:lang w:val="en-US"/>
-        </w:rPr>
-        <w:t xml:space="preserve">the content and show it to the user in a descending order by time logged. This is achieved using a modal view and and a partial view. </w:t>
-      </w:r>
-      <w:r>
-        <w:rPr>
-          <w:lang w:val="en-US"/>
-        </w:rPr>
-        <w:t xml:space="preserve">Page has filtration and no pagination on purpose. </w:t>
-      </w:r>
-      <w:r>
-        <w:rPr>
-          <w:lang w:val="en-US"/>
-        </w:rPr>
-        <w:br/>
-      </w:r>
-      <w:r>
-        <w:rPr>
+          <w:lang w:val="en-US"/>
+        </w:rPr>
+        <w:br/>
+      </w:r>
+      <w:r>
+        <w:rPr>
+          <w:lang w:val="en-US"/>
+        </w:rPr>
+        <w:br/>
+        <w:t xml:space="preserve">When we click on the edit document </w:t>
+      </w:r>
+      <w:proofErr w:type="gramStart"/>
+      <w:r>
+        <w:rPr>
+          <w:lang w:val="en-US"/>
+        </w:rPr>
+        <w:t>view</w:t>
+      </w:r>
+      <w:proofErr w:type="gramEnd"/>
+      <w:r>
+        <w:rPr>
+          <w:lang w:val="en-US"/>
+        </w:rPr>
+        <w:t xml:space="preserve"> we can see that this option is not available anymore</w:t>
+      </w:r>
+      <w:r>
+        <w:rPr>
+          <w:lang w:val="en-US"/>
+        </w:rPr>
+        <w:t xml:space="preserve">. </w:t>
+      </w:r>
+      <w:r>
+        <w:rPr>
+          <w:lang w:val="en-US"/>
+        </w:rPr>
+        <w:br/>
+      </w:r>
+      <w:r>
+        <w:rPr>
+          <w:lang w:val="en-US"/>
+        </w:rPr>
+        <w:br/>
+      </w:r>
+      <w:r>
+        <w:rPr>
+          <w:lang w:val="en-US"/>
+        </w:rPr>
+        <w:lastRenderedPageBreak/>
+        <w:t xml:space="preserve">Admin users only </w:t>
+      </w:r>
+      <w:r>
+        <w:rPr>
+          <w:lang w:val="en-US"/>
+        </w:rPr>
+        <w:t xml:space="preserve">can add departments via the department view and categories via the categories view. </w:t>
+      </w:r>
+    </w:p>
+    <w:p>
+      <w:pPr>
+        <w:rPr>
+          <w:lang w:val="en-US"/>
+        </w:rPr>
+      </w:pPr>
+      <w:r>
+        <w:rPr>
+          <w:lang w:val="en-US"/>
+        </w:rPr>
+        <w:t xml:space="preserve">Finally </w:t>
+      </w:r>
+      <w:proofErr w:type="spellStart"/>
+      <w:proofErr w:type="gramStart"/>
+      <w:r>
+        <w:rPr>
+          <w:lang w:val="en-US"/>
+        </w:rPr>
+        <w:t>lets</w:t>
+      </w:r>
+      <w:proofErr w:type="spellEnd"/>
+      <w:proofErr w:type="gramEnd"/>
+      <w:r>
+        <w:rPr>
+          <w:lang w:val="en-US"/>
+        </w:rPr>
+        <w:t xml:space="preserve"> check logs for documents via the</w:t>
+      </w:r>
+      <w:r>
+        <w:rPr>
+          <w:b/>
+          <w:bCs/>
+          <w:lang w:val="en-US"/>
+        </w:rPr>
+        <w:t xml:space="preserve"> Admin</w:t>
+      </w:r>
+      <w:r>
+        <w:rPr>
+          <w:b/>
+          <w:bCs/>
+          <w:lang w:val="en-US"/>
+        </w:rPr>
+        <w:t xml:space="preserve"> </w:t>
+      </w:r>
+      <w:r>
+        <w:rPr>
+          <w:lang w:val="en-US"/>
+        </w:rPr>
+        <w:t>dropdown</w:t>
+      </w:r>
+      <w:r>
+        <w:rPr>
+          <w:lang w:val="en-US"/>
+        </w:rPr>
+        <w:t xml:space="preserve"> </w:t>
+      </w:r>
+      <w:r>
+        <w:rPr>
+          <w:b/>
+          <w:bCs/>
+          <w:lang w:val="en-US"/>
+        </w:rPr>
+        <w:t>Check Logs</w:t>
+      </w:r>
+      <w:r>
+        <w:rPr>
+          <w:b/>
+          <w:bCs/>
+          <w:lang w:val="en-US"/>
+        </w:rPr>
+        <w:t xml:space="preserve">. </w:t>
+      </w:r>
+      <w:r>
+        <w:rPr>
+          <w:b/>
+          <w:bCs/>
+          <w:lang w:val="en-US"/>
+        </w:rPr>
+        <w:br/>
+      </w:r>
+      <w:r>
+        <w:rPr>
+          <w:b/>
+          <w:bCs/>
           <w:lang w:val="en-US"/>
         </w:rPr>
         <w:br/>
@@ -3006,10 +3779,10 @@
           <w:lang w:val="en-US"/>
         </w:rPr>
         <w:drawing>
-          <wp:inline distT="0" distB="0" distL="0" distR="0" wp14:anchorId="610B2D9B" wp14:editId="7A720E94">
-            <wp:extent cx="5758929" cy="2826328"/>
+          <wp:inline distT="0" distB="0" distL="0" distR="0" wp14:anchorId="2C092CB3" wp14:editId="2FC325C3">
+            <wp:extent cx="5760720" cy="3470275"/>
             <wp:effectExtent l="0" t="0" r="0" b="0"/>
-            <wp:docPr id="30" name="Picture 30"/>
+            <wp:docPr id="29" name="Picture 29"/>
             <wp:cNvGraphicFramePr>
               <a:graphicFrameLocks xmlns:a="http://schemas.openxmlformats.org/drawingml/2006/main" noChangeAspect="1"/>
             </wp:cNvGraphicFramePr>
@@ -3029,7 +3802,7 @@
                   <pic:spPr>
                     <a:xfrm>
                       <a:off x="0" y="0"/>
-                      <a:ext cx="5788140" cy="2840664"/>
+                      <a:ext cx="5760720" cy="3470275"/>
                     </a:xfrm>
                     <a:prstGeom prst="rect">
                       <a:avLst/>
@@ -3043,40 +3816,145 @@
       </w:r>
       <w:r>
         <w:rPr>
-          <w:lang w:val="en-US"/>
-        </w:rPr>
-        <w:br/>
-      </w:r>
-      <w:r>
-        <w:rPr>
-          <w:lang w:val="en-US"/>
-        </w:rPr>
-        <w:lastRenderedPageBreak/>
-        <w:t xml:space="preserve">At the end I will show you </w:t>
-      </w:r>
-      <w:r>
-        <w:rPr>
-          <w:lang w:val="en-US"/>
-        </w:rPr>
-        <w:t>M</w:t>
-      </w:r>
-      <w:r>
-        <w:rPr>
-          <w:lang w:val="en-US"/>
-        </w:rPr>
-        <w:t>y</w:t>
-      </w:r>
-      <w:r>
-        <w:rPr>
-          <w:lang w:val="en-US"/>
-        </w:rPr>
-        <w:t xml:space="preserve">Docuemnts view where a user can focus only on his own documents without having to access other peoples documents. </w:t>
-      </w:r>
-      <w:r>
-        <w:rPr>
-          <w:lang w:val="en-US"/>
-        </w:rPr>
-        <w:t xml:space="preserve">User can Edit, see More details and Delete. </w:t>
+          <w:b/>
+          <w:bCs/>
+          <w:lang w:val="en-US"/>
+        </w:rPr>
+        <w:br/>
+      </w:r>
+      <w:r>
+        <w:rPr>
+          <w:b/>
+          <w:bCs/>
+          <w:lang w:val="en-US"/>
+        </w:rPr>
+        <w:br/>
+      </w:r>
+      <w:r>
+        <w:rPr>
+          <w:lang w:val="en-US"/>
+        </w:rPr>
+        <w:t>Th</w:t>
+      </w:r>
+      <w:r>
+        <w:rPr>
+          <w:lang w:val="en-US"/>
+        </w:rPr>
+        <w:t xml:space="preserve">is is a view available only for the </w:t>
+      </w:r>
+      <w:proofErr w:type="gramStart"/>
+      <w:r>
+        <w:rPr>
+          <w:b/>
+          <w:bCs/>
+          <w:lang w:val="en-US"/>
+        </w:rPr>
+        <w:t>Admin</w:t>
+      </w:r>
+      <w:proofErr w:type="gramEnd"/>
+      <w:r>
+        <w:rPr>
+          <w:b/>
+          <w:bCs/>
+          <w:lang w:val="en-US"/>
+        </w:rPr>
+        <w:t xml:space="preserve"> role</w:t>
+      </w:r>
+      <w:r>
+        <w:rPr>
+          <w:lang w:val="en-US"/>
+        </w:rPr>
+        <w:t xml:space="preserve"> users used to check on log for every document. Every time a document is amended a log is created. When pressed on</w:t>
+      </w:r>
+      <w:r>
+        <w:rPr>
+          <w:b/>
+          <w:bCs/>
+          <w:lang w:val="en-US"/>
+        </w:rPr>
+        <w:t xml:space="preserve"> </w:t>
+      </w:r>
+      <w:proofErr w:type="gramStart"/>
+      <w:r>
+        <w:rPr>
+          <w:b/>
+          <w:bCs/>
+          <w:lang w:val="en-US"/>
+        </w:rPr>
+        <w:t>More</w:t>
+      </w:r>
+      <w:r>
+        <w:rPr>
+          <w:lang w:val="en-US"/>
+        </w:rPr>
+        <w:t xml:space="preserve">  </w:t>
+      </w:r>
+      <w:r>
+        <w:rPr>
+          <w:b/>
+          <w:bCs/>
+          <w:lang w:val="en-US"/>
+        </w:rPr>
+        <w:t>.</w:t>
+      </w:r>
+      <w:proofErr w:type="spellStart"/>
+      <w:proofErr w:type="gramEnd"/>
+      <w:r>
+        <w:rPr>
+          <w:b/>
+          <w:bCs/>
+          <w:lang w:val="en-US"/>
+        </w:rPr>
+        <w:t>js</w:t>
+      </w:r>
+      <w:proofErr w:type="spellEnd"/>
+      <w:r>
+        <w:rPr>
+          <w:b/>
+          <w:bCs/>
+          <w:lang w:val="en-US"/>
+        </w:rPr>
+        <w:t xml:space="preserve"> function </w:t>
+      </w:r>
+      <w:r>
+        <w:rPr>
+          <w:lang w:val="en-US"/>
+        </w:rPr>
+        <w:t>dynamically grabs</w:t>
+      </w:r>
+      <w:r>
+        <w:rPr>
+          <w:b/>
+          <w:bCs/>
+          <w:lang w:val="en-US"/>
+        </w:rPr>
+        <w:t xml:space="preserve"> </w:t>
+      </w:r>
+      <w:r>
+        <w:rPr>
+          <w:lang w:val="en-US"/>
+        </w:rPr>
+        <w:t xml:space="preserve">the content and show it to the user in a descending order by time logged. This is achieved using a modal view and </w:t>
+      </w:r>
+      <w:proofErr w:type="spellStart"/>
+      <w:r>
+        <w:rPr>
+          <w:lang w:val="en-US"/>
+        </w:rPr>
+        <w:t>and</w:t>
+      </w:r>
+      <w:proofErr w:type="spellEnd"/>
+      <w:r>
+        <w:rPr>
+          <w:lang w:val="en-US"/>
+        </w:rPr>
+        <w:t xml:space="preserve"> a partial view. </w:t>
+      </w:r>
+      <w:r>
+        <w:rPr>
+          <w:lang w:val="en-US"/>
+        </w:rPr>
+        <w:t xml:space="preserve">Page has filtration and no pagination on purpose. </w:t>
       </w:r>
       <w:r>
         <w:rPr>
@@ -3096,10 +3974,10 @@
           <w:lang w:val="en-US"/>
         </w:rPr>
         <w:drawing>
-          <wp:inline distT="0" distB="0" distL="0" distR="0" wp14:anchorId="551D03E0" wp14:editId="2A17C6D3">
-            <wp:extent cx="5760720" cy="1172845"/>
-            <wp:effectExtent l="0" t="0" r="0" b="8255"/>
-            <wp:docPr id="31" name="Picture 31"/>
+          <wp:inline distT="0" distB="0" distL="0" distR="0" wp14:anchorId="610B2D9B" wp14:editId="7A720E94">
+            <wp:extent cx="5758929" cy="2826328"/>
+            <wp:effectExtent l="0" t="0" r="0" b="0"/>
+            <wp:docPr id="30" name="Picture 30"/>
             <wp:cNvGraphicFramePr>
               <a:graphicFrameLocks xmlns:a="http://schemas.openxmlformats.org/drawingml/2006/main" noChangeAspect="1"/>
             </wp:cNvGraphicFramePr>
@@ -3119,6 +3997,134 @@
                   <pic:spPr>
                     <a:xfrm>
                       <a:off x="0" y="0"/>
+                      <a:ext cx="5788140" cy="2840664"/>
+                    </a:xfrm>
+                    <a:prstGeom prst="rect">
+                      <a:avLst/>
+                    </a:prstGeom>
+                  </pic:spPr>
+                </pic:pic>
+              </a:graphicData>
+            </a:graphic>
+          </wp:inline>
+        </w:drawing>
+      </w:r>
+      <w:r>
+        <w:rPr>
+          <w:lang w:val="en-US"/>
+        </w:rPr>
+        <w:br/>
+      </w:r>
+      <w:r>
+        <w:rPr>
+          <w:lang w:val="en-US"/>
+        </w:rPr>
+        <w:lastRenderedPageBreak/>
+        <w:t xml:space="preserve">At the end I will show you </w:t>
+      </w:r>
+      <w:proofErr w:type="spellStart"/>
+      <w:r>
+        <w:rPr>
+          <w:lang w:val="en-US"/>
+        </w:rPr>
+        <w:t>M</w:t>
+      </w:r>
+      <w:r>
+        <w:rPr>
+          <w:lang w:val="en-US"/>
+        </w:rPr>
+        <w:t>y</w:t>
+      </w:r>
+      <w:r>
+        <w:rPr>
+          <w:lang w:val="en-US"/>
+        </w:rPr>
+        <w:t>Docuemnts</w:t>
+      </w:r>
+      <w:proofErr w:type="spellEnd"/>
+      <w:r>
+        <w:rPr>
+          <w:lang w:val="en-US"/>
+        </w:rPr>
+        <w:t xml:space="preserve"> view where a user can focus only on his own documents without having to access other </w:t>
+      </w:r>
+      <w:proofErr w:type="spellStart"/>
+      <w:proofErr w:type="gramStart"/>
+      <w:r>
+        <w:rPr>
+          <w:lang w:val="en-US"/>
+        </w:rPr>
+        <w:t>peoples</w:t>
+      </w:r>
+      <w:proofErr w:type="spellEnd"/>
+      <w:proofErr w:type="gramEnd"/>
+      <w:r>
+        <w:rPr>
+          <w:lang w:val="en-US"/>
+        </w:rPr>
+        <w:t xml:space="preserve"> documents. </w:t>
+      </w:r>
+      <w:r>
+        <w:rPr>
+          <w:lang w:val="en-US"/>
+        </w:rPr>
+        <w:t xml:space="preserve">User can Edit, see More </w:t>
+      </w:r>
+      <w:proofErr w:type="gramStart"/>
+      <w:r>
+        <w:rPr>
+          <w:lang w:val="en-US"/>
+        </w:rPr>
+        <w:t>details</w:t>
+      </w:r>
+      <w:proofErr w:type="gramEnd"/>
+      <w:r>
+        <w:rPr>
+          <w:lang w:val="en-US"/>
+        </w:rPr>
+        <w:t xml:space="preserve"> and Delete. </w:t>
+      </w:r>
+      <w:r>
+        <w:rPr>
+          <w:lang w:val="en-US"/>
+        </w:rPr>
+        <w:br/>
+      </w:r>
+      <w:r>
+        <w:rPr>
+          <w:lang w:val="en-US"/>
+        </w:rPr>
+        <w:br/>
+      </w:r>
+      <w:r>
+        <w:rPr>
+          <w:noProof/>
+          <w:lang w:val="en-US"/>
+        </w:rPr>
+        <w:drawing>
+          <wp:inline distT="0" distB="0" distL="0" distR="0" wp14:anchorId="551D03E0" wp14:editId="2A17C6D3">
+            <wp:extent cx="5760720" cy="1172845"/>
+            <wp:effectExtent l="0" t="0" r="0" b="8255"/>
+            <wp:docPr id="31" name="Picture 31"/>
+            <wp:cNvGraphicFramePr>
+              <a:graphicFrameLocks xmlns:a="http://schemas.openxmlformats.org/drawingml/2006/main" noChangeAspect="1"/>
+            </wp:cNvGraphicFramePr>
+            <a:graphic xmlns:a="http://schemas.openxmlformats.org/drawingml/2006/main">
+              <a:graphicData uri="http://schemas.openxmlformats.org/drawingml/2006/picture">
+                <pic:pic xmlns:pic="http://schemas.openxmlformats.org/drawingml/2006/picture">
+                  <pic:nvPicPr>
+                    <pic:cNvPr id="1" name=""/>
+                    <pic:cNvPicPr/>
+                  </pic:nvPicPr>
+                  <pic:blipFill>
+                    <a:blip r:embed="rId38"/>
+                    <a:stretch>
+                      <a:fillRect/>
+                    </a:stretch>
+                  </pic:blipFill>
+                  <pic:spPr>
+                    <a:xfrm>
+                      <a:off x="0" y="0"/>
                       <a:ext cx="5760720" cy="1172845"/>
                     </a:xfrm>
                     <a:prstGeom prst="rect">
@@ -3141,7 +4147,21 @@
         <w:rPr>
           <w:lang w:val="en-US"/>
         </w:rPr>
-        <w:t xml:space="preserve">And last but not least we have authorization policies implemented for better cohesion, managebility and endpoint protection. </w:t>
+        <w:t xml:space="preserve">And last but not least we have authorization policies implemented for better cohesion, </w:t>
+      </w:r>
+      <w:proofErr w:type="spellStart"/>
+      <w:r>
+        <w:rPr>
+          <w:lang w:val="en-US"/>
+        </w:rPr>
+        <w:t>managebility</w:t>
+      </w:r>
+      <w:proofErr w:type="spellEnd"/>
+      <w:r>
+        <w:rPr>
+          <w:lang w:val="en-US"/>
+        </w:rPr>
+        <w:t xml:space="preserve"> and endpoint protection. </w:t>
       </w:r>
       <w:r>
         <w:rPr>
@@ -3176,7 +4196,7 @@
                     <pic:cNvPicPr/>
                   </pic:nvPicPr>
                   <pic:blipFill>
-                    <a:blip r:embed="rId38"/>
+                    <a:blip r:embed="rId39"/>
                     <a:stretch>
                       <a:fillRect/>
                     </a:stretch>

</xml_diff>